<commit_message>
Remove tests and presentation extras
- Delete the entire tests/ directory and pytest.ini.
- Drop pytest from pyproject.toml optional dependencies.
- Remove presentation extras: build_word.py, build_pptx.py, index.html,
  secure-chess-speaker-guide.docx, secure-chess.pptx.
- Strip every reference to tests/pytest/TDD from build_portfolio.py
  and build_rubric.py; renumber appendices so the portfolio now has
  three appendices (source code, protocol, oral-exam Q&A) instead of
  four.
- Regenerate תיק-פרויקט.docx/pdf and מחוון-תיק-פרויקט.docx/pdf.

Co-authored-by: Cursor <cursoragent@cursor.com>
</commit_message>
<xml_diff>
--- a/מחוון-תיק-פרויקט.docx
+++ b/מחוון-תיק-פרויקט.docx
@@ -455,8 +455,8 @@
         <w:gridCol w:w="1316"/>
         <w:gridCol w:w="1627"/>
         <w:gridCol w:w="1694"/>
-        <w:gridCol w:w="1458"/>
-        <w:gridCol w:w="4093"/>
+        <w:gridCol w:w="1459"/>
+        <w:gridCol w:w="4092"/>
       </w:tblGrid>
       <w:tr>
         <w:trPr>
@@ -803,7 +803,7 @@
               <w:rPr>
                 <w:sz w:val="20"/>
               </w:rPr>
-              <w:t>ChessServer._accept_loop יוצר Thread לכל חיבור. מאומת ב-tests/integration/test_parallel_games.py</w:t>
+              <w:t>ChessServer._accept_loop יוצר Thread לכל חיבור.</w:t>
             </w:r>
           </w:p>
         </w:tc>
@@ -3413,7 +3413,7 @@
         <w:rPr>
           <w:rFonts w:ascii="Arial" w:hAnsi="Arial"/>
         </w:rPr>
-        <w:t>4. מימוש הפרויקט (הקוד, בדיקות) — 31%</w:t>
+        <w:t>4. מימוש הפרויקט (הקוד) — 31%</w:t>
       </w:r>
     </w:p>
     <w:tbl>
@@ -3588,7 +3588,7 @@
               <w:rPr>
                 <w:sz w:val="20"/>
               </w:rPr>
-              <w:t>common/ + server/ + client/ + tests/{unit,integration}/</w:t>
+              <w:t>common/ + server/ + client/</w:t>
             </w:r>
           </w:p>
         </w:tc>
@@ -3854,59 +3854,6 @@
                 <w:sz w:val="20"/>
               </w:rPr>
               <w:t>Session.run עוטף כל dispatch ב-except SecureChessError/Exception בשלוש שכבות; ניתוק לקוח מטופל ב-_on_disconnect</w:t>
-            </w:r>
-          </w:p>
-        </w:tc>
-      </w:tr>
-      <w:tr>
-        <w:trPr>
-          <w:jc w:val="right"/>
-        </w:trPr>
-        <w:tc>
-          <w:tcPr>
-            <w:tcW w:w="3324" w:type="dxa"/>
-          </w:tcPr>
-          <w:p>
-            <w:pPr>
-              <w:bidi w:val="0"/>
-            </w:pPr>
-            <w:r>
-              <w:rPr>
-                <w:sz w:val="20"/>
-              </w:rPr>
-              <w:t>הבדיקות — טבלה מעודכנת עם תוצאות</w:t>
-            </w:r>
-          </w:p>
-        </w:tc>
-        <w:tc>
-          <w:tcPr>
-            <w:tcW w:w="3324" w:type="dxa"/>
-          </w:tcPr>
-          <w:p>
-            <w:pPr>
-              <w:bidi w:val="0"/>
-            </w:pPr>
-            <w:r>
-              <w:rPr>
-                <w:sz w:val="20"/>
-              </w:rPr>
-              <w:t>✅</w:t>
-            </w:r>
-          </w:p>
-        </w:tc>
-        <w:tc>
-          <w:tcPr>
-            <w:tcW w:w="3324" w:type="dxa"/>
-          </w:tcPr>
-          <w:p>
-            <w:pPr>
-              <w:bidi w:val="0"/>
-            </w:pPr>
-            <w:r>
-              <w:rPr>
-                <w:sz w:val="20"/>
-              </w:rPr>
-              <w:t>99 טסטים עוברים (87 unit + 12 integration). ראה מימוש §4.4 ונספח ב'</w:t>
             </w:r>
           </w:p>
         </w:tc>
@@ -3935,7 +3882,6 @@
         <w:rPr>
           <w:rFonts w:ascii="Arial" w:hAnsi="Arial"/>
         </w:rPr>
-        <w:lastRenderedPageBreak/>
         <w:t>5. מדריך למשתמש — 10%</w:t>
       </w:r>
     </w:p>
@@ -4079,6 +4025,7 @@
               <w:rPr>
                 <w:sz w:val="20"/>
               </w:rPr>
+              <w:lastRenderedPageBreak/>
               <w:t>צילומי מסך של הזרימה המלאה</w:t>
             </w:r>
           </w:p>
@@ -4818,7 +4765,7 @@
               <w:rPr>
                 <w:sz w:val="20"/>
               </w:rPr>
-              <w:t>תדפיס תוצאות הבדיקות</w:t>
+              <w:t>טבלת הודעות הפרוטוקול</w:t>
             </w:r>
           </w:p>
         </w:tc>
@@ -4850,14 +4797,7 @@
               <w:rPr>
                 <w:sz w:val="20"/>
               </w:rPr>
-              <w:t xml:space="preserve">נספח ב' — פלט pytest -v (99 </w:t>
-            </w:r>
-            <w:r>
-              <w:rPr>
-                <w:sz w:val="20"/>
-              </w:rPr>
-              <w:lastRenderedPageBreak/>
-              <w:t>passed)</w:t>
+              <w:t>נספח ב' — 13 סוגי הודעות + דוגמת זרימה</w:t>
             </w:r>
           </w:p>
         </w:tc>
@@ -4878,8 +4818,7 @@
               <w:rPr>
                 <w:sz w:val="20"/>
               </w:rPr>
-              <w:lastRenderedPageBreak/>
-              <w:t>טבלת הודעות הפרוטוקול</w:t>
+              <w:t>שאלות תיאורטיות לבחינה</w:t>
             </w:r>
           </w:p>
         </w:tc>
@@ -4911,60 +4850,7 @@
               <w:rPr>
                 <w:sz w:val="20"/>
               </w:rPr>
-              <w:t>נספח ג' — 13 סוגי הודעות + דוגמת זרימה</w:t>
-            </w:r>
-          </w:p>
-        </w:tc>
-      </w:tr>
-      <w:tr>
-        <w:trPr>
-          <w:jc w:val="right"/>
-        </w:trPr>
-        <w:tc>
-          <w:tcPr>
-            <w:tcW w:w="3324" w:type="dxa"/>
-          </w:tcPr>
-          <w:p>
-            <w:pPr>
-              <w:bidi w:val="0"/>
-            </w:pPr>
-            <w:r>
-              <w:rPr>
-                <w:sz w:val="20"/>
-              </w:rPr>
-              <w:t>שאלות תיאורטיות לבחינה</w:t>
-            </w:r>
-          </w:p>
-        </w:tc>
-        <w:tc>
-          <w:tcPr>
-            <w:tcW w:w="3324" w:type="dxa"/>
-          </w:tcPr>
-          <w:p>
-            <w:pPr>
-              <w:bidi w:val="0"/>
-            </w:pPr>
-            <w:r>
-              <w:rPr>
-                <w:sz w:val="20"/>
-              </w:rPr>
-              <w:t>✅</w:t>
-            </w:r>
-          </w:p>
-        </w:tc>
-        <w:tc>
-          <w:tcPr>
-            <w:tcW w:w="3324" w:type="dxa"/>
-          </w:tcPr>
-          <w:p>
-            <w:pPr>
-              <w:bidi w:val="0"/>
-            </w:pPr>
-            <w:r>
-              <w:rPr>
-                <w:sz w:val="20"/>
-              </w:rPr>
-              <w:t>נספח ד' — תקשורת, קריפטו, OS, קבצים, סייבר</w:t>
+              <w:t>נספח ג' — תקשורת, קריפטו, OS, קבצים, סייבר</w:t>
             </w:r>
           </w:p>
         </w:tc>
@@ -4980,6 +4866,7 @@
         <w:rPr>
           <w:rFonts w:ascii="Arial" w:hAnsi="Arial"/>
         </w:rPr>
+        <w:lastRenderedPageBreak/>
         <w:t>בונוס — עד 10%</w:t>
       </w:r>
     </w:p>
@@ -5139,7 +5026,7 @@
               <w:rPr>
                 <w:sz w:val="20"/>
               </w:rPr>
-              <w:t>✅ ~3,000 שורות מקור + 99 טסטים אוטומטיים</w:t>
+              <w:t>✅ ~3,000 שורות מקור אפליקטיבי</w:t>
             </w:r>
           </w:p>
         </w:tc>
@@ -6587,7 +6474,7 @@
         <w:spacing w:before="20" w:after="20" w:line="240" w:lineRule="auto"/>
       </w:pPr>
       <w:r>
-        <w:t>בדיקות: tests/ (99 טסטים, רצים ב-~12 שניות עם pytest -v)</w:t>
+        <w:t>תלויות: pyproject.toml (bcrypt&gt;=4.1)</w:t>
       </w:r>
     </w:p>
     <w:p>
@@ -6597,7 +6484,7 @@
         <w:spacing w:before="20" w:after="20" w:line="240" w:lineRule="auto"/>
       </w:pPr>
       <w:r>
-        <w:t>תיעוד נלווה: README.md (כיסוי דרישות + מדריך התקנה)</w:t>
+        <w:t>הוכחת ריבוי שחקנים: הפעלת שרת + שני לקוחות מקבילים שמשחקים זה נגד זה</w:t>
       </w:r>
     </w:p>
     <w:p>
@@ -6607,7 +6494,7 @@
         <w:spacing w:before="20" w:after="20" w:line="240" w:lineRule="auto"/>
       </w:pPr>
       <w:r>
-        <w:t>תלויות: pyproject.toml (bcrypt&gt;=4.1, pytest&gt;=8.0)</w:t>
+        <w:t>הוכחת AI (bonus): לקוח אחד בוחר 'Start AI Game' מה-Lobby</w:t>
       </w:r>
     </w:p>
     <w:p>
@@ -6617,27 +6504,7 @@
         <w:spacing w:before="20" w:after="20" w:line="240" w:lineRule="auto"/>
       </w:pPr>
       <w:r>
-        <w:t>הוכחת ריבוי שחקנים: pytest tests/integration/test_parallel_games.py -v</w:t>
-      </w:r>
-    </w:p>
-    <w:p>
-      <w:pPr>
-        <w:pStyle w:val="ListBullet"/>
-        <w:bidi w:val="0"/>
-        <w:spacing w:before="20" w:after="20" w:line="240" w:lineRule="auto"/>
-      </w:pPr>
-      <w:r>
-        <w:t>הוכחת AI (bonus): pytest tests/integration/test_play_ai.py -v</w:t>
-      </w:r>
-    </w:p>
-    <w:p>
-      <w:pPr>
-        <w:pStyle w:val="ListBullet"/>
-        <w:bidi w:val="0"/>
-        <w:spacing w:before="20" w:after="20" w:line="240" w:lineRule="auto"/>
-      </w:pPr>
-      <w:r>
-        <w:t>הוכחת אטומיות אחסון: pytest tests/unit/test_user_store.py -v</w:t>
+        <w:t>הוכחת אטומיות אחסון: התבוננות ב-data/users.json אחרי register; אין plaintext</w:t>
       </w:r>
     </w:p>
     <w:p>
@@ -6732,7 +6599,7 @@
         <w:spacing w:before="20" w:after="20" w:line="240" w:lineRule="auto"/>
       </w:pPr>
       <w:r>
-        <w:t>פרק 4 — מימוש: 21 מחלקות אפליקטיביות, מבנה תיקיות, דפוס robustness 3 שכבות, טבלת 16 בדיקות</w:t>
+        <w:t>פרק 4 — מימוש: 21 מחלקות אפליקטיביות, מבנה תיקיות, דפוס robustness 3 שכבות</w:t>
       </w:r>
     </w:p>
     <w:p>
@@ -6782,7 +6649,7 @@
         <w:spacing w:before="20" w:after="20" w:line="240" w:lineRule="auto"/>
       </w:pPr>
       <w:r>
-        <w:t>נספח ב' — פלט pytest -v (99 בדיקות עוברות)</w:t>
+        <w:t>נספח ב' — טבלת הודעות הפרוטוקול המלאה (13 סוגים)</w:t>
       </w:r>
     </w:p>
     <w:p>
@@ -6792,17 +6659,7 @@
         <w:spacing w:before="20" w:after="20" w:line="240" w:lineRule="auto"/>
       </w:pPr>
       <w:r>
-        <w:t>נספח ג' — טבלת הודעות הפרוטוקול המלאה (13 סוגים)</w:t>
-      </w:r>
-    </w:p>
-    <w:p>
-      <w:pPr>
-        <w:pStyle w:val="ListBullet"/>
-        <w:bidi w:val="0"/>
-        <w:spacing w:before="20" w:after="20" w:line="240" w:lineRule="auto"/>
-      </w:pPr>
-      <w:r>
-        <w:t>נספח ד' — שאלות תיאורטיות לבחינה עם תשובות מוכנות</w:t>
+        <w:t>נספח ג' — שאלות תיאורטיות לבחינה עם תשובות מוכנות</w:t>
       </w:r>
     </w:p>
     <w:p>
@@ -7066,31 +6923,31 @@
       </w:rPr>
     </w:lvl>
   </w:abstractNum>
-  <w:num w:numId="1" w16cid:durableId="1434276588">
+  <w:num w:numId="1" w16cid:durableId="160897759">
     <w:abstractNumId w:val="8"/>
   </w:num>
-  <w:num w:numId="2" w16cid:durableId="1456293777">
+  <w:num w:numId="2" w16cid:durableId="59254967">
     <w:abstractNumId w:val="6"/>
   </w:num>
-  <w:num w:numId="3" w16cid:durableId="364251533">
+  <w:num w:numId="3" w16cid:durableId="849223261">
     <w:abstractNumId w:val="5"/>
   </w:num>
-  <w:num w:numId="4" w16cid:durableId="1636637680">
+  <w:num w:numId="4" w16cid:durableId="1443644665">
     <w:abstractNumId w:val="4"/>
   </w:num>
-  <w:num w:numId="5" w16cid:durableId="889196570">
+  <w:num w:numId="5" w16cid:durableId="685524340">
     <w:abstractNumId w:val="7"/>
   </w:num>
-  <w:num w:numId="6" w16cid:durableId="494758924">
+  <w:num w:numId="6" w16cid:durableId="891770811">
     <w:abstractNumId w:val="3"/>
   </w:num>
-  <w:num w:numId="7" w16cid:durableId="1862278962">
+  <w:num w:numId="7" w16cid:durableId="1883126743">
     <w:abstractNumId w:val="2"/>
   </w:num>
-  <w:num w:numId="8" w16cid:durableId="1079206903">
+  <w:num w:numId="8" w16cid:durableId="1154025524">
     <w:abstractNumId w:val="1"/>
   </w:num>
-  <w:num w:numId="9" w16cid:durableId="505903329">
+  <w:num w:numId="9" w16cid:durableId="523783674">
     <w:abstractNumId w:val="0"/>
   </w:num>
 </w:numbering>

</xml_diff>

<commit_message>
Fix bullet RTL alignment in Word docs
The Word COM postprocess was calling `Format.ReadingOrder = 1`,
which per Microsoft's `WdReadingOrder` enum is actually
`wdReadingOrderLtr` (left-to-right). For bulleted paragraphs this
forced `<w:bidi w:val="0"/>` on save, which pushed the bullet glyph
to the visual left of the page instead of the right (the natural
side for Hebrew RTL lists).

Switch the COM call to `Format.ReadingOrder = 0`
(`wdReadingOrderRtl`) in both build_portfolio.py and build_rubric.py,
and regenerate the four output artifacts. Bullets in section 6
(reflection) now sit on the right margin, lined up with the start of
each Hebrew line.

Co-authored-by: Cursor <cursoragent@cursor.com>
</commit_message>
<xml_diff>
--- a/מחוון-תיק-פרויקט.docx
+++ b/מחוון-תיק-פרויקט.docx
@@ -4,13 +4,11 @@
   <w:body>
     <w:p>
       <w:pPr>
-        <w:bidi w:val="0"/>
         <w:spacing w:before="1200" w:after="80" w:line="240" w:lineRule="auto"/>
       </w:pPr>
     </w:p>
     <w:p>
       <w:pPr>
-        <w:bidi w:val="0"/>
         <w:spacing w:before="40" w:after="80" w:line="240" w:lineRule="auto"/>
         <w:jc w:val="center"/>
       </w:pPr>
@@ -25,7 +23,6 @@
     </w:p>
     <w:p>
       <w:pPr>
-        <w:bidi w:val="0"/>
         <w:spacing w:before="40" w:after="400" w:line="240" w:lineRule="auto"/>
         <w:jc w:val="center"/>
       </w:pPr>
@@ -40,7 +37,6 @@
     </w:p>
     <w:p>
       <w:pPr>
-        <w:bidi w:val="0"/>
         <w:spacing w:before="40" w:after="80" w:line="240" w:lineRule="auto"/>
         <w:jc w:val="center"/>
       </w:pPr>
@@ -50,7 +46,6 @@
     </w:p>
     <w:p>
       <w:pPr>
-        <w:bidi w:val="0"/>
         <w:spacing w:before="40" w:after="80" w:line="240" w:lineRule="auto"/>
         <w:jc w:val="center"/>
       </w:pPr>
@@ -63,7 +58,6 @@
     </w:p>
     <w:p>
       <w:pPr>
-        <w:bidi w:val="0"/>
         <w:spacing w:before="40" w:after="600" w:line="240" w:lineRule="auto"/>
         <w:jc w:val="center"/>
       </w:pPr>
@@ -79,7 +73,6 @@
     <w:p>
       <w:pPr>
         <w:pStyle w:val="Heading2"/>
-        <w:bidi w:val="0"/>
         <w:spacing w:after="160"/>
       </w:pPr>
       <w:r>
@@ -110,9 +103,6 @@
             <w:shd w:val="clear" w:color="auto" w:fill="EAF2FD"/>
           </w:tcPr>
           <w:p>
-            <w:pPr>
-              <w:bidi w:val="0"/>
-            </w:pPr>
             <w:r>
               <w:rPr>
                 <w:b/>
@@ -128,9 +118,6 @@
             <w:shd w:val="clear" w:color="auto" w:fill="EAF2FD"/>
           </w:tcPr>
           <w:p>
-            <w:pPr>
-              <w:bidi w:val="0"/>
-            </w:pPr>
             <w:r>
               <w:rPr>
                 <w:b/>
@@ -150,9 +137,6 @@
             <w:tcW w:w="3118" w:type="dxa"/>
           </w:tcPr>
           <w:p>
-            <w:pPr>
-              <w:bidi w:val="0"/>
-            </w:pPr>
             <w:r>
               <w:rPr>
                 <w:sz w:val="20"/>
@@ -166,9 +150,6 @@
             <w:tcW w:w="6236" w:type="dxa"/>
           </w:tcPr>
           <w:p>
-            <w:pPr>
-              <w:bidi w:val="0"/>
-            </w:pPr>
             <w:r>
               <w:rPr>
                 <w:sz w:val="20"/>
@@ -187,9 +168,6 @@
             <w:tcW w:w="3118" w:type="dxa"/>
           </w:tcPr>
           <w:p>
-            <w:pPr>
-              <w:bidi w:val="0"/>
-            </w:pPr>
             <w:r>
               <w:rPr>
                 <w:sz w:val="20"/>
@@ -203,9 +181,6 @@
             <w:tcW w:w="6236" w:type="dxa"/>
           </w:tcPr>
           <w:p>
-            <w:pPr>
-              <w:bidi w:val="0"/>
-            </w:pPr>
             <w:r>
               <w:rPr>
                 <w:sz w:val="20"/>
@@ -224,9 +199,6 @@
             <w:tcW w:w="3118" w:type="dxa"/>
           </w:tcPr>
           <w:p>
-            <w:pPr>
-              <w:bidi w:val="0"/>
-            </w:pPr>
             <w:r>
               <w:rPr>
                 <w:sz w:val="20"/>
@@ -240,9 +212,6 @@
             <w:tcW w:w="6236" w:type="dxa"/>
           </w:tcPr>
           <w:p>
-            <w:pPr>
-              <w:bidi w:val="0"/>
-            </w:pPr>
             <w:r>
               <w:rPr>
                 <w:sz w:val="20"/>
@@ -261,9 +230,6 @@
             <w:tcW w:w="3118" w:type="dxa"/>
           </w:tcPr>
           <w:p>
-            <w:pPr>
-              <w:bidi w:val="0"/>
-            </w:pPr>
             <w:r>
               <w:rPr>
                 <w:sz w:val="20"/>
@@ -277,9 +243,6 @@
             <w:tcW w:w="6236" w:type="dxa"/>
           </w:tcPr>
           <w:p>
-            <w:pPr>
-              <w:bidi w:val="0"/>
-            </w:pPr>
             <w:r>
               <w:rPr>
                 <w:sz w:val="20"/>
@@ -298,9 +261,6 @@
             <w:tcW w:w="3118" w:type="dxa"/>
           </w:tcPr>
           <w:p>
-            <w:pPr>
-              <w:bidi w:val="0"/>
-            </w:pPr>
             <w:r>
               <w:rPr>
                 <w:sz w:val="20"/>
@@ -314,9 +274,6 @@
             <w:tcW w:w="6236" w:type="dxa"/>
           </w:tcPr>
           <w:p>
-            <w:pPr>
-              <w:bidi w:val="0"/>
-            </w:pPr>
             <w:r>
               <w:rPr>
                 <w:sz w:val="20"/>
@@ -335,9 +292,6 @@
             <w:tcW w:w="3118" w:type="dxa"/>
           </w:tcPr>
           <w:p>
-            <w:pPr>
-              <w:bidi w:val="0"/>
-            </w:pPr>
             <w:r>
               <w:rPr>
                 <w:sz w:val="20"/>
@@ -351,9 +305,6 @@
             <w:tcW w:w="6236" w:type="dxa"/>
           </w:tcPr>
           <w:p>
-            <w:pPr>
-              <w:bidi w:val="0"/>
-            </w:pPr>
             <w:r>
               <w:rPr>
                 <w:sz w:val="20"/>
@@ -372,9 +323,6 @@
             <w:tcW w:w="3118" w:type="dxa"/>
           </w:tcPr>
           <w:p>
-            <w:pPr>
-              <w:bidi w:val="0"/>
-            </w:pPr>
             <w:r>
               <w:rPr>
                 <w:sz w:val="20"/>
@@ -388,9 +336,6 @@
             <w:tcW w:w="6236" w:type="dxa"/>
           </w:tcPr>
           <w:p>
-            <w:pPr>
-              <w:bidi w:val="0"/>
-            </w:pPr>
             <w:r>
               <w:rPr>
                 <w:sz w:val="20"/>
@@ -402,9 +347,6 @@
       </w:tr>
     </w:tbl>
     <w:p>
-      <w:pPr>
-        <w:bidi w:val="0"/>
-      </w:pPr>
       <w:r>
         <w:br w:type="page"/>
       </w:r>
@@ -412,7 +354,6 @@
     <w:p>
       <w:pPr>
         <w:pStyle w:val="Heading1"/>
-        <w:bidi w:val="0"/>
         <w:spacing w:before="280" w:after="160"/>
       </w:pPr>
       <w:r>
@@ -432,7 +373,6 @@
           <w:right w:val="single" w:sz="18" w:space="4" w:color="F5A623"/>
         </w:pBdr>
         <w:shd w:val="clear" w:color="auto" w:fill="FFF8E1"/>
-        <w:bidi w:val="0"/>
         <w:spacing w:before="80" w:after="80" w:line="240" w:lineRule="auto"/>
         <w:ind w:left="170" w:right="170"/>
       </w:pPr>
@@ -452,11 +392,11 @@
         <w:tblLook w:val="04A0" w:firstRow="1" w:lastRow="0" w:firstColumn="1" w:lastColumn="0" w:noHBand="0" w:noVBand="1"/>
       </w:tblPr>
       <w:tblGrid>
-        <w:gridCol w:w="1316"/>
-        <w:gridCol w:w="1627"/>
-        <w:gridCol w:w="1694"/>
-        <w:gridCol w:w="1459"/>
-        <w:gridCol w:w="4092"/>
+        <w:gridCol w:w="1338"/>
+        <w:gridCol w:w="1639"/>
+        <w:gridCol w:w="1704"/>
+        <w:gridCol w:w="1476"/>
+        <w:gridCol w:w="4031"/>
       </w:tblGrid>
       <w:tr>
         <w:trPr>
@@ -468,9 +408,6 @@
             <w:shd w:val="clear" w:color="auto" w:fill="EAF2FD"/>
           </w:tcPr>
           <w:p>
-            <w:pPr>
-              <w:bidi w:val="0"/>
-            </w:pPr>
             <w:r>
               <w:rPr>
                 <w:b/>
@@ -486,9 +423,6 @@
             <w:shd w:val="clear" w:color="auto" w:fill="EAF2FD"/>
           </w:tcPr>
           <w:p>
-            <w:pPr>
-              <w:bidi w:val="0"/>
-            </w:pPr>
             <w:r>
               <w:rPr>
                 <w:b/>
@@ -504,9 +438,6 @@
             <w:shd w:val="clear" w:color="auto" w:fill="EAF2FD"/>
           </w:tcPr>
           <w:p>
-            <w:pPr>
-              <w:bidi w:val="0"/>
-            </w:pPr>
             <w:r>
               <w:rPr>
                 <w:b/>
@@ -522,9 +453,6 @@
             <w:shd w:val="clear" w:color="auto" w:fill="EAF2FD"/>
           </w:tcPr>
           <w:p>
-            <w:pPr>
-              <w:bidi w:val="0"/>
-            </w:pPr>
             <w:r>
               <w:rPr>
                 <w:b/>
@@ -540,9 +468,6 @@
             <w:shd w:val="clear" w:color="auto" w:fill="EAF2FD"/>
           </w:tcPr>
           <w:p>
-            <w:pPr>
-              <w:bidi w:val="0"/>
-            </w:pPr>
             <w:r>
               <w:rPr>
                 <w:b/>
@@ -562,9 +487,6 @@
             <w:tcW w:w="1994" w:type="dxa"/>
           </w:tcPr>
           <w:p>
-            <w:pPr>
-              <w:bidi w:val="0"/>
-            </w:pPr>
             <w:r>
               <w:rPr>
                 <w:sz w:val="20"/>
@@ -578,9 +500,6 @@
             <w:tcW w:w="1994" w:type="dxa"/>
           </w:tcPr>
           <w:p>
-            <w:pPr>
-              <w:bidi w:val="0"/>
-            </w:pPr>
             <w:r>
               <w:rPr>
                 <w:sz w:val="20"/>
@@ -594,9 +513,6 @@
             <w:tcW w:w="1994" w:type="dxa"/>
           </w:tcPr>
           <w:p>
-            <w:pPr>
-              <w:bidi w:val="0"/>
-            </w:pPr>
             <w:r>
               <w:rPr>
                 <w:sz w:val="20"/>
@@ -610,9 +526,6 @@
             <w:tcW w:w="1994" w:type="dxa"/>
           </w:tcPr>
           <w:p>
-            <w:pPr>
-              <w:bidi w:val="0"/>
-            </w:pPr>
             <w:r>
               <w:rPr>
                 <w:sz w:val="20"/>
@@ -626,9 +539,6 @@
             <w:tcW w:w="1994" w:type="dxa"/>
           </w:tcPr>
           <w:p>
-            <w:pPr>
-              <w:bidi w:val="0"/>
-            </w:pPr>
             <w:r>
               <w:rPr>
                 <w:sz w:val="20"/>
@@ -647,9 +557,6 @@
             <w:tcW w:w="1994" w:type="dxa"/>
           </w:tcPr>
           <w:p>
-            <w:pPr>
-              <w:bidi w:val="0"/>
-            </w:pPr>
             <w:r>
               <w:rPr>
                 <w:sz w:val="20"/>
@@ -663,9 +570,6 @@
             <w:tcW w:w="1994" w:type="dxa"/>
           </w:tcPr>
           <w:p>
-            <w:pPr>
-              <w:bidi w:val="0"/>
-            </w:pPr>
             <w:r>
               <w:rPr>
                 <w:sz w:val="20"/>
@@ -679,9 +583,6 @@
             <w:tcW w:w="1994" w:type="dxa"/>
           </w:tcPr>
           <w:p>
-            <w:pPr>
-              <w:bidi w:val="0"/>
-            </w:pPr>
             <w:r>
               <w:rPr>
                 <w:sz w:val="20"/>
@@ -695,9 +596,6 @@
             <w:tcW w:w="1994" w:type="dxa"/>
           </w:tcPr>
           <w:p>
-            <w:pPr>
-              <w:bidi w:val="0"/>
-            </w:pPr>
             <w:r>
               <w:rPr>
                 <w:sz w:val="20"/>
@@ -711,9 +609,6 @@
             <w:tcW w:w="1994" w:type="dxa"/>
           </w:tcPr>
           <w:p>
-            <w:pPr>
-              <w:bidi w:val="0"/>
-            </w:pPr>
             <w:r>
               <w:rPr>
                 <w:sz w:val="20"/>
@@ -732,9 +627,6 @@
             <w:tcW w:w="1994" w:type="dxa"/>
           </w:tcPr>
           <w:p>
-            <w:pPr>
-              <w:bidi w:val="0"/>
-            </w:pPr>
             <w:r>
               <w:rPr>
                 <w:sz w:val="20"/>
@@ -748,9 +640,6 @@
             <w:tcW w:w="1994" w:type="dxa"/>
           </w:tcPr>
           <w:p>
-            <w:pPr>
-              <w:bidi w:val="0"/>
-            </w:pPr>
             <w:r>
               <w:rPr>
                 <w:sz w:val="20"/>
@@ -764,9 +653,6 @@
             <w:tcW w:w="1994" w:type="dxa"/>
           </w:tcPr>
           <w:p>
-            <w:pPr>
-              <w:bidi w:val="0"/>
-            </w:pPr>
             <w:r>
               <w:rPr>
                 <w:sz w:val="20"/>
@@ -780,9 +666,6 @@
             <w:tcW w:w="1994" w:type="dxa"/>
           </w:tcPr>
           <w:p>
-            <w:pPr>
-              <w:bidi w:val="0"/>
-            </w:pPr>
             <w:r>
               <w:rPr>
                 <w:sz w:val="20"/>
@@ -796,9 +679,6 @@
             <w:tcW w:w="1994" w:type="dxa"/>
           </w:tcPr>
           <w:p>
-            <w:pPr>
-              <w:bidi w:val="0"/>
-            </w:pPr>
             <w:r>
               <w:rPr>
                 <w:sz w:val="20"/>
@@ -817,9 +697,6 @@
             <w:tcW w:w="1994" w:type="dxa"/>
           </w:tcPr>
           <w:p>
-            <w:pPr>
-              <w:bidi w:val="0"/>
-            </w:pPr>
             <w:r>
               <w:rPr>
                 <w:sz w:val="20"/>
@@ -833,9 +710,6 @@
             <w:tcW w:w="1994" w:type="dxa"/>
           </w:tcPr>
           <w:p>
-            <w:pPr>
-              <w:bidi w:val="0"/>
-            </w:pPr>
             <w:r>
               <w:rPr>
                 <w:sz w:val="20"/>
@@ -849,9 +723,6 @@
             <w:tcW w:w="1994" w:type="dxa"/>
           </w:tcPr>
           <w:p>
-            <w:pPr>
-              <w:bidi w:val="0"/>
-            </w:pPr>
             <w:r>
               <w:rPr>
                 <w:sz w:val="20"/>
@@ -865,9 +736,6 @@
             <w:tcW w:w="1994" w:type="dxa"/>
           </w:tcPr>
           <w:p>
-            <w:pPr>
-              <w:bidi w:val="0"/>
-            </w:pPr>
             <w:r>
               <w:rPr>
                 <w:sz w:val="20"/>
@@ -881,9 +749,6 @@
             <w:tcW w:w="1994" w:type="dxa"/>
           </w:tcPr>
           <w:p>
-            <w:pPr>
-              <w:bidi w:val="0"/>
-            </w:pPr>
             <w:r>
               <w:rPr>
                 <w:sz w:val="20"/>
@@ -902,9 +767,6 @@
             <w:tcW w:w="1994" w:type="dxa"/>
           </w:tcPr>
           <w:p>
-            <w:pPr>
-              <w:bidi w:val="0"/>
-            </w:pPr>
             <w:r>
               <w:rPr>
                 <w:sz w:val="20"/>
@@ -918,9 +780,6 @@
             <w:tcW w:w="1994" w:type="dxa"/>
           </w:tcPr>
           <w:p>
-            <w:pPr>
-              <w:bidi w:val="0"/>
-            </w:pPr>
             <w:r>
               <w:rPr>
                 <w:sz w:val="20"/>
@@ -934,9 +793,6 @@
             <w:tcW w:w="1994" w:type="dxa"/>
           </w:tcPr>
           <w:p>
-            <w:pPr>
-              <w:bidi w:val="0"/>
-            </w:pPr>
             <w:r>
               <w:rPr>
                 <w:sz w:val="20"/>
@@ -950,9 +806,6 @@
             <w:tcW w:w="1994" w:type="dxa"/>
           </w:tcPr>
           <w:p>
-            <w:pPr>
-              <w:bidi w:val="0"/>
-            </w:pPr>
             <w:r>
               <w:rPr>
                 <w:sz w:val="20"/>
@@ -966,9 +819,6 @@
             <w:tcW w:w="1994" w:type="dxa"/>
           </w:tcPr>
           <w:p>
-            <w:pPr>
-              <w:bidi w:val="0"/>
-            </w:pPr>
             <w:r>
               <w:rPr>
                 <w:sz w:val="20"/>
@@ -987,9 +837,6 @@
             <w:tcW w:w="1994" w:type="dxa"/>
           </w:tcPr>
           <w:p>
-            <w:pPr>
-              <w:bidi w:val="0"/>
-            </w:pPr>
             <w:r>
               <w:rPr>
                 <w:sz w:val="20"/>
@@ -1003,9 +850,6 @@
             <w:tcW w:w="1994" w:type="dxa"/>
           </w:tcPr>
           <w:p>
-            <w:pPr>
-              <w:bidi w:val="0"/>
-            </w:pPr>
             <w:r>
               <w:rPr>
                 <w:sz w:val="20"/>
@@ -1019,9 +863,6 @@
             <w:tcW w:w="1994" w:type="dxa"/>
           </w:tcPr>
           <w:p>
-            <w:pPr>
-              <w:bidi w:val="0"/>
-            </w:pPr>
             <w:r>
               <w:rPr>
                 <w:sz w:val="20"/>
@@ -1035,9 +876,6 @@
             <w:tcW w:w="1994" w:type="dxa"/>
           </w:tcPr>
           <w:p>
-            <w:pPr>
-              <w:bidi w:val="0"/>
-            </w:pPr>
             <w:r>
               <w:rPr>
                 <w:sz w:val="20"/>
@@ -1051,9 +889,6 @@
             <w:tcW w:w="1994" w:type="dxa"/>
           </w:tcPr>
           <w:p>
-            <w:pPr>
-              <w:bidi w:val="0"/>
-            </w:pPr>
             <w:r>
               <w:rPr>
                 <w:sz w:val="20"/>
@@ -1072,9 +907,6 @@
             <w:tcW w:w="1994" w:type="dxa"/>
           </w:tcPr>
           <w:p>
-            <w:pPr>
-              <w:bidi w:val="0"/>
-            </w:pPr>
             <w:r>
               <w:rPr>
                 <w:sz w:val="20"/>
@@ -1088,9 +920,6 @@
             <w:tcW w:w="1994" w:type="dxa"/>
           </w:tcPr>
           <w:p>
-            <w:pPr>
-              <w:bidi w:val="0"/>
-            </w:pPr>
             <w:r>
               <w:rPr>
                 <w:sz w:val="20"/>
@@ -1104,9 +933,6 @@
             <w:tcW w:w="1994" w:type="dxa"/>
           </w:tcPr>
           <w:p>
-            <w:pPr>
-              <w:bidi w:val="0"/>
-            </w:pPr>
             <w:r>
               <w:rPr>
                 <w:sz w:val="20"/>
@@ -1120,9 +946,6 @@
             <w:tcW w:w="1994" w:type="dxa"/>
           </w:tcPr>
           <w:p>
-            <w:pPr>
-              <w:bidi w:val="0"/>
-            </w:pPr>
             <w:r>
               <w:rPr>
                 <w:sz w:val="20"/>
@@ -1136,9 +959,6 @@
             <w:tcW w:w="1994" w:type="dxa"/>
           </w:tcPr>
           <w:p>
-            <w:pPr>
-              <w:bidi w:val="0"/>
-            </w:pPr>
             <w:r>
               <w:rPr>
                 <w:sz w:val="20"/>
@@ -1157,9 +977,6 @@
             <w:tcW w:w="1994" w:type="dxa"/>
           </w:tcPr>
           <w:p>
-            <w:pPr>
-              <w:bidi w:val="0"/>
-            </w:pPr>
             <w:r>
               <w:rPr>
                 <w:sz w:val="20"/>
@@ -1173,9 +990,6 @@
             <w:tcW w:w="1994" w:type="dxa"/>
           </w:tcPr>
           <w:p>
-            <w:pPr>
-              <w:bidi w:val="0"/>
-            </w:pPr>
             <w:r>
               <w:rPr>
                 <w:sz w:val="20"/>
@@ -1189,9 +1003,6 @@
             <w:tcW w:w="1994" w:type="dxa"/>
           </w:tcPr>
           <w:p>
-            <w:pPr>
-              <w:bidi w:val="0"/>
-            </w:pPr>
             <w:r>
               <w:rPr>
                 <w:sz w:val="20"/>
@@ -1205,9 +1016,6 @@
             <w:tcW w:w="1994" w:type="dxa"/>
           </w:tcPr>
           <w:p>
-            <w:pPr>
-              <w:bidi w:val="0"/>
-            </w:pPr>
             <w:r>
               <w:rPr>
                 <w:sz w:val="20"/>
@@ -1221,9 +1029,6 @@
             <w:tcW w:w="1994" w:type="dxa"/>
           </w:tcPr>
           <w:p>
-            <w:pPr>
-              <w:bidi w:val="0"/>
-            </w:pPr>
             <w:r>
               <w:rPr>
                 <w:sz w:val="20"/>
@@ -1249,9 +1054,6 @@
             <w:tcW w:w="1994" w:type="dxa"/>
           </w:tcPr>
           <w:p>
-            <w:pPr>
-              <w:bidi w:val="0"/>
-            </w:pPr>
             <w:r>
               <w:rPr>
                 <w:sz w:val="20"/>
@@ -1266,9 +1068,6 @@
             <w:tcW w:w="1994" w:type="dxa"/>
           </w:tcPr>
           <w:p>
-            <w:pPr>
-              <w:bidi w:val="0"/>
-            </w:pPr>
             <w:r>
               <w:rPr>
                 <w:sz w:val="20"/>
@@ -1282,9 +1081,6 @@
             <w:tcW w:w="1994" w:type="dxa"/>
           </w:tcPr>
           <w:p>
-            <w:pPr>
-              <w:bidi w:val="0"/>
-            </w:pPr>
             <w:r>
               <w:rPr>
                 <w:sz w:val="20"/>
@@ -1298,9 +1094,6 @@
             <w:tcW w:w="1994" w:type="dxa"/>
           </w:tcPr>
           <w:p>
-            <w:pPr>
-              <w:bidi w:val="0"/>
-            </w:pPr>
             <w:r>
               <w:rPr>
                 <w:sz w:val="20"/>
@@ -1314,9 +1107,6 @@
             <w:tcW w:w="1994" w:type="dxa"/>
           </w:tcPr>
           <w:p>
-            <w:pPr>
-              <w:bidi w:val="0"/>
-            </w:pPr>
             <w:r>
               <w:rPr>
                 <w:sz w:val="20"/>
@@ -1336,7 +1126,6 @@
           <w:right w:val="single" w:sz="18" w:space="4" w:color="F5A623"/>
         </w:pBdr>
         <w:shd w:val="clear" w:color="auto" w:fill="FFF8E1"/>
-        <w:bidi w:val="0"/>
         <w:spacing w:before="80" w:after="80" w:line="240" w:lineRule="auto"/>
         <w:ind w:left="170" w:right="170"/>
       </w:pPr>
@@ -1350,7 +1139,6 @@
     </w:p>
     <w:p>
       <w:pPr>
-        <w:bidi w:val="0"/>
         <w:spacing w:before="40" w:after="80" w:line="240" w:lineRule="auto"/>
       </w:pPr>
       <w:r>
@@ -1363,9 +1151,6 @@
       </w:r>
     </w:p>
     <w:p>
-      <w:pPr>
-        <w:bidi w:val="0"/>
-      </w:pPr>
       <w:r>
         <w:br w:type="page"/>
       </w:r>
@@ -1373,7 +1158,6 @@
     <w:p>
       <w:pPr>
         <w:pStyle w:val="Heading1"/>
-        <w:bidi w:val="0"/>
         <w:spacing w:before="280" w:after="160"/>
       </w:pPr>
       <w:r>
@@ -1409,9 +1193,6 @@
             <w:shd w:val="clear" w:color="auto" w:fill="EAF2FD"/>
           </w:tcPr>
           <w:p>
-            <w:pPr>
-              <w:bidi w:val="0"/>
-            </w:pPr>
             <w:r>
               <w:rPr>
                 <w:b/>
@@ -1427,9 +1208,6 @@
             <w:shd w:val="clear" w:color="auto" w:fill="EAF2FD"/>
           </w:tcPr>
           <w:p>
-            <w:pPr>
-              <w:bidi w:val="0"/>
-            </w:pPr>
             <w:r>
               <w:rPr>
                 <w:b/>
@@ -1445,9 +1223,6 @@
             <w:shd w:val="clear" w:color="auto" w:fill="EAF2FD"/>
           </w:tcPr>
           <w:p>
-            <w:pPr>
-              <w:bidi w:val="0"/>
-            </w:pPr>
             <w:r>
               <w:rPr>
                 <w:b/>
@@ -1463,9 +1238,6 @@
             <w:shd w:val="clear" w:color="auto" w:fill="EAF2FD"/>
           </w:tcPr>
           <w:p>
-            <w:pPr>
-              <w:bidi w:val="0"/>
-            </w:pPr>
             <w:r>
               <w:rPr>
                 <w:b/>
@@ -1481,9 +1253,6 @@
             <w:shd w:val="clear" w:color="auto" w:fill="EAF2FD"/>
           </w:tcPr>
           <w:p>
-            <w:pPr>
-              <w:bidi w:val="0"/>
-            </w:pPr>
             <w:r>
               <w:rPr>
                 <w:b/>
@@ -1499,9 +1268,6 @@
             <w:shd w:val="clear" w:color="auto" w:fill="EAF2FD"/>
           </w:tcPr>
           <w:p>
-            <w:pPr>
-              <w:bidi w:val="0"/>
-            </w:pPr>
             <w:r>
               <w:rPr>
                 <w:b/>
@@ -1521,9 +1287,6 @@
             <w:tcW w:w="1662" w:type="dxa"/>
           </w:tcPr>
           <w:p>
-            <w:pPr>
-              <w:bidi w:val="0"/>
-            </w:pPr>
             <w:r>
               <w:rPr>
                 <w:sz w:val="20"/>
@@ -1537,9 +1300,6 @@
             <w:tcW w:w="1662" w:type="dxa"/>
           </w:tcPr>
           <w:p>
-            <w:pPr>
-              <w:bidi w:val="0"/>
-            </w:pPr>
             <w:r>
               <w:rPr>
                 <w:sz w:val="20"/>
@@ -1553,9 +1313,6 @@
             <w:tcW w:w="1662" w:type="dxa"/>
           </w:tcPr>
           <w:p>
-            <w:pPr>
-              <w:bidi w:val="0"/>
-            </w:pPr>
             <w:r>
               <w:rPr>
                 <w:sz w:val="20"/>
@@ -1569,9 +1326,6 @@
             <w:tcW w:w="1662" w:type="dxa"/>
           </w:tcPr>
           <w:p>
-            <w:pPr>
-              <w:bidi w:val="0"/>
-            </w:pPr>
             <w:r>
               <w:rPr>
                 <w:sz w:val="20"/>
@@ -1585,9 +1339,6 @@
             <w:tcW w:w="1662" w:type="dxa"/>
           </w:tcPr>
           <w:p>
-            <w:pPr>
-              <w:bidi w:val="0"/>
-            </w:pPr>
             <w:r>
               <w:rPr>
                 <w:sz w:val="20"/>
@@ -1601,9 +1352,6 @@
             <w:tcW w:w="1662" w:type="dxa"/>
           </w:tcPr>
           <w:p>
-            <w:pPr>
-              <w:bidi w:val="0"/>
-            </w:pPr>
             <w:r>
               <w:rPr>
                 <w:sz w:val="20"/>
@@ -1622,9 +1370,6 @@
             <w:tcW w:w="1662" w:type="dxa"/>
           </w:tcPr>
           <w:p>
-            <w:pPr>
-              <w:bidi w:val="0"/>
-            </w:pPr>
             <w:r>
               <w:rPr>
                 <w:sz w:val="20"/>
@@ -1638,9 +1383,6 @@
             <w:tcW w:w="1662" w:type="dxa"/>
           </w:tcPr>
           <w:p>
-            <w:pPr>
-              <w:bidi w:val="0"/>
-            </w:pPr>
             <w:r>
               <w:rPr>
                 <w:sz w:val="20"/>
@@ -1654,9 +1396,6 @@
             <w:tcW w:w="1662" w:type="dxa"/>
           </w:tcPr>
           <w:p>
-            <w:pPr>
-              <w:bidi w:val="0"/>
-            </w:pPr>
             <w:r>
               <w:rPr>
                 <w:sz w:val="20"/>
@@ -1670,9 +1409,6 @@
             <w:tcW w:w="1662" w:type="dxa"/>
           </w:tcPr>
           <w:p>
-            <w:pPr>
-              <w:bidi w:val="0"/>
-            </w:pPr>
             <w:r>
               <w:rPr>
                 <w:sz w:val="20"/>
@@ -1686,9 +1422,6 @@
             <w:tcW w:w="1662" w:type="dxa"/>
           </w:tcPr>
           <w:p>
-            <w:pPr>
-              <w:bidi w:val="0"/>
-            </w:pPr>
             <w:r>
               <w:rPr>
                 <w:sz w:val="20"/>
@@ -1702,9 +1435,6 @@
             <w:tcW w:w="1662" w:type="dxa"/>
           </w:tcPr>
           <w:p>
-            <w:pPr>
-              <w:bidi w:val="0"/>
-            </w:pPr>
             <w:r>
               <w:rPr>
                 <w:sz w:val="20"/>
@@ -1723,9 +1453,6 @@
             <w:tcW w:w="1662" w:type="dxa"/>
           </w:tcPr>
           <w:p>
-            <w:pPr>
-              <w:bidi w:val="0"/>
-            </w:pPr>
             <w:r>
               <w:rPr>
                 <w:sz w:val="20"/>
@@ -1739,9 +1466,6 @@
             <w:tcW w:w="1662" w:type="dxa"/>
           </w:tcPr>
           <w:p>
-            <w:pPr>
-              <w:bidi w:val="0"/>
-            </w:pPr>
             <w:r>
               <w:rPr>
                 <w:sz w:val="20"/>
@@ -1755,9 +1479,6 @@
             <w:tcW w:w="1662" w:type="dxa"/>
           </w:tcPr>
           <w:p>
-            <w:pPr>
-              <w:bidi w:val="0"/>
-            </w:pPr>
             <w:r>
               <w:rPr>
                 <w:sz w:val="20"/>
@@ -1771,9 +1492,6 @@
             <w:tcW w:w="1662" w:type="dxa"/>
           </w:tcPr>
           <w:p>
-            <w:pPr>
-              <w:bidi w:val="0"/>
-            </w:pPr>
             <w:r>
               <w:rPr>
                 <w:sz w:val="20"/>
@@ -1787,9 +1505,6 @@
             <w:tcW w:w="1662" w:type="dxa"/>
           </w:tcPr>
           <w:p>
-            <w:pPr>
-              <w:bidi w:val="0"/>
-            </w:pPr>
             <w:r>
               <w:rPr>
                 <w:sz w:val="20"/>
@@ -1803,9 +1518,6 @@
             <w:tcW w:w="1662" w:type="dxa"/>
           </w:tcPr>
           <w:p>
-            <w:pPr>
-              <w:bidi w:val="0"/>
-            </w:pPr>
             <w:r>
               <w:rPr>
                 <w:sz w:val="20"/>
@@ -1824,9 +1536,6 @@
             <w:tcW w:w="1662" w:type="dxa"/>
           </w:tcPr>
           <w:p>
-            <w:pPr>
-              <w:bidi w:val="0"/>
-            </w:pPr>
             <w:r>
               <w:rPr>
                 <w:sz w:val="20"/>
@@ -1840,9 +1549,6 @@
             <w:tcW w:w="1662" w:type="dxa"/>
           </w:tcPr>
           <w:p>
-            <w:pPr>
-              <w:bidi w:val="0"/>
-            </w:pPr>
             <w:r>
               <w:rPr>
                 <w:sz w:val="20"/>
@@ -1856,9 +1562,6 @@
             <w:tcW w:w="1662" w:type="dxa"/>
           </w:tcPr>
           <w:p>
-            <w:pPr>
-              <w:bidi w:val="0"/>
-            </w:pPr>
             <w:r>
               <w:rPr>
                 <w:sz w:val="20"/>
@@ -1872,9 +1575,6 @@
             <w:tcW w:w="1662" w:type="dxa"/>
           </w:tcPr>
           <w:p>
-            <w:pPr>
-              <w:bidi w:val="0"/>
-            </w:pPr>
             <w:r>
               <w:rPr>
                 <w:sz w:val="20"/>
@@ -1888,9 +1588,6 @@
             <w:tcW w:w="1662" w:type="dxa"/>
           </w:tcPr>
           <w:p>
-            <w:pPr>
-              <w:bidi w:val="0"/>
-            </w:pPr>
             <w:r>
               <w:rPr>
                 <w:sz w:val="20"/>
@@ -1904,9 +1601,6 @@
             <w:tcW w:w="1662" w:type="dxa"/>
           </w:tcPr>
           <w:p>
-            <w:pPr>
-              <w:bidi w:val="0"/>
-            </w:pPr>
             <w:r>
               <w:rPr>
                 <w:sz w:val="20"/>
@@ -1925,9 +1619,6 @@
             <w:tcW w:w="1662" w:type="dxa"/>
           </w:tcPr>
           <w:p>
-            <w:pPr>
-              <w:bidi w:val="0"/>
-            </w:pPr>
             <w:r>
               <w:rPr>
                 <w:sz w:val="20"/>
@@ -1941,9 +1632,6 @@
             <w:tcW w:w="1662" w:type="dxa"/>
           </w:tcPr>
           <w:p>
-            <w:pPr>
-              <w:bidi w:val="0"/>
-            </w:pPr>
             <w:r>
               <w:rPr>
                 <w:sz w:val="20"/>
@@ -1957,9 +1645,6 @@
             <w:tcW w:w="1662" w:type="dxa"/>
           </w:tcPr>
           <w:p>
-            <w:pPr>
-              <w:bidi w:val="0"/>
-            </w:pPr>
             <w:r>
               <w:rPr>
                 <w:sz w:val="20"/>
@@ -1973,9 +1658,6 @@
             <w:tcW w:w="1662" w:type="dxa"/>
           </w:tcPr>
           <w:p>
-            <w:pPr>
-              <w:bidi w:val="0"/>
-            </w:pPr>
             <w:r>
               <w:rPr>
                 <w:sz w:val="20"/>
@@ -1989,9 +1671,6 @@
             <w:tcW w:w="1662" w:type="dxa"/>
           </w:tcPr>
           <w:p>
-            <w:pPr>
-              <w:bidi w:val="0"/>
-            </w:pPr>
             <w:r>
               <w:rPr>
                 <w:sz w:val="20"/>
@@ -2005,9 +1684,6 @@
             <w:tcW w:w="1662" w:type="dxa"/>
           </w:tcPr>
           <w:p>
-            <w:pPr>
-              <w:bidi w:val="0"/>
-            </w:pPr>
             <w:r>
               <w:rPr>
                 <w:sz w:val="20"/>
@@ -2026,9 +1702,6 @@
             <w:tcW w:w="1662" w:type="dxa"/>
           </w:tcPr>
           <w:p>
-            <w:pPr>
-              <w:bidi w:val="0"/>
-            </w:pPr>
             <w:r>
               <w:rPr>
                 <w:sz w:val="20"/>
@@ -2042,9 +1715,6 @@
             <w:tcW w:w="1662" w:type="dxa"/>
           </w:tcPr>
           <w:p>
-            <w:pPr>
-              <w:bidi w:val="0"/>
-            </w:pPr>
             <w:r>
               <w:rPr>
                 <w:sz w:val="20"/>
@@ -2058,9 +1728,6 @@
             <w:tcW w:w="1662" w:type="dxa"/>
           </w:tcPr>
           <w:p>
-            <w:pPr>
-              <w:bidi w:val="0"/>
-            </w:pPr>
             <w:r>
               <w:rPr>
                 <w:sz w:val="20"/>
@@ -2074,9 +1741,6 @@
             <w:tcW w:w="1662" w:type="dxa"/>
           </w:tcPr>
           <w:p>
-            <w:pPr>
-              <w:bidi w:val="0"/>
-            </w:pPr>
             <w:r>
               <w:rPr>
                 <w:sz w:val="20"/>
@@ -2090,9 +1754,6 @@
             <w:tcW w:w="1662" w:type="dxa"/>
           </w:tcPr>
           <w:p>
-            <w:pPr>
-              <w:bidi w:val="0"/>
-            </w:pPr>
             <w:r>
               <w:rPr>
                 <w:sz w:val="20"/>
@@ -2106,9 +1767,6 @@
             <w:tcW w:w="1662" w:type="dxa"/>
           </w:tcPr>
           <w:p>
-            <w:pPr>
-              <w:bidi w:val="0"/>
-            </w:pPr>
             <w:r>
               <w:rPr>
                 <w:sz w:val="20"/>
@@ -2121,7 +1779,6 @@
     </w:tbl>
     <w:p>
       <w:pPr>
-        <w:bidi w:val="0"/>
         <w:spacing w:before="40" w:after="80" w:line="240" w:lineRule="auto"/>
       </w:pPr>
       <w:r>
@@ -2133,9 +1790,6 @@
       </w:r>
     </w:p>
     <w:p>
-      <w:pPr>
-        <w:bidi w:val="0"/>
-      </w:pPr>
       <w:r>
         <w:br w:type="page"/>
       </w:r>
@@ -2143,7 +1797,6 @@
     <w:p>
       <w:pPr>
         <w:pStyle w:val="Heading1"/>
-        <w:bidi w:val="0"/>
         <w:spacing w:before="280" w:after="160"/>
       </w:pPr>
       <w:r>
@@ -2157,7 +1810,6 @@
     <w:p>
       <w:pPr>
         <w:pStyle w:val="Heading2"/>
-        <w:bidi w:val="0"/>
         <w:spacing w:after="160"/>
       </w:pPr>
       <w:r>
@@ -2189,9 +1841,6 @@
             <w:shd w:val="clear" w:color="auto" w:fill="EAF2FD"/>
           </w:tcPr>
           <w:p>
-            <w:pPr>
-              <w:bidi w:val="0"/>
-            </w:pPr>
             <w:r>
               <w:rPr>
                 <w:b/>
@@ -2207,9 +1856,6 @@
             <w:shd w:val="clear" w:color="auto" w:fill="EAF2FD"/>
           </w:tcPr>
           <w:p>
-            <w:pPr>
-              <w:bidi w:val="0"/>
-            </w:pPr>
             <w:r>
               <w:rPr>
                 <w:b/>
@@ -2225,9 +1871,6 @@
             <w:shd w:val="clear" w:color="auto" w:fill="EAF2FD"/>
           </w:tcPr>
           <w:p>
-            <w:pPr>
-              <w:bidi w:val="0"/>
-            </w:pPr>
             <w:r>
               <w:rPr>
                 <w:b/>
@@ -2247,9 +1890,6 @@
             <w:tcW w:w="3324" w:type="dxa"/>
           </w:tcPr>
           <w:p>
-            <w:pPr>
-              <w:bidi w:val="0"/>
-            </w:pPr>
             <w:r>
               <w:rPr>
                 <w:sz w:val="20"/>
@@ -2263,9 +1903,6 @@
             <w:tcW w:w="3324" w:type="dxa"/>
           </w:tcPr>
           <w:p>
-            <w:pPr>
-              <w:bidi w:val="0"/>
-            </w:pPr>
             <w:r>
               <w:rPr>
                 <w:sz w:val="20"/>
@@ -2279,9 +1916,6 @@
             <w:tcW w:w="3324" w:type="dxa"/>
           </w:tcPr>
           <w:p>
-            <w:pPr>
-              <w:bidi w:val="0"/>
-            </w:pPr>
             <w:r>
               <w:rPr>
                 <w:sz w:val="20"/>
@@ -2300,9 +1934,6 @@
             <w:tcW w:w="3324" w:type="dxa"/>
           </w:tcPr>
           <w:p>
-            <w:pPr>
-              <w:bidi w:val="0"/>
-            </w:pPr>
             <w:r>
               <w:rPr>
                 <w:sz w:val="20"/>
@@ -2316,9 +1947,6 @@
             <w:tcW w:w="3324" w:type="dxa"/>
           </w:tcPr>
           <w:p>
-            <w:pPr>
-              <w:bidi w:val="0"/>
-            </w:pPr>
             <w:r>
               <w:rPr>
                 <w:sz w:val="20"/>
@@ -2332,9 +1960,6 @@
             <w:tcW w:w="3324" w:type="dxa"/>
           </w:tcPr>
           <w:p>
-            <w:pPr>
-              <w:bidi w:val="0"/>
-            </w:pPr>
             <w:r>
               <w:rPr>
                 <w:sz w:val="20"/>
@@ -2353,9 +1978,6 @@
             <w:tcW w:w="3324" w:type="dxa"/>
           </w:tcPr>
           <w:p>
-            <w:pPr>
-              <w:bidi w:val="0"/>
-            </w:pPr>
             <w:r>
               <w:rPr>
                 <w:sz w:val="20"/>
@@ -2369,9 +1991,6 @@
             <w:tcW w:w="3324" w:type="dxa"/>
           </w:tcPr>
           <w:p>
-            <w:pPr>
-              <w:bidi w:val="0"/>
-            </w:pPr>
             <w:r>
               <w:rPr>
                 <w:sz w:val="20"/>
@@ -2385,9 +2004,6 @@
             <w:tcW w:w="3324" w:type="dxa"/>
           </w:tcPr>
           <w:p>
-            <w:pPr>
-              <w:bidi w:val="0"/>
-            </w:pPr>
             <w:r>
               <w:rPr>
                 <w:sz w:val="20"/>
@@ -2406,9 +2022,6 @@
             <w:tcW w:w="3324" w:type="dxa"/>
           </w:tcPr>
           <w:p>
-            <w:pPr>
-              <w:bidi w:val="0"/>
-            </w:pPr>
             <w:r>
               <w:rPr>
                 <w:sz w:val="20"/>
@@ -2422,9 +2035,6 @@
             <w:tcW w:w="3324" w:type="dxa"/>
           </w:tcPr>
           <w:p>
-            <w:pPr>
-              <w:bidi w:val="0"/>
-            </w:pPr>
             <w:r>
               <w:rPr>
                 <w:sz w:val="20"/>
@@ -2438,9 +2048,6 @@
             <w:tcW w:w="3324" w:type="dxa"/>
           </w:tcPr>
           <w:p>
-            <w:pPr>
-              <w:bidi w:val="0"/>
-            </w:pPr>
             <w:r>
               <w:rPr>
                 <w:sz w:val="20"/>
@@ -2459,9 +2066,6 @@
             <w:tcW w:w="3324" w:type="dxa"/>
           </w:tcPr>
           <w:p>
-            <w:pPr>
-              <w:bidi w:val="0"/>
-            </w:pPr>
             <w:r>
               <w:rPr>
                 <w:sz w:val="20"/>
@@ -2475,9 +2079,6 @@
             <w:tcW w:w="3324" w:type="dxa"/>
           </w:tcPr>
           <w:p>
-            <w:pPr>
-              <w:bidi w:val="0"/>
-            </w:pPr>
             <w:r>
               <w:rPr>
                 <w:sz w:val="20"/>
@@ -2491,9 +2092,6 @@
             <w:tcW w:w="3324" w:type="dxa"/>
           </w:tcPr>
           <w:p>
-            <w:pPr>
-              <w:bidi w:val="0"/>
-            </w:pPr>
             <w:r>
               <w:rPr>
                 <w:sz w:val="20"/>
@@ -2512,9 +2110,6 @@
             <w:tcW w:w="3324" w:type="dxa"/>
           </w:tcPr>
           <w:p>
-            <w:pPr>
-              <w:bidi w:val="0"/>
-            </w:pPr>
             <w:r>
               <w:rPr>
                 <w:sz w:val="20"/>
@@ -2528,9 +2123,6 @@
             <w:tcW w:w="3324" w:type="dxa"/>
           </w:tcPr>
           <w:p>
-            <w:pPr>
-              <w:bidi w:val="0"/>
-            </w:pPr>
             <w:r>
               <w:rPr>
                 <w:sz w:val="20"/>
@@ -2544,9 +2136,6 @@
             <w:tcW w:w="3324" w:type="dxa"/>
           </w:tcPr>
           <w:p>
-            <w:pPr>
-              <w:bidi w:val="0"/>
-            </w:pPr>
             <w:r>
               <w:rPr>
                 <w:sz w:val="20"/>
@@ -2559,7 +2148,6 @@
     </w:tbl>
     <w:p>
       <w:pPr>
-        <w:bidi w:val="0"/>
         <w:spacing w:before="40" w:after="80" w:line="240" w:lineRule="auto"/>
       </w:pPr>
       <w:r>
@@ -2573,7 +2161,6 @@
     <w:p>
       <w:pPr>
         <w:pStyle w:val="Heading2"/>
-        <w:bidi w:val="0"/>
         <w:spacing w:after="160"/>
       </w:pPr>
       <w:r>
@@ -2605,9 +2192,6 @@
             <w:shd w:val="clear" w:color="auto" w:fill="EAF2FD"/>
           </w:tcPr>
           <w:p>
-            <w:pPr>
-              <w:bidi w:val="0"/>
-            </w:pPr>
             <w:r>
               <w:rPr>
                 <w:b/>
@@ -2623,9 +2207,6 @@
             <w:shd w:val="clear" w:color="auto" w:fill="EAF2FD"/>
           </w:tcPr>
           <w:p>
-            <w:pPr>
-              <w:bidi w:val="0"/>
-            </w:pPr>
             <w:r>
               <w:rPr>
                 <w:b/>
@@ -2641,9 +2222,6 @@
             <w:shd w:val="clear" w:color="auto" w:fill="EAF2FD"/>
           </w:tcPr>
           <w:p>
-            <w:pPr>
-              <w:bidi w:val="0"/>
-            </w:pPr>
             <w:r>
               <w:rPr>
                 <w:b/>
@@ -2663,9 +2241,6 @@
             <w:tcW w:w="3324" w:type="dxa"/>
           </w:tcPr>
           <w:p>
-            <w:pPr>
-              <w:bidi w:val="0"/>
-            </w:pPr>
             <w:r>
               <w:rPr>
                 <w:sz w:val="20"/>
@@ -2679,9 +2254,6 @@
             <w:tcW w:w="3324" w:type="dxa"/>
           </w:tcPr>
           <w:p>
-            <w:pPr>
-              <w:bidi w:val="0"/>
-            </w:pPr>
             <w:r>
               <w:rPr>
                 <w:sz w:val="20"/>
@@ -2695,9 +2267,6 @@
             <w:tcW w:w="3324" w:type="dxa"/>
           </w:tcPr>
           <w:p>
-            <w:pPr>
-              <w:bidi w:val="0"/>
-            </w:pPr>
             <w:r>
               <w:rPr>
                 <w:sz w:val="20"/>
@@ -2716,9 +2285,6 @@
             <w:tcW w:w="3324" w:type="dxa"/>
           </w:tcPr>
           <w:p>
-            <w:pPr>
-              <w:bidi w:val="0"/>
-            </w:pPr>
             <w:r>
               <w:rPr>
                 <w:sz w:val="20"/>
@@ -2732,9 +2298,6 @@
             <w:tcW w:w="3324" w:type="dxa"/>
           </w:tcPr>
           <w:p>
-            <w:pPr>
-              <w:bidi w:val="0"/>
-            </w:pPr>
             <w:r>
               <w:rPr>
                 <w:sz w:val="20"/>
@@ -2748,9 +2311,6 @@
             <w:tcW w:w="3324" w:type="dxa"/>
           </w:tcPr>
           <w:p>
-            <w:pPr>
-              <w:bidi w:val="0"/>
-            </w:pPr>
             <w:r>
               <w:rPr>
                 <w:sz w:val="20"/>
@@ -2769,9 +2329,6 @@
             <w:tcW w:w="3324" w:type="dxa"/>
           </w:tcPr>
           <w:p>
-            <w:pPr>
-              <w:bidi w:val="0"/>
-            </w:pPr>
             <w:r>
               <w:rPr>
                 <w:sz w:val="20"/>
@@ -2785,9 +2342,6 @@
             <w:tcW w:w="3324" w:type="dxa"/>
           </w:tcPr>
           <w:p>
-            <w:pPr>
-              <w:bidi w:val="0"/>
-            </w:pPr>
             <w:r>
               <w:rPr>
                 <w:sz w:val="20"/>
@@ -2801,9 +2355,6 @@
             <w:tcW w:w="3324" w:type="dxa"/>
           </w:tcPr>
           <w:p>
-            <w:pPr>
-              <w:bidi w:val="0"/>
-            </w:pPr>
             <w:r>
               <w:rPr>
                 <w:sz w:val="20"/>
@@ -2822,9 +2373,6 @@
             <w:tcW w:w="3324" w:type="dxa"/>
           </w:tcPr>
           <w:p>
-            <w:pPr>
-              <w:bidi w:val="0"/>
-            </w:pPr>
             <w:r>
               <w:rPr>
                 <w:sz w:val="20"/>
@@ -2838,9 +2386,6 @@
             <w:tcW w:w="3324" w:type="dxa"/>
           </w:tcPr>
           <w:p>
-            <w:pPr>
-              <w:bidi w:val="0"/>
-            </w:pPr>
             <w:r>
               <w:rPr>
                 <w:sz w:val="20"/>
@@ -2854,9 +2399,6 @@
             <w:tcW w:w="3324" w:type="dxa"/>
           </w:tcPr>
           <w:p>
-            <w:pPr>
-              <w:bidi w:val="0"/>
-            </w:pPr>
             <w:r>
               <w:rPr>
                 <w:sz w:val="20"/>
@@ -2875,9 +2417,6 @@
             <w:tcW w:w="3324" w:type="dxa"/>
           </w:tcPr>
           <w:p>
-            <w:pPr>
-              <w:bidi w:val="0"/>
-            </w:pPr>
             <w:r>
               <w:rPr>
                 <w:sz w:val="20"/>
@@ -2891,9 +2430,6 @@
             <w:tcW w:w="3324" w:type="dxa"/>
           </w:tcPr>
           <w:p>
-            <w:pPr>
-              <w:bidi w:val="0"/>
-            </w:pPr>
             <w:r>
               <w:rPr>
                 <w:sz w:val="20"/>
@@ -2907,9 +2443,6 @@
             <w:tcW w:w="3324" w:type="dxa"/>
           </w:tcPr>
           <w:p>
-            <w:pPr>
-              <w:bidi w:val="0"/>
-            </w:pPr>
             <w:r>
               <w:rPr>
                 <w:sz w:val="20"/>
@@ -2928,9 +2461,6 @@
             <w:tcW w:w="3324" w:type="dxa"/>
           </w:tcPr>
           <w:p>
-            <w:pPr>
-              <w:bidi w:val="0"/>
-            </w:pPr>
             <w:r>
               <w:rPr>
                 <w:sz w:val="20"/>
@@ -2944,9 +2474,6 @@
             <w:tcW w:w="3324" w:type="dxa"/>
           </w:tcPr>
           <w:p>
-            <w:pPr>
-              <w:bidi w:val="0"/>
-            </w:pPr>
             <w:r>
               <w:rPr>
                 <w:sz w:val="20"/>
@@ -2960,9 +2487,6 @@
             <w:tcW w:w="3324" w:type="dxa"/>
           </w:tcPr>
           <w:p>
-            <w:pPr>
-              <w:bidi w:val="0"/>
-            </w:pPr>
             <w:r>
               <w:rPr>
                 <w:sz w:val="20"/>
@@ -2975,7 +2499,6 @@
     </w:tbl>
     <w:p>
       <w:pPr>
-        <w:bidi w:val="0"/>
         <w:spacing w:before="40" w:after="80" w:line="240" w:lineRule="auto"/>
       </w:pPr>
       <w:r>
@@ -2989,7 +2512,6 @@
     <w:p>
       <w:pPr>
         <w:pStyle w:val="Heading2"/>
-        <w:bidi w:val="0"/>
         <w:spacing w:after="160"/>
       </w:pPr>
       <w:r>
@@ -3021,9 +2543,6 @@
             <w:shd w:val="clear" w:color="auto" w:fill="EAF2FD"/>
           </w:tcPr>
           <w:p>
-            <w:pPr>
-              <w:bidi w:val="0"/>
-            </w:pPr>
             <w:r>
               <w:rPr>
                 <w:b/>
@@ -3039,9 +2558,6 @@
             <w:shd w:val="clear" w:color="auto" w:fill="EAF2FD"/>
           </w:tcPr>
           <w:p>
-            <w:pPr>
-              <w:bidi w:val="0"/>
-            </w:pPr>
             <w:r>
               <w:rPr>
                 <w:b/>
@@ -3057,9 +2573,6 @@
             <w:shd w:val="clear" w:color="auto" w:fill="EAF2FD"/>
           </w:tcPr>
           <w:p>
-            <w:pPr>
-              <w:bidi w:val="0"/>
-            </w:pPr>
             <w:r>
               <w:rPr>
                 <w:b/>
@@ -3079,9 +2592,6 @@
             <w:tcW w:w="3324" w:type="dxa"/>
           </w:tcPr>
           <w:p>
-            <w:pPr>
-              <w:bidi w:val="0"/>
-            </w:pPr>
             <w:r>
               <w:rPr>
                 <w:sz w:val="20"/>
@@ -3095,9 +2605,6 @@
             <w:tcW w:w="3324" w:type="dxa"/>
           </w:tcPr>
           <w:p>
-            <w:pPr>
-              <w:bidi w:val="0"/>
-            </w:pPr>
             <w:r>
               <w:rPr>
                 <w:sz w:val="20"/>
@@ -3111,9 +2618,6 @@
             <w:tcW w:w="3324" w:type="dxa"/>
           </w:tcPr>
           <w:p>
-            <w:pPr>
-              <w:bidi w:val="0"/>
-            </w:pPr>
             <w:r>
               <w:rPr>
                 <w:sz w:val="20"/>
@@ -3132,9 +2636,6 @@
             <w:tcW w:w="3324" w:type="dxa"/>
           </w:tcPr>
           <w:p>
-            <w:pPr>
-              <w:bidi w:val="0"/>
-            </w:pPr>
             <w:r>
               <w:rPr>
                 <w:sz w:val="20"/>
@@ -3149,9 +2650,6 @@
             <w:tcW w:w="3324" w:type="dxa"/>
           </w:tcPr>
           <w:p>
-            <w:pPr>
-              <w:bidi w:val="0"/>
-            </w:pPr>
             <w:r>
               <w:rPr>
                 <w:sz w:val="20"/>
@@ -3165,9 +2663,6 @@
             <w:tcW w:w="3324" w:type="dxa"/>
           </w:tcPr>
           <w:p>
-            <w:pPr>
-              <w:bidi w:val="0"/>
-            </w:pPr>
             <w:r>
               <w:rPr>
                 <w:sz w:val="20"/>
@@ -3186,9 +2681,6 @@
             <w:tcW w:w="3324" w:type="dxa"/>
           </w:tcPr>
           <w:p>
-            <w:pPr>
-              <w:bidi w:val="0"/>
-            </w:pPr>
             <w:r>
               <w:rPr>
                 <w:sz w:val="20"/>
@@ -3202,9 +2694,6 @@
             <w:tcW w:w="3324" w:type="dxa"/>
           </w:tcPr>
           <w:p>
-            <w:pPr>
-              <w:bidi w:val="0"/>
-            </w:pPr>
             <w:r>
               <w:rPr>
                 <w:sz w:val="20"/>
@@ -3218,9 +2707,6 @@
             <w:tcW w:w="3324" w:type="dxa"/>
           </w:tcPr>
           <w:p>
-            <w:pPr>
-              <w:bidi w:val="0"/>
-            </w:pPr>
             <w:r>
               <w:rPr>
                 <w:sz w:val="20"/>
@@ -3239,9 +2725,6 @@
             <w:tcW w:w="3324" w:type="dxa"/>
           </w:tcPr>
           <w:p>
-            <w:pPr>
-              <w:bidi w:val="0"/>
-            </w:pPr>
             <w:r>
               <w:rPr>
                 <w:sz w:val="20"/>
@@ -3255,9 +2738,6 @@
             <w:tcW w:w="3324" w:type="dxa"/>
           </w:tcPr>
           <w:p>
-            <w:pPr>
-              <w:bidi w:val="0"/>
-            </w:pPr>
             <w:r>
               <w:rPr>
                 <w:sz w:val="20"/>
@@ -3271,9 +2751,6 @@
             <w:tcW w:w="3324" w:type="dxa"/>
           </w:tcPr>
           <w:p>
-            <w:pPr>
-              <w:bidi w:val="0"/>
-            </w:pPr>
             <w:r>
               <w:rPr>
                 <w:sz w:val="20"/>
@@ -3292,9 +2769,6 @@
             <w:tcW w:w="3324" w:type="dxa"/>
           </w:tcPr>
           <w:p>
-            <w:pPr>
-              <w:bidi w:val="0"/>
-            </w:pPr>
             <w:r>
               <w:rPr>
                 <w:sz w:val="20"/>
@@ -3308,9 +2782,6 @@
             <w:tcW w:w="3324" w:type="dxa"/>
           </w:tcPr>
           <w:p>
-            <w:pPr>
-              <w:bidi w:val="0"/>
-            </w:pPr>
             <w:r>
               <w:rPr>
                 <w:sz w:val="20"/>
@@ -3324,9 +2795,6 @@
             <w:tcW w:w="3324" w:type="dxa"/>
           </w:tcPr>
           <w:p>
-            <w:pPr>
-              <w:bidi w:val="0"/>
-            </w:pPr>
             <w:r>
               <w:rPr>
                 <w:sz w:val="20"/>
@@ -3345,9 +2813,6 @@
             <w:tcW w:w="3324" w:type="dxa"/>
           </w:tcPr>
           <w:p>
-            <w:pPr>
-              <w:bidi w:val="0"/>
-            </w:pPr>
             <w:r>
               <w:rPr>
                 <w:sz w:val="20"/>
@@ -3361,9 +2826,6 @@
             <w:tcW w:w="3324" w:type="dxa"/>
           </w:tcPr>
           <w:p>
-            <w:pPr>
-              <w:bidi w:val="0"/>
-            </w:pPr>
             <w:r>
               <w:rPr>
                 <w:sz w:val="20"/>
@@ -3377,9 +2839,6 @@
             <w:tcW w:w="3324" w:type="dxa"/>
           </w:tcPr>
           <w:p>
-            <w:pPr>
-              <w:bidi w:val="0"/>
-            </w:pPr>
             <w:r>
               <w:rPr>
                 <w:sz w:val="20"/>
@@ -3392,7 +2851,6 @@
     </w:tbl>
     <w:p>
       <w:pPr>
-        <w:bidi w:val="0"/>
         <w:spacing w:before="40" w:after="80" w:line="240" w:lineRule="auto"/>
       </w:pPr>
       <w:r>
@@ -3406,7 +2864,6 @@
     <w:p>
       <w:pPr>
         <w:pStyle w:val="Heading2"/>
-        <w:bidi w:val="0"/>
         <w:spacing w:after="160"/>
       </w:pPr>
       <w:r>
@@ -3438,9 +2895,6 @@
             <w:shd w:val="clear" w:color="auto" w:fill="EAF2FD"/>
           </w:tcPr>
           <w:p>
-            <w:pPr>
-              <w:bidi w:val="0"/>
-            </w:pPr>
             <w:r>
               <w:rPr>
                 <w:b/>
@@ -3456,9 +2910,6 @@
             <w:shd w:val="clear" w:color="auto" w:fill="EAF2FD"/>
           </w:tcPr>
           <w:p>
-            <w:pPr>
-              <w:bidi w:val="0"/>
-            </w:pPr>
             <w:r>
               <w:rPr>
                 <w:b/>
@@ -3474,9 +2925,6 @@
             <w:shd w:val="clear" w:color="auto" w:fill="EAF2FD"/>
           </w:tcPr>
           <w:p>
-            <w:pPr>
-              <w:bidi w:val="0"/>
-            </w:pPr>
             <w:r>
               <w:rPr>
                 <w:b/>
@@ -3496,9 +2944,6 @@
             <w:tcW w:w="3324" w:type="dxa"/>
           </w:tcPr>
           <w:p>
-            <w:pPr>
-              <w:bidi w:val="0"/>
-            </w:pPr>
             <w:r>
               <w:rPr>
                 <w:sz w:val="20"/>
@@ -3512,9 +2957,6 @@
             <w:tcW w:w="3324" w:type="dxa"/>
           </w:tcPr>
           <w:p>
-            <w:pPr>
-              <w:bidi w:val="0"/>
-            </w:pPr>
             <w:r>
               <w:rPr>
                 <w:sz w:val="20"/>
@@ -3528,9 +2970,6 @@
             <w:tcW w:w="3324" w:type="dxa"/>
           </w:tcPr>
           <w:p>
-            <w:pPr>
-              <w:bidi w:val="0"/>
-            </w:pPr>
             <w:r>
               <w:rPr>
                 <w:sz w:val="20"/>
@@ -3549,9 +2988,6 @@
             <w:tcW w:w="3324" w:type="dxa"/>
           </w:tcPr>
           <w:p>
-            <w:pPr>
-              <w:bidi w:val="0"/>
-            </w:pPr>
             <w:r>
               <w:rPr>
                 <w:sz w:val="20"/>
@@ -3565,9 +3001,6 @@
             <w:tcW w:w="3324" w:type="dxa"/>
           </w:tcPr>
           <w:p>
-            <w:pPr>
-              <w:bidi w:val="0"/>
-            </w:pPr>
             <w:r>
               <w:rPr>
                 <w:sz w:val="20"/>
@@ -3581,9 +3014,6 @@
             <w:tcW w:w="3324" w:type="dxa"/>
           </w:tcPr>
           <w:p>
-            <w:pPr>
-              <w:bidi w:val="0"/>
-            </w:pPr>
             <w:r>
               <w:rPr>
                 <w:sz w:val="20"/>
@@ -3602,9 +3032,6 @@
             <w:tcW w:w="3324" w:type="dxa"/>
           </w:tcPr>
           <w:p>
-            <w:pPr>
-              <w:bidi w:val="0"/>
-            </w:pPr>
             <w:r>
               <w:rPr>
                 <w:sz w:val="20"/>
@@ -3618,9 +3045,6 @@
             <w:tcW w:w="3324" w:type="dxa"/>
           </w:tcPr>
           <w:p>
-            <w:pPr>
-              <w:bidi w:val="0"/>
-            </w:pPr>
             <w:r>
               <w:rPr>
                 <w:sz w:val="20"/>
@@ -3634,9 +3058,6 @@
             <w:tcW w:w="3324" w:type="dxa"/>
           </w:tcPr>
           <w:p>
-            <w:pPr>
-              <w:bidi w:val="0"/>
-            </w:pPr>
             <w:r>
               <w:rPr>
                 <w:sz w:val="20"/>
@@ -3655,9 +3076,6 @@
             <w:tcW w:w="3324" w:type="dxa"/>
           </w:tcPr>
           <w:p>
-            <w:pPr>
-              <w:bidi w:val="0"/>
-            </w:pPr>
             <w:r>
               <w:rPr>
                 <w:sz w:val="20"/>
@@ -3671,9 +3089,6 @@
             <w:tcW w:w="3324" w:type="dxa"/>
           </w:tcPr>
           <w:p>
-            <w:pPr>
-              <w:bidi w:val="0"/>
-            </w:pPr>
             <w:r>
               <w:rPr>
                 <w:sz w:val="20"/>
@@ -3687,9 +3102,6 @@
             <w:tcW w:w="3324" w:type="dxa"/>
           </w:tcPr>
           <w:p>
-            <w:pPr>
-              <w:bidi w:val="0"/>
-            </w:pPr>
             <w:r>
               <w:rPr>
                 <w:sz w:val="20"/>
@@ -3708,9 +3120,6 @@
             <w:tcW w:w="3324" w:type="dxa"/>
           </w:tcPr>
           <w:p>
-            <w:pPr>
-              <w:bidi w:val="0"/>
-            </w:pPr>
             <w:r>
               <w:rPr>
                 <w:sz w:val="20"/>
@@ -3724,9 +3133,6 @@
             <w:tcW w:w="3324" w:type="dxa"/>
           </w:tcPr>
           <w:p>
-            <w:pPr>
-              <w:bidi w:val="0"/>
-            </w:pPr>
             <w:r>
               <w:rPr>
                 <w:sz w:val="20"/>
@@ -3740,9 +3146,6 @@
             <w:tcW w:w="3324" w:type="dxa"/>
           </w:tcPr>
           <w:p>
-            <w:pPr>
-              <w:bidi w:val="0"/>
-            </w:pPr>
             <w:r>
               <w:rPr>
                 <w:sz w:val="20"/>
@@ -3761,9 +3164,6 @@
             <w:tcW w:w="3324" w:type="dxa"/>
           </w:tcPr>
           <w:p>
-            <w:pPr>
-              <w:bidi w:val="0"/>
-            </w:pPr>
             <w:r>
               <w:rPr>
                 <w:sz w:val="20"/>
@@ -3777,9 +3177,6 @@
             <w:tcW w:w="3324" w:type="dxa"/>
           </w:tcPr>
           <w:p>
-            <w:pPr>
-              <w:bidi w:val="0"/>
-            </w:pPr>
             <w:r>
               <w:rPr>
                 <w:sz w:val="20"/>
@@ -3793,9 +3190,6 @@
             <w:tcW w:w="3324" w:type="dxa"/>
           </w:tcPr>
           <w:p>
-            <w:pPr>
-              <w:bidi w:val="0"/>
-            </w:pPr>
             <w:r>
               <w:rPr>
                 <w:sz w:val="20"/>
@@ -3814,9 +3208,6 @@
             <w:tcW w:w="3324" w:type="dxa"/>
           </w:tcPr>
           <w:p>
-            <w:pPr>
-              <w:bidi w:val="0"/>
-            </w:pPr>
             <w:r>
               <w:rPr>
                 <w:sz w:val="20"/>
@@ -3830,9 +3221,6 @@
             <w:tcW w:w="3324" w:type="dxa"/>
           </w:tcPr>
           <w:p>
-            <w:pPr>
-              <w:bidi w:val="0"/>
-            </w:pPr>
             <w:r>
               <w:rPr>
                 <w:sz w:val="20"/>
@@ -3846,9 +3234,6 @@
             <w:tcW w:w="3324" w:type="dxa"/>
           </w:tcPr>
           <w:p>
-            <w:pPr>
-              <w:bidi w:val="0"/>
-            </w:pPr>
             <w:r>
               <w:rPr>
                 <w:sz w:val="20"/>
@@ -3861,7 +3246,6 @@
     </w:tbl>
     <w:p>
       <w:pPr>
-        <w:bidi w:val="0"/>
         <w:spacing w:before="40" w:after="80" w:line="240" w:lineRule="auto"/>
       </w:pPr>
       <w:r>
@@ -3875,7 +3259,6 @@
     <w:p>
       <w:pPr>
         <w:pStyle w:val="Heading2"/>
-        <w:bidi w:val="0"/>
         <w:spacing w:after="160"/>
       </w:pPr>
       <w:r>
@@ -3907,9 +3290,6 @@
             <w:shd w:val="clear" w:color="auto" w:fill="EAF2FD"/>
           </w:tcPr>
           <w:p>
-            <w:pPr>
-              <w:bidi w:val="0"/>
-            </w:pPr>
             <w:r>
               <w:rPr>
                 <w:b/>
@@ -3925,9 +3305,6 @@
             <w:shd w:val="clear" w:color="auto" w:fill="EAF2FD"/>
           </w:tcPr>
           <w:p>
-            <w:pPr>
-              <w:bidi w:val="0"/>
-            </w:pPr>
             <w:r>
               <w:rPr>
                 <w:b/>
@@ -3943,9 +3320,6 @@
             <w:shd w:val="clear" w:color="auto" w:fill="EAF2FD"/>
           </w:tcPr>
           <w:p>
-            <w:pPr>
-              <w:bidi w:val="0"/>
-            </w:pPr>
             <w:r>
               <w:rPr>
                 <w:b/>
@@ -3965,9 +3339,6 @@
             <w:tcW w:w="3324" w:type="dxa"/>
           </w:tcPr>
           <w:p>
-            <w:pPr>
-              <w:bidi w:val="0"/>
-            </w:pPr>
             <w:r>
               <w:rPr>
                 <w:sz w:val="20"/>
@@ -3981,9 +3352,6 @@
             <w:tcW w:w="3324" w:type="dxa"/>
           </w:tcPr>
           <w:p>
-            <w:pPr>
-              <w:bidi w:val="0"/>
-            </w:pPr>
             <w:r>
               <w:rPr>
                 <w:sz w:val="20"/>
@@ -3997,9 +3365,6 @@
             <w:tcW w:w="3324" w:type="dxa"/>
           </w:tcPr>
           <w:p>
-            <w:pPr>
-              <w:bidi w:val="0"/>
-            </w:pPr>
             <w:r>
               <w:rPr>
                 <w:sz w:val="20"/>
@@ -4018,9 +3383,6 @@
             <w:tcW w:w="3324" w:type="dxa"/>
           </w:tcPr>
           <w:p>
-            <w:pPr>
-              <w:bidi w:val="0"/>
-            </w:pPr>
             <w:r>
               <w:rPr>
                 <w:sz w:val="20"/>
@@ -4035,9 +3397,6 @@
             <w:tcW w:w="3324" w:type="dxa"/>
           </w:tcPr>
           <w:p>
-            <w:pPr>
-              <w:bidi w:val="0"/>
-            </w:pPr>
             <w:r>
               <w:rPr>
                 <w:sz w:val="20"/>
@@ -4051,9 +3410,6 @@
             <w:tcW w:w="3324" w:type="dxa"/>
           </w:tcPr>
           <w:p>
-            <w:pPr>
-              <w:bidi w:val="0"/>
-            </w:pPr>
             <w:r>
               <w:rPr>
                 <w:sz w:val="20"/>
@@ -4072,9 +3428,6 @@
             <w:tcW w:w="3324" w:type="dxa"/>
           </w:tcPr>
           <w:p>
-            <w:pPr>
-              <w:bidi w:val="0"/>
-            </w:pPr>
             <w:r>
               <w:rPr>
                 <w:sz w:val="20"/>
@@ -4088,9 +3441,6 @@
             <w:tcW w:w="3324" w:type="dxa"/>
           </w:tcPr>
           <w:p>
-            <w:pPr>
-              <w:bidi w:val="0"/>
-            </w:pPr>
             <w:r>
               <w:rPr>
                 <w:sz w:val="20"/>
@@ -4104,9 +3454,6 @@
             <w:tcW w:w="3324" w:type="dxa"/>
           </w:tcPr>
           <w:p>
-            <w:pPr>
-              <w:bidi w:val="0"/>
-            </w:pPr>
             <w:r>
               <w:rPr>
                 <w:sz w:val="20"/>
@@ -4125,9 +3472,6 @@
             <w:tcW w:w="3324" w:type="dxa"/>
           </w:tcPr>
           <w:p>
-            <w:pPr>
-              <w:bidi w:val="0"/>
-            </w:pPr>
             <w:r>
               <w:rPr>
                 <w:sz w:val="20"/>
@@ -4141,9 +3485,6 @@
             <w:tcW w:w="3324" w:type="dxa"/>
           </w:tcPr>
           <w:p>
-            <w:pPr>
-              <w:bidi w:val="0"/>
-            </w:pPr>
             <w:r>
               <w:rPr>
                 <w:sz w:val="20"/>
@@ -4157,9 +3498,6 @@
             <w:tcW w:w="3324" w:type="dxa"/>
           </w:tcPr>
           <w:p>
-            <w:pPr>
-              <w:bidi w:val="0"/>
-            </w:pPr>
             <w:r>
               <w:rPr>
                 <w:sz w:val="20"/>
@@ -4172,7 +3510,6 @@
     </w:tbl>
     <w:p>
       <w:pPr>
-        <w:bidi w:val="0"/>
         <w:spacing w:before="40" w:after="80" w:line="240" w:lineRule="auto"/>
       </w:pPr>
       <w:r>
@@ -4186,7 +3523,6 @@
     <w:p>
       <w:pPr>
         <w:pStyle w:val="Heading2"/>
-        <w:bidi w:val="0"/>
         <w:spacing w:after="160"/>
       </w:pPr>
       <w:r>
@@ -4205,7 +3541,6 @@
           <w:right w:val="single" w:sz="18" w:space="4" w:color="F5A623"/>
         </w:pBdr>
         <w:shd w:val="clear" w:color="auto" w:fill="FFF8E1"/>
-        <w:bidi w:val="0"/>
         <w:spacing w:before="80" w:after="80" w:line="240" w:lineRule="auto"/>
         <w:ind w:left="170" w:right="170"/>
       </w:pPr>
@@ -4239,9 +3574,6 @@
             <w:shd w:val="clear" w:color="auto" w:fill="EAF2FD"/>
           </w:tcPr>
           <w:p>
-            <w:pPr>
-              <w:bidi w:val="0"/>
-            </w:pPr>
             <w:r>
               <w:rPr>
                 <w:b/>
@@ -4257,9 +3589,6 @@
             <w:shd w:val="clear" w:color="auto" w:fill="EAF2FD"/>
           </w:tcPr>
           <w:p>
-            <w:pPr>
-              <w:bidi w:val="0"/>
-            </w:pPr>
             <w:r>
               <w:rPr>
                 <w:b/>
@@ -4275,9 +3604,6 @@
             <w:shd w:val="clear" w:color="auto" w:fill="EAF2FD"/>
           </w:tcPr>
           <w:p>
-            <w:pPr>
-              <w:bidi w:val="0"/>
-            </w:pPr>
             <w:r>
               <w:rPr>
                 <w:b/>
@@ -4297,9 +3623,6 @@
             <w:tcW w:w="3324" w:type="dxa"/>
           </w:tcPr>
           <w:p>
-            <w:pPr>
-              <w:bidi w:val="0"/>
-            </w:pPr>
             <w:r>
               <w:rPr>
                 <w:sz w:val="20"/>
@@ -4313,9 +3636,6 @@
             <w:tcW w:w="3324" w:type="dxa"/>
           </w:tcPr>
           <w:p>
-            <w:pPr>
-              <w:bidi w:val="0"/>
-            </w:pPr>
             <w:r>
               <w:rPr>
                 <w:sz w:val="20"/>
@@ -4329,9 +3649,6 @@
             <w:tcW w:w="3324" w:type="dxa"/>
           </w:tcPr>
           <w:p>
-            <w:pPr>
-              <w:bidi w:val="0"/>
-            </w:pPr>
             <w:r>
               <w:rPr>
                 <w:sz w:val="20"/>
@@ -4350,9 +3667,6 @@
             <w:tcW w:w="3324" w:type="dxa"/>
           </w:tcPr>
           <w:p>
-            <w:pPr>
-              <w:bidi w:val="0"/>
-            </w:pPr>
             <w:r>
               <w:rPr>
                 <w:sz w:val="20"/>
@@ -4366,9 +3680,6 @@
             <w:tcW w:w="3324" w:type="dxa"/>
           </w:tcPr>
           <w:p>
-            <w:pPr>
-              <w:bidi w:val="0"/>
-            </w:pPr>
             <w:r>
               <w:rPr>
                 <w:sz w:val="20"/>
@@ -4382,9 +3693,6 @@
             <w:tcW w:w="3324" w:type="dxa"/>
           </w:tcPr>
           <w:p>
-            <w:pPr>
-              <w:bidi w:val="0"/>
-            </w:pPr>
             <w:r>
               <w:rPr>
                 <w:sz w:val="20"/>
@@ -4403,9 +3711,6 @@
             <w:tcW w:w="3324" w:type="dxa"/>
           </w:tcPr>
           <w:p>
-            <w:pPr>
-              <w:bidi w:val="0"/>
-            </w:pPr>
             <w:r>
               <w:rPr>
                 <w:sz w:val="20"/>
@@ -4419,9 +3724,6 @@
             <w:tcW w:w="3324" w:type="dxa"/>
           </w:tcPr>
           <w:p>
-            <w:pPr>
-              <w:bidi w:val="0"/>
-            </w:pPr>
             <w:r>
               <w:rPr>
                 <w:sz w:val="20"/>
@@ -4435,9 +3737,6 @@
             <w:tcW w:w="3324" w:type="dxa"/>
           </w:tcPr>
           <w:p>
-            <w:pPr>
-              <w:bidi w:val="0"/>
-            </w:pPr>
             <w:r>
               <w:rPr>
                 <w:sz w:val="20"/>
@@ -4450,7 +3749,6 @@
     </w:tbl>
     <w:p>
       <w:pPr>
-        <w:bidi w:val="0"/>
         <w:spacing w:before="40" w:after="80" w:line="240" w:lineRule="auto"/>
       </w:pPr>
       <w:r>
@@ -4464,7 +3762,6 @@
     <w:p>
       <w:pPr>
         <w:pStyle w:val="Heading2"/>
-        <w:bidi w:val="0"/>
         <w:spacing w:after="160"/>
       </w:pPr>
       <w:r>
@@ -4496,9 +3793,6 @@
             <w:shd w:val="clear" w:color="auto" w:fill="EAF2FD"/>
           </w:tcPr>
           <w:p>
-            <w:pPr>
-              <w:bidi w:val="0"/>
-            </w:pPr>
             <w:r>
               <w:rPr>
                 <w:b/>
@@ -4514,9 +3808,6 @@
             <w:shd w:val="clear" w:color="auto" w:fill="EAF2FD"/>
           </w:tcPr>
           <w:p>
-            <w:pPr>
-              <w:bidi w:val="0"/>
-            </w:pPr>
             <w:r>
               <w:rPr>
                 <w:b/>
@@ -4532,9 +3823,6 @@
             <w:shd w:val="clear" w:color="auto" w:fill="EAF2FD"/>
           </w:tcPr>
           <w:p>
-            <w:pPr>
-              <w:bidi w:val="0"/>
-            </w:pPr>
             <w:r>
               <w:rPr>
                 <w:b/>
@@ -4554,9 +3842,6 @@
             <w:tcW w:w="3324" w:type="dxa"/>
           </w:tcPr>
           <w:p>
-            <w:pPr>
-              <w:bidi w:val="0"/>
-            </w:pPr>
             <w:r>
               <w:rPr>
                 <w:sz w:val="20"/>
@@ -4570,9 +3855,6 @@
             <w:tcW w:w="3324" w:type="dxa"/>
           </w:tcPr>
           <w:p>
-            <w:pPr>
-              <w:bidi w:val="0"/>
-            </w:pPr>
             <w:r>
               <w:rPr>
                 <w:sz w:val="20"/>
@@ -4586,9 +3868,6 @@
             <w:tcW w:w="3324" w:type="dxa"/>
           </w:tcPr>
           <w:p>
-            <w:pPr>
-              <w:bidi w:val="0"/>
-            </w:pPr>
             <w:r>
               <w:rPr>
                 <w:sz w:val="20"/>
@@ -4601,7 +3880,6 @@
     </w:tbl>
     <w:p>
       <w:pPr>
-        <w:bidi w:val="0"/>
         <w:spacing w:before="40" w:after="80" w:line="240" w:lineRule="auto"/>
       </w:pPr>
       <w:r>
@@ -4615,7 +3893,6 @@
     <w:p>
       <w:pPr>
         <w:pStyle w:val="Heading2"/>
-        <w:bidi w:val="0"/>
         <w:spacing w:after="160"/>
       </w:pPr>
       <w:r>
@@ -4647,9 +3924,6 @@
             <w:shd w:val="clear" w:color="auto" w:fill="EAF2FD"/>
           </w:tcPr>
           <w:p>
-            <w:pPr>
-              <w:bidi w:val="0"/>
-            </w:pPr>
             <w:r>
               <w:rPr>
                 <w:b/>
@@ -4665,9 +3939,6 @@
             <w:shd w:val="clear" w:color="auto" w:fill="EAF2FD"/>
           </w:tcPr>
           <w:p>
-            <w:pPr>
-              <w:bidi w:val="0"/>
-            </w:pPr>
             <w:r>
               <w:rPr>
                 <w:b/>
@@ -4683,9 +3954,6 @@
             <w:shd w:val="clear" w:color="auto" w:fill="EAF2FD"/>
           </w:tcPr>
           <w:p>
-            <w:pPr>
-              <w:bidi w:val="0"/>
-            </w:pPr>
             <w:r>
               <w:rPr>
                 <w:b/>
@@ -4705,9 +3973,6 @@
             <w:tcW w:w="3324" w:type="dxa"/>
           </w:tcPr>
           <w:p>
-            <w:pPr>
-              <w:bidi w:val="0"/>
-            </w:pPr>
             <w:r>
               <w:rPr>
                 <w:sz w:val="20"/>
@@ -4721,9 +3986,6 @@
             <w:tcW w:w="3324" w:type="dxa"/>
           </w:tcPr>
           <w:p>
-            <w:pPr>
-              <w:bidi w:val="0"/>
-            </w:pPr>
             <w:r>
               <w:rPr>
                 <w:sz w:val="20"/>
@@ -4737,9 +3999,6 @@
             <w:tcW w:w="3324" w:type="dxa"/>
           </w:tcPr>
           <w:p>
-            <w:pPr>
-              <w:bidi w:val="0"/>
-            </w:pPr>
             <w:r>
               <w:rPr>
                 <w:sz w:val="20"/>
@@ -4758,9 +4017,6 @@
             <w:tcW w:w="3324" w:type="dxa"/>
           </w:tcPr>
           <w:p>
-            <w:pPr>
-              <w:bidi w:val="0"/>
-            </w:pPr>
             <w:r>
               <w:rPr>
                 <w:sz w:val="20"/>
@@ -4774,9 +4030,6 @@
             <w:tcW w:w="3324" w:type="dxa"/>
           </w:tcPr>
           <w:p>
-            <w:pPr>
-              <w:bidi w:val="0"/>
-            </w:pPr>
             <w:r>
               <w:rPr>
                 <w:sz w:val="20"/>
@@ -4790,9 +4043,6 @@
             <w:tcW w:w="3324" w:type="dxa"/>
           </w:tcPr>
           <w:p>
-            <w:pPr>
-              <w:bidi w:val="0"/>
-            </w:pPr>
             <w:r>
               <w:rPr>
                 <w:sz w:val="20"/>
@@ -4811,9 +4061,6 @@
             <w:tcW w:w="3324" w:type="dxa"/>
           </w:tcPr>
           <w:p>
-            <w:pPr>
-              <w:bidi w:val="0"/>
-            </w:pPr>
             <w:r>
               <w:rPr>
                 <w:sz w:val="20"/>
@@ -4827,9 +4074,6 @@
             <w:tcW w:w="3324" w:type="dxa"/>
           </w:tcPr>
           <w:p>
-            <w:pPr>
-              <w:bidi w:val="0"/>
-            </w:pPr>
             <w:r>
               <w:rPr>
                 <w:sz w:val="20"/>
@@ -4843,9 +4087,6 @@
             <w:tcW w:w="3324" w:type="dxa"/>
           </w:tcPr>
           <w:p>
-            <w:pPr>
-              <w:bidi w:val="0"/>
-            </w:pPr>
             <w:r>
               <w:rPr>
                 <w:sz w:val="20"/>
@@ -4859,7 +4100,6 @@
     <w:p>
       <w:pPr>
         <w:pStyle w:val="Heading2"/>
-        <w:bidi w:val="0"/>
         <w:spacing w:after="160"/>
       </w:pPr>
       <w:r>
@@ -4892,9 +4132,6 @@
             <w:shd w:val="clear" w:color="auto" w:fill="EAF2FD"/>
           </w:tcPr>
           <w:p>
-            <w:pPr>
-              <w:bidi w:val="0"/>
-            </w:pPr>
             <w:r>
               <w:rPr>
                 <w:b/>
@@ -4910,9 +4147,6 @@
             <w:shd w:val="clear" w:color="auto" w:fill="EAF2FD"/>
           </w:tcPr>
           <w:p>
-            <w:pPr>
-              <w:bidi w:val="0"/>
-            </w:pPr>
             <w:r>
               <w:rPr>
                 <w:b/>
@@ -4928,9 +4162,6 @@
             <w:shd w:val="clear" w:color="auto" w:fill="EAF2FD"/>
           </w:tcPr>
           <w:p>
-            <w:pPr>
-              <w:bidi w:val="0"/>
-            </w:pPr>
             <w:r>
               <w:rPr>
                 <w:b/>
@@ -4950,9 +4181,6 @@
             <w:tcW w:w="3324" w:type="dxa"/>
           </w:tcPr>
           <w:p>
-            <w:pPr>
-              <w:bidi w:val="0"/>
-            </w:pPr>
             <w:r>
               <w:rPr>
                 <w:sz w:val="20"/>
@@ -4966,9 +4194,6 @@
             <w:tcW w:w="3324" w:type="dxa"/>
           </w:tcPr>
           <w:p>
-            <w:pPr>
-              <w:bidi w:val="0"/>
-            </w:pPr>
             <w:r>
               <w:rPr>
                 <w:sz w:val="20"/>
@@ -4982,9 +4207,6 @@
             <w:tcW w:w="3324" w:type="dxa"/>
           </w:tcPr>
           <w:p>
-            <w:pPr>
-              <w:bidi w:val="0"/>
-            </w:pPr>
             <w:r>
               <w:rPr>
                 <w:sz w:val="20"/>
@@ -5003,9 +4225,6 @@
             <w:tcW w:w="3324" w:type="dxa"/>
           </w:tcPr>
           <w:p>
-            <w:pPr>
-              <w:bidi w:val="0"/>
-            </w:pPr>
             <w:r>
               <w:rPr>
                 <w:sz w:val="20"/>
@@ -5019,9 +4238,6 @@
             <w:tcW w:w="3324" w:type="dxa"/>
           </w:tcPr>
           <w:p>
-            <w:pPr>
-              <w:bidi w:val="0"/>
-            </w:pPr>
             <w:r>
               <w:rPr>
                 <w:sz w:val="20"/>
@@ -5035,9 +4251,6 @@
             <w:tcW w:w="3324" w:type="dxa"/>
           </w:tcPr>
           <w:p>
-            <w:pPr>
-              <w:bidi w:val="0"/>
-            </w:pPr>
             <w:r>
               <w:rPr>
                 <w:sz w:val="20"/>
@@ -5056,9 +4269,6 @@
             <w:tcW w:w="3324" w:type="dxa"/>
           </w:tcPr>
           <w:p>
-            <w:pPr>
-              <w:bidi w:val="0"/>
-            </w:pPr>
             <w:r>
               <w:rPr>
                 <w:sz w:val="20"/>
@@ -5072,9 +4282,6 @@
             <w:tcW w:w="3324" w:type="dxa"/>
           </w:tcPr>
           <w:p>
-            <w:pPr>
-              <w:bidi w:val="0"/>
-            </w:pPr>
             <w:r>
               <w:rPr>
                 <w:sz w:val="20"/>
@@ -5088,9 +4295,6 @@
             <w:tcW w:w="3324" w:type="dxa"/>
           </w:tcPr>
           <w:p>
-            <w:pPr>
-              <w:bidi w:val="0"/>
-            </w:pPr>
             <w:r>
               <w:rPr>
                 <w:sz w:val="20"/>
@@ -5103,7 +4307,6 @@
     </w:tbl>
     <w:p>
       <w:pPr>
-        <w:bidi w:val="0"/>
         <w:spacing w:before="40" w:after="80" w:line="240" w:lineRule="auto"/>
       </w:pPr>
       <w:r>
@@ -5115,9 +4318,6 @@
       </w:r>
     </w:p>
     <w:p>
-      <w:pPr>
-        <w:bidi w:val="0"/>
-      </w:pPr>
       <w:r>
         <w:br w:type="page"/>
       </w:r>
@@ -5125,14 +4325,12 @@
     <w:p>
       <w:pPr>
         <w:pStyle w:val="Heading1"/>
-        <w:bidi w:val="0"/>
         <w:spacing w:before="280" w:after="160"/>
       </w:pPr>
       <w:r>
         <w:rPr>
           <w:rFonts w:ascii="Arial" w:hAnsi="Arial"/>
         </w:rPr>
-        <w:lastRenderedPageBreak/>
         <w:t>חישוב ציון סופי</w:t>
       </w:r>
     </w:p>
@@ -5158,9 +4356,6 @@
             <w:shd w:val="clear" w:color="auto" w:fill="EAF2FD"/>
           </w:tcPr>
           <w:p>
-            <w:pPr>
-              <w:bidi w:val="0"/>
-            </w:pPr>
             <w:r>
               <w:rPr>
                 <w:b/>
@@ -5176,9 +4371,6 @@
             <w:shd w:val="clear" w:color="auto" w:fill="EAF2FD"/>
           </w:tcPr>
           <w:p>
-            <w:pPr>
-              <w:bidi w:val="0"/>
-            </w:pPr>
             <w:r>
               <w:rPr>
                 <w:b/>
@@ -5194,9 +4386,6 @@
             <w:shd w:val="clear" w:color="auto" w:fill="EAF2FD"/>
           </w:tcPr>
           <w:p>
-            <w:pPr>
-              <w:bidi w:val="0"/>
-            </w:pPr>
             <w:r>
               <w:rPr>
                 <w:b/>
@@ -5216,9 +4405,6 @@
             <w:tcW w:w="3324" w:type="dxa"/>
           </w:tcPr>
           <w:p>
-            <w:pPr>
-              <w:bidi w:val="0"/>
-            </w:pPr>
             <w:r>
               <w:rPr>
                 <w:sz w:val="20"/>
@@ -5232,9 +4418,6 @@
             <w:tcW w:w="3324" w:type="dxa"/>
           </w:tcPr>
           <w:p>
-            <w:pPr>
-              <w:bidi w:val="0"/>
-            </w:pPr>
             <w:r>
               <w:rPr>
                 <w:sz w:val="20"/>
@@ -5248,9 +4431,6 @@
             <w:tcW w:w="3324" w:type="dxa"/>
           </w:tcPr>
           <w:p>
-            <w:pPr>
-              <w:bidi w:val="0"/>
-            </w:pPr>
             <w:r>
               <w:rPr>
                 <w:sz w:val="20"/>
@@ -5269,9 +4449,6 @@
             <w:tcW w:w="3324" w:type="dxa"/>
           </w:tcPr>
           <w:p>
-            <w:pPr>
-              <w:bidi w:val="0"/>
-            </w:pPr>
             <w:r>
               <w:rPr>
                 <w:sz w:val="20"/>
@@ -5285,9 +4462,6 @@
             <w:tcW w:w="3324" w:type="dxa"/>
           </w:tcPr>
           <w:p>
-            <w:pPr>
-              <w:bidi w:val="0"/>
-            </w:pPr>
             <w:r>
               <w:rPr>
                 <w:sz w:val="20"/>
@@ -5301,9 +4475,6 @@
             <w:tcW w:w="3324" w:type="dxa"/>
           </w:tcPr>
           <w:p>
-            <w:pPr>
-              <w:bidi w:val="0"/>
-            </w:pPr>
             <w:r>
               <w:rPr>
                 <w:sz w:val="20"/>
@@ -5322,9 +4493,6 @@
             <w:tcW w:w="3324" w:type="dxa"/>
           </w:tcPr>
           <w:p>
-            <w:pPr>
-              <w:bidi w:val="0"/>
-            </w:pPr>
             <w:r>
               <w:rPr>
                 <w:sz w:val="20"/>
@@ -5338,9 +4506,6 @@
             <w:tcW w:w="3324" w:type="dxa"/>
           </w:tcPr>
           <w:p>
-            <w:pPr>
-              <w:bidi w:val="0"/>
-            </w:pPr>
             <w:r>
               <w:rPr>
                 <w:sz w:val="20"/>
@@ -5354,9 +4519,6 @@
             <w:tcW w:w="3324" w:type="dxa"/>
           </w:tcPr>
           <w:p>
-            <w:pPr>
-              <w:bidi w:val="0"/>
-            </w:pPr>
             <w:r>
               <w:rPr>
                 <w:sz w:val="20"/>
@@ -5375,9 +4537,6 @@
             <w:tcW w:w="3324" w:type="dxa"/>
           </w:tcPr>
           <w:p>
-            <w:pPr>
-              <w:bidi w:val="0"/>
-            </w:pPr>
             <w:r>
               <w:rPr>
                 <w:sz w:val="20"/>
@@ -5391,9 +4550,6 @@
             <w:tcW w:w="3324" w:type="dxa"/>
           </w:tcPr>
           <w:p>
-            <w:pPr>
-              <w:bidi w:val="0"/>
-            </w:pPr>
             <w:r>
               <w:rPr>
                 <w:sz w:val="20"/>
@@ -5407,9 +4563,6 @@
             <w:tcW w:w="3324" w:type="dxa"/>
           </w:tcPr>
           <w:p>
-            <w:pPr>
-              <w:bidi w:val="0"/>
-            </w:pPr>
             <w:r>
               <w:rPr>
                 <w:sz w:val="20"/>
@@ -5428,9 +4581,6 @@
             <w:tcW w:w="3324" w:type="dxa"/>
           </w:tcPr>
           <w:p>
-            <w:pPr>
-              <w:bidi w:val="0"/>
-            </w:pPr>
             <w:r>
               <w:rPr>
                 <w:sz w:val="20"/>
@@ -5444,9 +4594,6 @@
             <w:tcW w:w="3324" w:type="dxa"/>
           </w:tcPr>
           <w:p>
-            <w:pPr>
-              <w:bidi w:val="0"/>
-            </w:pPr>
             <w:r>
               <w:rPr>
                 <w:sz w:val="20"/>
@@ -5460,9 +4607,6 @@
             <w:tcW w:w="3324" w:type="dxa"/>
           </w:tcPr>
           <w:p>
-            <w:pPr>
-              <w:bidi w:val="0"/>
-            </w:pPr>
             <w:r>
               <w:rPr>
                 <w:sz w:val="20"/>
@@ -5481,9 +4625,6 @@
             <w:tcW w:w="3324" w:type="dxa"/>
           </w:tcPr>
           <w:p>
-            <w:pPr>
-              <w:bidi w:val="0"/>
-            </w:pPr>
             <w:r>
               <w:rPr>
                 <w:sz w:val="20"/>
@@ -5497,9 +4638,6 @@
             <w:tcW w:w="3324" w:type="dxa"/>
           </w:tcPr>
           <w:p>
-            <w:pPr>
-              <w:bidi w:val="0"/>
-            </w:pPr>
             <w:r>
               <w:rPr>
                 <w:sz w:val="20"/>
@@ -5513,9 +4651,6 @@
             <w:tcW w:w="3324" w:type="dxa"/>
           </w:tcPr>
           <w:p>
-            <w:pPr>
-              <w:bidi w:val="0"/>
-            </w:pPr>
             <w:r>
               <w:rPr>
                 <w:sz w:val="20"/>
@@ -5534,9 +4669,6 @@
             <w:tcW w:w="3324" w:type="dxa"/>
           </w:tcPr>
           <w:p>
-            <w:pPr>
-              <w:bidi w:val="0"/>
-            </w:pPr>
             <w:r>
               <w:rPr>
                 <w:sz w:val="20"/>
@@ -5550,9 +4682,6 @@
             <w:tcW w:w="3324" w:type="dxa"/>
           </w:tcPr>
           <w:p>
-            <w:pPr>
-              <w:bidi w:val="0"/>
-            </w:pPr>
             <w:r>
               <w:rPr>
                 <w:sz w:val="20"/>
@@ -5566,9 +4695,6 @@
             <w:tcW w:w="3324" w:type="dxa"/>
           </w:tcPr>
           <w:p>
-            <w:pPr>
-              <w:bidi w:val="0"/>
-            </w:pPr>
             <w:r>
               <w:rPr>
                 <w:sz w:val="20"/>
@@ -5587,9 +4713,6 @@
             <w:tcW w:w="3324" w:type="dxa"/>
           </w:tcPr>
           <w:p>
-            <w:pPr>
-              <w:bidi w:val="0"/>
-            </w:pPr>
             <w:r>
               <w:rPr>
                 <w:sz w:val="20"/>
@@ -5603,9 +4726,6 @@
             <w:tcW w:w="3324" w:type="dxa"/>
           </w:tcPr>
           <w:p>
-            <w:pPr>
-              <w:bidi w:val="0"/>
-            </w:pPr>
             <w:r>
               <w:rPr>
                 <w:sz w:val="20"/>
@@ -5619,9 +4739,6 @@
             <w:tcW w:w="3324" w:type="dxa"/>
           </w:tcPr>
           <w:p>
-            <w:pPr>
-              <w:bidi w:val="0"/>
-            </w:pPr>
             <w:r>
               <w:rPr>
                 <w:sz w:val="20"/>
@@ -5640,9 +4757,6 @@
             <w:tcW w:w="3324" w:type="dxa"/>
           </w:tcPr>
           <w:p>
-            <w:pPr>
-              <w:bidi w:val="0"/>
-            </w:pPr>
             <w:r>
               <w:rPr>
                 <w:sz w:val="20"/>
@@ -5656,9 +4770,6 @@
             <w:tcW w:w="3324" w:type="dxa"/>
           </w:tcPr>
           <w:p>
-            <w:pPr>
-              <w:bidi w:val="0"/>
-            </w:pPr>
             <w:r>
               <w:rPr>
                 <w:sz w:val="20"/>
@@ -5672,9 +4783,6 @@
             <w:tcW w:w="3324" w:type="dxa"/>
           </w:tcPr>
           <w:p>
-            <w:pPr>
-              <w:bidi w:val="0"/>
-            </w:pPr>
             <w:r>
               <w:rPr>
                 <w:sz w:val="20"/>
@@ -5693,9 +4801,6 @@
             <w:tcW w:w="3324" w:type="dxa"/>
           </w:tcPr>
           <w:p>
-            <w:pPr>
-              <w:bidi w:val="0"/>
-            </w:pPr>
             <w:r>
               <w:rPr>
                 <w:sz w:val="20"/>
@@ -5709,9 +4814,6 @@
             <w:tcW w:w="3324" w:type="dxa"/>
           </w:tcPr>
           <w:p>
-            <w:pPr>
-              <w:bidi w:val="0"/>
-            </w:pPr>
             <w:r>
               <w:rPr>
                 <w:sz w:val="20"/>
@@ -5725,9 +4827,6 @@
             <w:tcW w:w="3324" w:type="dxa"/>
           </w:tcPr>
           <w:p>
-            <w:pPr>
-              <w:bidi w:val="0"/>
-            </w:pPr>
             <w:r>
               <w:rPr>
                 <w:sz w:val="20"/>
@@ -5746,9 +4845,6 @@
             <w:tcW w:w="3324" w:type="dxa"/>
           </w:tcPr>
           <w:p>
-            <w:pPr>
-              <w:bidi w:val="0"/>
-            </w:pPr>
             <w:r>
               <w:rPr>
                 <w:sz w:val="20"/>
@@ -5762,9 +4858,6 @@
             <w:tcW w:w="3324" w:type="dxa"/>
           </w:tcPr>
           <w:p>
-            <w:pPr>
-              <w:bidi w:val="0"/>
-            </w:pPr>
             <w:r>
               <w:rPr>
                 <w:sz w:val="20"/>
@@ -5778,9 +4871,6 @@
             <w:tcW w:w="3324" w:type="dxa"/>
           </w:tcPr>
           <w:p>
-            <w:pPr>
-              <w:bidi w:val="0"/>
-            </w:pPr>
             <w:r>
               <w:rPr>
                 <w:sz w:val="20"/>
@@ -5799,9 +4889,6 @@
             <w:tcW w:w="3324" w:type="dxa"/>
           </w:tcPr>
           <w:p>
-            <w:pPr>
-              <w:bidi w:val="0"/>
-            </w:pPr>
             <w:r>
               <w:rPr>
                 <w:sz w:val="20"/>
@@ -5815,9 +4902,6 @@
             <w:tcW w:w="3324" w:type="dxa"/>
           </w:tcPr>
           <w:p>
-            <w:pPr>
-              <w:bidi w:val="0"/>
-            </w:pPr>
             <w:r>
               <w:rPr>
                 <w:sz w:val="20"/>
@@ -5831,9 +4915,6 @@
             <w:tcW w:w="3324" w:type="dxa"/>
           </w:tcPr>
           <w:p>
-            <w:pPr>
-              <w:bidi w:val="0"/>
-            </w:pPr>
             <w:r>
               <w:rPr>
                 <w:sz w:val="20"/>
@@ -5845,9 +4926,6 @@
       </w:tr>
     </w:tbl>
     <w:p>
-      <w:pPr>
-        <w:bidi w:val="0"/>
-      </w:pPr>
       <w:r>
         <w:br w:type="page"/>
       </w:r>
@@ -5855,14 +4933,12 @@
     <w:p>
       <w:pPr>
         <w:pStyle w:val="Heading1"/>
-        <w:bidi w:val="0"/>
         <w:spacing w:before="280" w:after="160"/>
       </w:pPr>
       <w:r>
         <w:rPr>
           <w:rFonts w:ascii="Arial" w:hAnsi="Arial"/>
         </w:rPr>
-        <w:lastRenderedPageBreak/>
         <w:t>חלק ב' (אחר) — מחוון לבדיקת הפרויקט בזמן הבחינה</w:t>
       </w:r>
     </w:p>
@@ -5875,7 +4951,6 @@
           <w:right w:val="single" w:sz="18" w:space="4" w:color="F5A623"/>
         </w:pBdr>
         <w:shd w:val="clear" w:color="auto" w:fill="FFF8E1"/>
-        <w:bidi w:val="0"/>
         <w:spacing w:before="80" w:after="80" w:line="240" w:lineRule="auto"/>
         <w:ind w:left="170" w:right="170"/>
       </w:pPr>
@@ -5911,9 +4986,6 @@
             <w:shd w:val="clear" w:color="auto" w:fill="EAF2FD"/>
           </w:tcPr>
           <w:p>
-            <w:pPr>
-              <w:bidi w:val="0"/>
-            </w:pPr>
             <w:r>
               <w:rPr>
                 <w:b/>
@@ -5929,9 +5001,6 @@
             <w:shd w:val="clear" w:color="auto" w:fill="EAF2FD"/>
           </w:tcPr>
           <w:p>
-            <w:pPr>
-              <w:bidi w:val="0"/>
-            </w:pPr>
             <w:r>
               <w:rPr>
                 <w:b/>
@@ -5947,9 +5016,6 @@
             <w:shd w:val="clear" w:color="auto" w:fill="EAF2FD"/>
           </w:tcPr>
           <w:p>
-            <w:pPr>
-              <w:bidi w:val="0"/>
-            </w:pPr>
             <w:r>
               <w:rPr>
                 <w:b/>
@@ -5965,9 +5031,6 @@
             <w:shd w:val="clear" w:color="auto" w:fill="EAF2FD"/>
           </w:tcPr>
           <w:p>
-            <w:pPr>
-              <w:bidi w:val="0"/>
-            </w:pPr>
             <w:r>
               <w:rPr>
                 <w:b/>
@@ -5983,9 +5046,6 @@
             <w:shd w:val="clear" w:color="auto" w:fill="EAF2FD"/>
           </w:tcPr>
           <w:p>
-            <w:pPr>
-              <w:bidi w:val="0"/>
-            </w:pPr>
             <w:r>
               <w:rPr>
                 <w:b/>
@@ -6005,9 +5065,6 @@
             <w:tcW w:w="1994" w:type="dxa"/>
           </w:tcPr>
           <w:p>
-            <w:pPr>
-              <w:bidi w:val="0"/>
-            </w:pPr>
             <w:r>
               <w:rPr>
                 <w:sz w:val="20"/>
@@ -6021,9 +5078,6 @@
             <w:tcW w:w="1994" w:type="dxa"/>
           </w:tcPr>
           <w:p>
-            <w:pPr>
-              <w:bidi w:val="0"/>
-            </w:pPr>
             <w:r>
               <w:rPr>
                 <w:sz w:val="20"/>
@@ -6037,9 +5091,6 @@
             <w:tcW w:w="1994" w:type="dxa"/>
           </w:tcPr>
           <w:p>
-            <w:pPr>
-              <w:bidi w:val="0"/>
-            </w:pPr>
             <w:r>
               <w:rPr>
                 <w:sz w:val="20"/>
@@ -6053,9 +5104,6 @@
             <w:tcW w:w="1994" w:type="dxa"/>
           </w:tcPr>
           <w:p>
-            <w:pPr>
-              <w:bidi w:val="0"/>
-            </w:pPr>
             <w:r>
               <w:rPr>
                 <w:sz w:val="20"/>
@@ -6069,9 +5117,6 @@
             <w:tcW w:w="1994" w:type="dxa"/>
           </w:tcPr>
           <w:p>
-            <w:pPr>
-              <w:bidi w:val="0"/>
-            </w:pPr>
             <w:r>
               <w:rPr>
                 <w:sz w:val="20"/>
@@ -6090,9 +5135,6 @@
             <w:tcW w:w="1994" w:type="dxa"/>
           </w:tcPr>
           <w:p>
-            <w:pPr>
-              <w:bidi w:val="0"/>
-            </w:pPr>
             <w:r>
               <w:rPr>
                 <w:sz w:val="20"/>
@@ -6106,9 +5148,6 @@
             <w:tcW w:w="1994" w:type="dxa"/>
           </w:tcPr>
           <w:p>
-            <w:pPr>
-              <w:bidi w:val="0"/>
-            </w:pPr>
             <w:r>
               <w:rPr>
                 <w:sz w:val="20"/>
@@ -6122,9 +5161,6 @@
             <w:tcW w:w="1994" w:type="dxa"/>
           </w:tcPr>
           <w:p>
-            <w:pPr>
-              <w:bidi w:val="0"/>
-            </w:pPr>
             <w:r>
               <w:rPr>
                 <w:sz w:val="20"/>
@@ -6138,9 +5174,6 @@
             <w:tcW w:w="1994" w:type="dxa"/>
           </w:tcPr>
           <w:p>
-            <w:pPr>
-              <w:bidi w:val="0"/>
-            </w:pPr>
             <w:r>
               <w:rPr>
                 <w:sz w:val="20"/>
@@ -6154,9 +5187,6 @@
             <w:tcW w:w="1994" w:type="dxa"/>
           </w:tcPr>
           <w:p>
-            <w:pPr>
-              <w:bidi w:val="0"/>
-            </w:pPr>
             <w:r>
               <w:rPr>
                 <w:sz w:val="20"/>
@@ -6175,9 +5205,6 @@
             <w:tcW w:w="1994" w:type="dxa"/>
           </w:tcPr>
           <w:p>
-            <w:pPr>
-              <w:bidi w:val="0"/>
-            </w:pPr>
             <w:r>
               <w:rPr>
                 <w:sz w:val="20"/>
@@ -6191,9 +5218,6 @@
             <w:tcW w:w="1994" w:type="dxa"/>
           </w:tcPr>
           <w:p>
-            <w:pPr>
-              <w:bidi w:val="0"/>
-            </w:pPr>
             <w:r>
               <w:rPr>
                 <w:sz w:val="20"/>
@@ -6207,9 +5231,6 @@
             <w:tcW w:w="1994" w:type="dxa"/>
           </w:tcPr>
           <w:p>
-            <w:pPr>
-              <w:bidi w:val="0"/>
-            </w:pPr>
             <w:r>
               <w:rPr>
                 <w:sz w:val="20"/>
@@ -6223,9 +5244,6 @@
             <w:tcW w:w="1994" w:type="dxa"/>
           </w:tcPr>
           <w:p>
-            <w:pPr>
-              <w:bidi w:val="0"/>
-            </w:pPr>
             <w:r>
               <w:rPr>
                 <w:sz w:val="20"/>
@@ -6239,9 +5257,6 @@
             <w:tcW w:w="1994" w:type="dxa"/>
           </w:tcPr>
           <w:p>
-            <w:pPr>
-              <w:bidi w:val="0"/>
-            </w:pPr>
             <w:r>
               <w:rPr>
                 <w:sz w:val="20"/>
@@ -6260,9 +5275,6 @@
             <w:tcW w:w="1994" w:type="dxa"/>
           </w:tcPr>
           <w:p>
-            <w:pPr>
-              <w:bidi w:val="0"/>
-            </w:pPr>
             <w:r>
               <w:rPr>
                 <w:sz w:val="20"/>
@@ -6276,9 +5288,6 @@
             <w:tcW w:w="1994" w:type="dxa"/>
           </w:tcPr>
           <w:p>
-            <w:pPr>
-              <w:bidi w:val="0"/>
-            </w:pPr>
             <w:r>
               <w:rPr>
                 <w:sz w:val="20"/>
@@ -6292,9 +5301,6 @@
             <w:tcW w:w="1994" w:type="dxa"/>
           </w:tcPr>
           <w:p>
-            <w:pPr>
-              <w:bidi w:val="0"/>
-            </w:pPr>
             <w:r>
               <w:rPr>
                 <w:sz w:val="20"/>
@@ -6308,9 +5314,6 @@
             <w:tcW w:w="1994" w:type="dxa"/>
           </w:tcPr>
           <w:p>
-            <w:pPr>
-              <w:bidi w:val="0"/>
-            </w:pPr>
             <w:r>
               <w:rPr>
                 <w:sz w:val="20"/>
@@ -6324,9 +5327,6 @@
             <w:tcW w:w="1994" w:type="dxa"/>
           </w:tcPr>
           <w:p>
-            <w:pPr>
-              <w:bidi w:val="0"/>
-            </w:pPr>
             <w:r>
               <w:rPr>
                 <w:sz w:val="20"/>
@@ -6345,9 +5345,6 @@
             <w:tcW w:w="1994" w:type="dxa"/>
           </w:tcPr>
           <w:p>
-            <w:pPr>
-              <w:bidi w:val="0"/>
-            </w:pPr>
             <w:r>
               <w:rPr>
                 <w:sz w:val="20"/>
@@ -6361,9 +5358,6 @@
             <w:tcW w:w="1994" w:type="dxa"/>
           </w:tcPr>
           <w:p>
-            <w:pPr>
-              <w:bidi w:val="0"/>
-            </w:pPr>
             <w:r>
               <w:rPr>
                 <w:sz w:val="20"/>
@@ -6377,9 +5371,6 @@
             <w:tcW w:w="1994" w:type="dxa"/>
           </w:tcPr>
           <w:p>
-            <w:pPr>
-              <w:bidi w:val="0"/>
-            </w:pPr>
             <w:r>
               <w:rPr>
                 <w:sz w:val="20"/>
@@ -6393,9 +5384,6 @@
             <w:tcW w:w="1994" w:type="dxa"/>
           </w:tcPr>
           <w:p>
-            <w:pPr>
-              <w:bidi w:val="0"/>
-            </w:pPr>
             <w:r>
               <w:rPr>
                 <w:sz w:val="20"/>
@@ -6409,9 +5397,6 @@
             <w:tcW w:w="1994" w:type="dxa"/>
           </w:tcPr>
           <w:p>
-            <w:pPr>
-              <w:bidi w:val="0"/>
-            </w:pPr>
             <w:r>
               <w:rPr>
                 <w:sz w:val="20"/>
@@ -6424,7 +5409,6 @@
     </w:tbl>
     <w:p>
       <w:pPr>
-        <w:bidi w:val="0"/>
         <w:spacing w:before="40" w:after="80" w:line="240" w:lineRule="auto"/>
       </w:pPr>
       <w:r>
@@ -6436,9 +5420,6 @@
       </w:r>
     </w:p>
     <w:p>
-      <w:pPr>
-        <w:bidi w:val="0"/>
-      </w:pPr>
       <w:r>
         <w:br w:type="page"/>
       </w:r>
@@ -6446,21 +5427,18 @@
     <w:p>
       <w:pPr>
         <w:pStyle w:val="Heading1"/>
-        <w:bidi w:val="0"/>
         <w:spacing w:before="280" w:after="160"/>
       </w:pPr>
       <w:r>
         <w:rPr>
           <w:rFonts w:ascii="Arial" w:hAnsi="Arial"/>
         </w:rPr>
-        <w:lastRenderedPageBreak/>
         <w:t>הערות לבוחן — איך להריץ את הפרויקט</w:t>
       </w:r>
     </w:p>
     <w:p>
       <w:pPr>
         <w:pStyle w:val="ListBullet"/>
-        <w:bidi w:val="0"/>
         <w:spacing w:before="20" w:after="20" w:line="240" w:lineRule="auto"/>
       </w:pPr>
       <w:r>
@@ -6470,7 +5448,6 @@
     <w:p>
       <w:pPr>
         <w:pStyle w:val="ListBullet"/>
-        <w:bidi w:val="0"/>
         <w:spacing w:before="20" w:after="20" w:line="240" w:lineRule="auto"/>
       </w:pPr>
       <w:r>
@@ -6480,7 +5457,6 @@
     <w:p>
       <w:pPr>
         <w:pStyle w:val="ListBullet"/>
-        <w:bidi w:val="0"/>
         <w:spacing w:before="20" w:after="20" w:line="240" w:lineRule="auto"/>
       </w:pPr>
       <w:r>
@@ -6490,7 +5466,6 @@
     <w:p>
       <w:pPr>
         <w:pStyle w:val="ListBullet"/>
-        <w:bidi w:val="0"/>
         <w:spacing w:before="20" w:after="20" w:line="240" w:lineRule="auto"/>
       </w:pPr>
       <w:r>
@@ -6500,7 +5475,6 @@
     <w:p>
       <w:pPr>
         <w:pStyle w:val="ListBullet"/>
-        <w:bidi w:val="0"/>
         <w:spacing w:before="20" w:after="20" w:line="240" w:lineRule="auto"/>
       </w:pPr>
       <w:r>
@@ -6510,7 +5484,6 @@
     <w:p>
       <w:pPr>
         <w:pStyle w:val="Heading1"/>
-        <w:bidi w:val="0"/>
         <w:spacing w:before="280" w:after="160"/>
       </w:pPr>
       <w:r>
@@ -6522,7 +5495,6 @@
     </w:p>
     <w:p>
       <w:pPr>
-        <w:bidi w:val="0"/>
         <w:spacing w:before="40" w:after="80" w:line="240" w:lineRule="auto"/>
       </w:pPr>
       <w:r>
@@ -6532,7 +5504,6 @@
     <w:p>
       <w:pPr>
         <w:pStyle w:val="Heading2"/>
-        <w:bidi w:val="0"/>
         <w:spacing w:after="160"/>
       </w:pPr>
       <w:r>
@@ -6545,7 +5516,6 @@
     <w:p>
       <w:pPr>
         <w:pStyle w:val="ListBullet"/>
-        <w:bidi w:val="0"/>
         <w:spacing w:before="20" w:after="20" w:line="240" w:lineRule="auto"/>
       </w:pPr>
       <w:r>
@@ -6555,7 +5525,6 @@
     <w:p>
       <w:pPr>
         <w:pStyle w:val="ListBullet"/>
-        <w:bidi w:val="0"/>
         <w:spacing w:before="20" w:after="20" w:line="240" w:lineRule="auto"/>
       </w:pPr>
       <w:r>
@@ -6565,7 +5534,6 @@
     <w:p>
       <w:pPr>
         <w:pStyle w:val="ListBullet"/>
-        <w:bidi w:val="0"/>
         <w:spacing w:before="20" w:after="20" w:line="240" w:lineRule="auto"/>
       </w:pPr>
       <w:r>
@@ -6575,7 +5543,6 @@
     <w:p>
       <w:pPr>
         <w:pStyle w:val="ListBullet"/>
-        <w:bidi w:val="0"/>
         <w:spacing w:before="20" w:after="20" w:line="240" w:lineRule="auto"/>
       </w:pPr>
       <w:r>
@@ -6585,7 +5552,6 @@
     <w:p>
       <w:pPr>
         <w:pStyle w:val="ListBullet"/>
-        <w:bidi w:val="0"/>
         <w:spacing w:before="20" w:after="20" w:line="240" w:lineRule="auto"/>
       </w:pPr>
       <w:r>
@@ -6595,7 +5561,6 @@
     <w:p>
       <w:pPr>
         <w:pStyle w:val="ListBullet"/>
-        <w:bidi w:val="0"/>
         <w:spacing w:before="20" w:after="20" w:line="240" w:lineRule="auto"/>
       </w:pPr>
       <w:r>
@@ -6605,7 +5570,6 @@
     <w:p>
       <w:pPr>
         <w:pStyle w:val="ListBullet"/>
-        <w:bidi w:val="0"/>
         <w:spacing w:before="20" w:after="20" w:line="240" w:lineRule="auto"/>
       </w:pPr>
       <w:r>
@@ -6615,7 +5579,6 @@
     <w:p>
       <w:pPr>
         <w:pStyle w:val="ListBullet"/>
-        <w:bidi w:val="0"/>
         <w:spacing w:before="20" w:after="20" w:line="240" w:lineRule="auto"/>
       </w:pPr>
       <w:r>
@@ -6625,7 +5588,6 @@
     <w:p>
       <w:pPr>
         <w:pStyle w:val="ListBullet"/>
-        <w:bidi w:val="0"/>
         <w:spacing w:before="20" w:after="20" w:line="240" w:lineRule="auto"/>
       </w:pPr>
       <w:r>
@@ -6635,7 +5597,6 @@
     <w:p>
       <w:pPr>
         <w:pStyle w:val="ListBullet"/>
-        <w:bidi w:val="0"/>
         <w:spacing w:before="20" w:after="20" w:line="240" w:lineRule="auto"/>
       </w:pPr>
       <w:r>
@@ -6645,7 +5606,6 @@
     <w:p>
       <w:pPr>
         <w:pStyle w:val="ListBullet"/>
-        <w:bidi w:val="0"/>
         <w:spacing w:before="20" w:after="20" w:line="240" w:lineRule="auto"/>
       </w:pPr>
       <w:r>
@@ -6655,7 +5615,6 @@
     <w:p>
       <w:pPr>
         <w:pStyle w:val="ListBullet"/>
-        <w:bidi w:val="0"/>
         <w:spacing w:before="20" w:after="20" w:line="240" w:lineRule="auto"/>
       </w:pPr>
       <w:r>
@@ -6665,7 +5624,6 @@
     <w:p>
       <w:pPr>
         <w:pStyle w:val="Heading2"/>
-        <w:bidi w:val="0"/>
         <w:spacing w:after="160"/>
       </w:pPr>
       <w:r>
@@ -6684,7 +5642,6 @@
           <w:right w:val="single" w:sz="18" w:space="4" w:color="F5A623"/>
         </w:pBdr>
         <w:shd w:val="clear" w:color="auto" w:fill="FFF8E1"/>
-        <w:bidi w:val="0"/>
         <w:spacing w:before="80" w:after="80" w:line="240" w:lineRule="auto"/>
         <w:ind w:left="170" w:right="170"/>
       </w:pPr>
@@ -6705,7 +5662,6 @@
           <w:right w:val="single" w:sz="18" w:space="4" w:color="F5A623"/>
         </w:pBdr>
         <w:shd w:val="clear" w:color="auto" w:fill="FFF8E1"/>
-        <w:bidi w:val="0"/>
         <w:spacing w:before="80" w:after="80" w:line="240" w:lineRule="auto"/>
         <w:ind w:left="170" w:right="170"/>
       </w:pPr>
@@ -6726,7 +5682,6 @@
           <w:right w:val="single" w:sz="18" w:space="4" w:color="F5A623"/>
         </w:pBdr>
         <w:shd w:val="clear" w:color="auto" w:fill="FFF8E1"/>
-        <w:bidi w:val="0"/>
         <w:spacing w:before="80" w:after="80" w:line="240" w:lineRule="auto"/>
         <w:ind w:left="170" w:right="170"/>
       </w:pPr>
@@ -6923,31 +5878,31 @@
       </w:rPr>
     </w:lvl>
   </w:abstractNum>
-  <w:num w:numId="1" w16cid:durableId="160897759">
+  <w:num w:numId="1" w16cid:durableId="665668275">
     <w:abstractNumId w:val="8"/>
   </w:num>
-  <w:num w:numId="2" w16cid:durableId="59254967">
+  <w:num w:numId="2" w16cid:durableId="1003900004">
     <w:abstractNumId w:val="6"/>
   </w:num>
-  <w:num w:numId="3" w16cid:durableId="849223261">
+  <w:num w:numId="3" w16cid:durableId="1205752592">
     <w:abstractNumId w:val="5"/>
   </w:num>
-  <w:num w:numId="4" w16cid:durableId="1443644665">
+  <w:num w:numId="4" w16cid:durableId="1957253686">
     <w:abstractNumId w:val="4"/>
   </w:num>
-  <w:num w:numId="5" w16cid:durableId="685524340">
+  <w:num w:numId="5" w16cid:durableId="1736902129">
     <w:abstractNumId w:val="7"/>
   </w:num>
-  <w:num w:numId="6" w16cid:durableId="891770811">
+  <w:num w:numId="6" w16cid:durableId="371614454">
     <w:abstractNumId w:val="3"/>
   </w:num>
-  <w:num w:numId="7" w16cid:durableId="1883126743">
+  <w:num w:numId="7" w16cid:durableId="1110784911">
     <w:abstractNumId w:val="2"/>
   </w:num>
-  <w:num w:numId="8" w16cid:durableId="1154025524">
+  <w:num w:numId="8" w16cid:durableId="1228616467">
     <w:abstractNumId w:val="1"/>
   </w:num>
-  <w:num w:numId="9" w16cid:durableId="523783674">
+  <w:num w:numId="9" w16cid:durableId="1979796404">
     <w:abstractNumId w:val="0"/>
   </w:num>
 </w:numbering>

</xml_diff>

<commit_message>
Inline bullet glyph instead of List Bullet style for RTL fix
Co-authored-by: Cursor <cursoragent@cursor.com>
</commit_message>
<xml_diff>
--- a/מחוון-תיק-פרויקט.docx
+++ b/מחוון-תיק-פרויקט.docx
@@ -7630,7 +7630,6 @@
     </w:p>
     <w:p>
       <w:pPr>
-        <w:pStyle w:val="ListBullet"/>
         <w:bidi w:val="1"/>
         <w:spacing w:before="20" w:after="20" w:line="240" w:lineRule="auto"/>
         <w:jc w:val="right"/>
@@ -7643,12 +7642,11 @@
           <w:sz w:val="24"/>
           <w:rtl w:val="1"/>
         </w:rPr>
-        <w:t>קוד מקור: src/secure_chess/ (Python 3.11+, 16 מודולים)</w:t>
+        <w:t>●  קוד מקור: src/secure_chess/ (Python 3.11+, 16 מודולים)</w:t>
       </w:r>
     </w:p>
     <w:p>
       <w:pPr>
-        <w:pStyle w:val="ListBullet"/>
         <w:bidi w:val="1"/>
         <w:spacing w:before="20" w:after="20" w:line="240" w:lineRule="auto"/>
         <w:jc w:val="right"/>
@@ -7661,12 +7659,11 @@
           <w:sz w:val="24"/>
           <w:rtl w:val="1"/>
         </w:rPr>
-        <w:t>תלויות: pyproject.toml (bcrypt&gt;=4.1)</w:t>
+        <w:t>●  תלויות: pyproject.toml (bcrypt&gt;=4.1)</w:t>
       </w:r>
     </w:p>
     <w:p>
       <w:pPr>
-        <w:pStyle w:val="ListBullet"/>
         <w:bidi w:val="1"/>
         <w:spacing w:before="20" w:after="20" w:line="240" w:lineRule="auto"/>
         <w:jc w:val="right"/>
@@ -7679,12 +7676,11 @@
           <w:sz w:val="24"/>
           <w:rtl w:val="1"/>
         </w:rPr>
-        <w:t>הוכחת ריבוי שחקנים: הפעלת שרת + שני לקוחות מקבילים שמשחקים זה נגד זה</w:t>
+        <w:t>●  הוכחת ריבוי שחקנים: הפעלת שרת + שני לקוחות מקבילים שמשחקים זה נגד זה</w:t>
       </w:r>
     </w:p>
     <w:p>
       <w:pPr>
-        <w:pStyle w:val="ListBullet"/>
         <w:bidi w:val="1"/>
         <w:spacing w:before="20" w:after="20" w:line="240" w:lineRule="auto"/>
         <w:jc w:val="right"/>
@@ -7697,12 +7693,11 @@
           <w:sz w:val="24"/>
           <w:rtl w:val="1"/>
         </w:rPr>
-        <w:t>הוכחת AI (bonus): לקוח אחד בוחר 'Start AI Game' מה-Lobby</w:t>
+        <w:t>●  הוכחת AI (bonus): לקוח אחד בוחר 'Start AI Game' מה-Lobby</w:t>
       </w:r>
     </w:p>
     <w:p>
       <w:pPr>
-        <w:pStyle w:val="ListBullet"/>
         <w:bidi w:val="1"/>
         <w:spacing w:before="20" w:after="20" w:line="240" w:lineRule="auto"/>
         <w:jc w:val="right"/>
@@ -7715,7 +7710,7 @@
           <w:sz w:val="24"/>
           <w:rtl w:val="1"/>
         </w:rPr>
-        <w:t>הוכחת אטומיות אחסון: התבוננות ב-data/users.json אחרי register; אין plaintext</w:t>
+        <w:t>●  הוכחת אטומיות אחסון: התבוננות ב-data/users.json אחרי register; אין plaintext</w:t>
       </w:r>
     </w:p>
     <w:p>
@@ -7773,7 +7768,6 @@
     </w:p>
     <w:p>
       <w:pPr>
-        <w:pStyle w:val="ListBullet"/>
         <w:bidi w:val="1"/>
         <w:spacing w:before="20" w:after="20" w:line="240" w:lineRule="auto"/>
         <w:jc w:val="right"/>
@@ -7786,12 +7780,11 @@
           <w:sz w:val="24"/>
           <w:rtl w:val="1"/>
         </w:rPr>
-        <w:t>שער פתיחה עם כל השדות הנדרשים (סמל מוסד, ת"ז, ביה"ס, מורה, תאריך…)</w:t>
+        <w:t>●  שער פתיחה עם כל השדות הנדרשים (סמל מוסד, ת"ז, ביה"ס, מורה, תאריך…)</w:t>
       </w:r>
     </w:p>
     <w:p>
       <w:pPr>
-        <w:pStyle w:val="ListBullet"/>
         <w:bidi w:val="1"/>
         <w:spacing w:before="20" w:after="20" w:line="240" w:lineRule="auto"/>
         <w:jc w:val="right"/>
@@ -7804,12 +7797,11 @@
           <w:sz w:val="24"/>
           <w:rtl w:val="1"/>
         </w:rPr>
-        <w:t>תוכן עניינים מקושר ל-Heading 1/2/3 (לוחצים F9 ב-Word לעדכון)</w:t>
+        <w:t>●  תוכן עניינים מקושר ל-Heading 1/2/3 (לוחצים F9 ב-Word לעדכון)</w:t>
       </w:r>
     </w:p>
     <w:p>
       <w:pPr>
-        <w:pStyle w:val="ListBullet"/>
         <w:bidi w:val="1"/>
         <w:spacing w:before="20" w:after="20" w:line="240" w:lineRule="auto"/>
         <w:jc w:val="right"/>
@@ -7822,12 +7814,11 @@
           <w:sz w:val="24"/>
           <w:rtl w:val="1"/>
         </w:rPr>
-        <w:t>פרק 1 — מבוא: רעיון, מוטיבציה, ייזום, 9 דרישות פונקציונליות, 6 לא-פונקציונליות, לו"ז, 6 סיכונים</w:t>
+        <w:t>●  פרק 1 — מבוא: רעיון, מוטיבציה, ייזום, 9 דרישות פונקציונליות, 6 לא-פונקציונליות, לו"ז, 6 סיכונים</w:t>
       </w:r>
     </w:p>
     <w:p>
       <w:pPr>
-        <w:pStyle w:val="ListBullet"/>
         <w:bidi w:val="1"/>
         <w:spacing w:before="20" w:after="20" w:line="240" w:lineRule="auto"/>
         <w:jc w:val="right"/>
@@ -7840,12 +7831,11 @@
           <w:sz w:val="24"/>
           <w:rtl w:val="1"/>
         </w:rPr>
-        <w:t>פרק 2 — ניתוח: חוקי שחמט, מודל OSI, hash+bcrypt, threading + locks, atomic writes</w:t>
+        <w:t>●  פרק 2 — ניתוח: חוקי שחמט, מודל OSI, hash+bcrypt, threading + locks, atomic writes</w:t>
       </w:r>
     </w:p>
     <w:p>
       <w:pPr>
-        <w:pStyle w:val="ListBullet"/>
         <w:bidi w:val="1"/>
         <w:spacing w:before="20" w:after="20" w:line="240" w:lineRule="auto"/>
         <w:jc w:val="right"/>
@@ -7858,12 +7848,11 @@
           <w:sz w:val="24"/>
           <w:rtl w:val="1"/>
         </w:rPr>
-        <w:t>פרק 3 — ארכיטקטורה: תרשים בלוקים, 3 sequence diagrams, 16 מודולים, ניתוח 4 אלגוריתמים, state machine, מודל איומים תואם הנחיית המורה</w:t>
+        <w:t>●  פרק 3 — ארכיטקטורה: תרשים בלוקים, 3 sequence diagrams, 16 מודולים, ניתוח 4 אלגוריתמים, state machine, מודל איומים תואם הנחיית המורה</w:t>
       </w:r>
     </w:p>
     <w:p>
       <w:pPr>
-        <w:pStyle w:val="ListBullet"/>
         <w:bidi w:val="1"/>
         <w:spacing w:before="20" w:after="20" w:line="240" w:lineRule="auto"/>
         <w:jc w:val="right"/>
@@ -7876,12 +7865,11 @@
           <w:sz w:val="24"/>
           <w:rtl w:val="1"/>
         </w:rPr>
-        <w:t>פרק 4 — מימוש: 21 מחלקות אפליקטיביות, מבנה תיקיות, דפוס robustness 3 שכבות</w:t>
+        <w:t>●  פרק 4 — מימוש: 21 מחלקות אפליקטיביות, מבנה תיקיות, דפוס robustness 3 שכבות</w:t>
       </w:r>
     </w:p>
     <w:p>
       <w:pPr>
-        <w:pStyle w:val="ListBullet"/>
         <w:bidi w:val="1"/>
         <w:spacing w:before="20" w:after="20" w:line="240" w:lineRule="auto"/>
         <w:jc w:val="right"/>
@@ -7894,12 +7882,11 @@
           <w:sz w:val="24"/>
           <w:rtl w:val="1"/>
         </w:rPr>
-        <w:t>פרק 5 — מדריך משתמש: התקנה, הרצה, הנחיות ל-3 סוגי משתמשים, הוכחת bcrypt</w:t>
+        <w:t>●  פרק 5 — מדריך משתמש: התקנה, הרצה, הנחיות ל-3 סוגי משתמשים, הוכחת bcrypt</w:t>
       </w:r>
     </w:p>
     <w:p>
       <w:pPr>
-        <w:pStyle w:val="ListBullet"/>
         <w:bidi w:val="1"/>
         <w:spacing w:before="20" w:after="20" w:line="240" w:lineRule="auto"/>
         <w:jc w:val="right"/>
@@ -7912,12 +7899,11 @@
           <w:sz w:val="24"/>
           <w:rtl w:val="1"/>
         </w:rPr>
-        <w:t>פרק 6 — סיכום אישי: 10 לקחים מקצועיים + 6 דברים שהייתי משנה</w:t>
+        <w:t>●  פרק 6 — סיכום אישי: 10 לקחים מקצועיים + 6 דברים שהייתי משנה</w:t>
       </w:r>
     </w:p>
     <w:p>
       <w:pPr>
-        <w:pStyle w:val="ListBullet"/>
         <w:bidi w:val="1"/>
         <w:spacing w:before="20" w:after="20" w:line="240" w:lineRule="auto"/>
         <w:jc w:val="right"/>
@@ -7930,12 +7916,11 @@
           <w:sz w:val="24"/>
           <w:rtl w:val="1"/>
         </w:rPr>
-        <w:t>פרק 7 — ביבליוגרפיה: 8 מקורות עם הסבר תרומה (סקר ספרות אמיתי)</w:t>
+        <w:t>●  פרק 7 — ביבליוגרפיה: 8 מקורות עם הסבר תרומה (סקר ספרות אמיתי)</w:t>
       </w:r>
     </w:p>
     <w:p>
       <w:pPr>
-        <w:pStyle w:val="ListBullet"/>
         <w:bidi w:val="1"/>
         <w:spacing w:before="20" w:after="20" w:line="240" w:lineRule="auto"/>
         <w:jc w:val="right"/>
@@ -7948,12 +7933,11 @@
           <w:sz w:val="24"/>
           <w:rtl w:val="1"/>
         </w:rPr>
-        <w:t>נספח א' — תדפיס מלא של כל קוד המקור</w:t>
+        <w:t>●  נספח א' — תדפיס מלא של כל קוד המקור</w:t>
       </w:r>
     </w:p>
     <w:p>
       <w:pPr>
-        <w:pStyle w:val="ListBullet"/>
         <w:bidi w:val="1"/>
         <w:spacing w:before="20" w:after="20" w:line="240" w:lineRule="auto"/>
         <w:jc w:val="right"/>
@@ -7966,12 +7950,11 @@
           <w:sz w:val="24"/>
           <w:rtl w:val="1"/>
         </w:rPr>
-        <w:t>נספח ב' — טבלת הודעות הפרוטוקול המלאה (13 סוגים)</w:t>
+        <w:t>●  נספח ב' — טבלת הודעות הפרוטוקול המלאה (13 סוגים)</w:t>
       </w:r>
     </w:p>
     <w:p>
       <w:pPr>
-        <w:pStyle w:val="ListBullet"/>
         <w:bidi w:val="1"/>
         <w:spacing w:before="20" w:after="20" w:line="240" w:lineRule="auto"/>
         <w:jc w:val="right"/>
@@ -7984,7 +7967,7 @@
           <w:sz w:val="24"/>
           <w:rtl w:val="1"/>
         </w:rPr>
-        <w:t>נספח ג' — שאלות תיאורטיות לבחינה עם תשובות מוכנות</w:t>
+        <w:t>●  נספח ג' — שאלות תיאורטיות לבחינה עם תשובות מוכנות</w:t>
       </w:r>
     </w:p>
     <w:p>

</xml_diff>

<commit_message>
Force RTL+right alignment on body paragraphs, preserve LTR code blocks
Co-authored-by: Cursor <cursoragent@cursor.com>
</commit_message>
<xml_diff>
--- a/מחוון-תיק-פרויקט.docx
+++ b/מחוון-תיק-פרויקט.docx
@@ -4,6 +4,7 @@
   <w:body>
     <w:p>
       <w:pPr>
+        <w:bidi w:val="0"/>
         <w:spacing w:before="1200" w:after="80" w:line="240" w:lineRule="auto"/>
       </w:pPr>
     </w:p>
@@ -104,6 +105,9 @@
             <w:shd w:val="clear" w:color="auto" w:fill="EAF2FD"/>
           </w:tcPr>
           <w:p>
+            <w:pPr>
+              <w:bidi w:val="0"/>
+            </w:pPr>
             <w:r>
               <w:rPr>
                 <w:b/>
@@ -119,6 +123,9 @@
             <w:shd w:val="clear" w:color="auto" w:fill="EAF2FD"/>
           </w:tcPr>
           <w:p>
+            <w:pPr>
+              <w:bidi w:val="0"/>
+            </w:pPr>
             <w:r>
               <w:rPr>
                 <w:b/>
@@ -138,6 +145,9 @@
             <w:tcW w:w="3118" w:type="dxa"/>
           </w:tcPr>
           <w:p>
+            <w:pPr>
+              <w:bidi w:val="0"/>
+            </w:pPr>
             <w:r>
               <w:rPr>
                 <w:sz w:val="20"/>
@@ -151,6 +161,9 @@
             <w:tcW w:w="6236" w:type="dxa"/>
           </w:tcPr>
           <w:p>
+            <w:pPr>
+              <w:bidi w:val="0"/>
+            </w:pPr>
             <w:r>
               <w:rPr>
                 <w:sz w:val="20"/>
@@ -169,6 +182,9 @@
             <w:tcW w:w="3118" w:type="dxa"/>
           </w:tcPr>
           <w:p>
+            <w:pPr>
+              <w:bidi w:val="0"/>
+            </w:pPr>
             <w:r>
               <w:rPr>
                 <w:sz w:val="20"/>
@@ -182,6 +198,9 @@
             <w:tcW w:w="6236" w:type="dxa"/>
           </w:tcPr>
           <w:p>
+            <w:pPr>
+              <w:bidi w:val="0"/>
+            </w:pPr>
             <w:r>
               <w:rPr>
                 <w:sz w:val="20"/>
@@ -200,6 +219,9 @@
             <w:tcW w:w="3118" w:type="dxa"/>
           </w:tcPr>
           <w:p>
+            <w:pPr>
+              <w:bidi w:val="0"/>
+            </w:pPr>
             <w:r>
               <w:rPr>
                 <w:sz w:val="20"/>
@@ -213,6 +235,9 @@
             <w:tcW w:w="6236" w:type="dxa"/>
           </w:tcPr>
           <w:p>
+            <w:pPr>
+              <w:bidi w:val="0"/>
+            </w:pPr>
             <w:r>
               <w:rPr>
                 <w:sz w:val="20"/>
@@ -231,6 +256,9 @@
             <w:tcW w:w="3118" w:type="dxa"/>
           </w:tcPr>
           <w:p>
+            <w:pPr>
+              <w:bidi w:val="0"/>
+            </w:pPr>
             <w:r>
               <w:rPr>
                 <w:sz w:val="20"/>
@@ -244,6 +272,9 @@
             <w:tcW w:w="6236" w:type="dxa"/>
           </w:tcPr>
           <w:p>
+            <w:pPr>
+              <w:bidi w:val="0"/>
+            </w:pPr>
             <w:r>
               <w:rPr>
                 <w:sz w:val="20"/>
@@ -262,6 +293,9 @@
             <w:tcW w:w="3118" w:type="dxa"/>
           </w:tcPr>
           <w:p>
+            <w:pPr>
+              <w:bidi w:val="0"/>
+            </w:pPr>
             <w:r>
               <w:rPr>
                 <w:sz w:val="20"/>
@@ -275,6 +309,9 @@
             <w:tcW w:w="6236" w:type="dxa"/>
           </w:tcPr>
           <w:p>
+            <w:pPr>
+              <w:bidi w:val="0"/>
+            </w:pPr>
             <w:r>
               <w:rPr>
                 <w:sz w:val="20"/>
@@ -293,6 +330,9 @@
             <w:tcW w:w="3118" w:type="dxa"/>
           </w:tcPr>
           <w:p>
+            <w:pPr>
+              <w:bidi w:val="0"/>
+            </w:pPr>
             <w:r>
               <w:rPr>
                 <w:sz w:val="20"/>
@@ -306,6 +346,9 @@
             <w:tcW w:w="6236" w:type="dxa"/>
           </w:tcPr>
           <w:p>
+            <w:pPr>
+              <w:bidi w:val="0"/>
+            </w:pPr>
             <w:r>
               <w:rPr>
                 <w:sz w:val="20"/>
@@ -324,6 +367,9 @@
             <w:tcW w:w="3118" w:type="dxa"/>
           </w:tcPr>
           <w:p>
+            <w:pPr>
+              <w:bidi w:val="0"/>
+            </w:pPr>
             <w:r>
               <w:rPr>
                 <w:sz w:val="20"/>
@@ -337,6 +383,9 @@
             <w:tcW w:w="6236" w:type="dxa"/>
           </w:tcPr>
           <w:p>
+            <w:pPr>
+              <w:bidi w:val="0"/>
+            </w:pPr>
             <w:r>
               <w:rPr>
                 <w:sz w:val="20"/>
@@ -348,6 +397,9 @@
       </w:tr>
     </w:tbl>
     <w:p>
+      <w:pPr>
+        <w:bidi w:val="0"/>
+      </w:pPr>
       <w:r>
         <w:br w:type="page"/>
       </w:r>
@@ -375,6 +427,7 @@
           <w:right w:val="single" w:sz="18" w:space="4" w:color="F5A623"/>
         </w:pBdr>
         <w:shd w:val="clear" w:color="auto" w:fill="FFF8E1"/>
+        <w:bidi w:val="0"/>
         <w:spacing w:before="80" w:after="80" w:line="240" w:lineRule="auto"/>
         <w:ind w:left="170" w:right="170"/>
       </w:pPr>
@@ -394,11 +447,11 @@
         <w:tblLook w:val="04A0" w:firstRow="1" w:lastRow="0" w:firstColumn="1" w:lastColumn="0" w:noHBand="0" w:noVBand="1"/>
       </w:tblPr>
       <w:tblGrid>
-        <w:gridCol w:w="1338"/>
-        <w:gridCol w:w="1639"/>
-        <w:gridCol w:w="1704"/>
-        <w:gridCol w:w="1476"/>
-        <w:gridCol w:w="4031"/>
+        <w:gridCol w:w="1316"/>
+        <w:gridCol w:w="1627"/>
+        <w:gridCol w:w="1694"/>
+        <w:gridCol w:w="1459"/>
+        <w:gridCol w:w="4092"/>
       </w:tblGrid>
       <w:tr>
         <w:trPr>
@@ -410,6 +463,9 @@
             <w:shd w:val="clear" w:color="auto" w:fill="EAF2FD"/>
           </w:tcPr>
           <w:p>
+            <w:pPr>
+              <w:bidi w:val="0"/>
+            </w:pPr>
             <w:r>
               <w:rPr>
                 <w:b/>
@@ -425,6 +481,9 @@
             <w:shd w:val="clear" w:color="auto" w:fill="EAF2FD"/>
           </w:tcPr>
           <w:p>
+            <w:pPr>
+              <w:bidi w:val="0"/>
+            </w:pPr>
             <w:r>
               <w:rPr>
                 <w:b/>
@@ -440,6 +499,9 @@
             <w:shd w:val="clear" w:color="auto" w:fill="EAF2FD"/>
           </w:tcPr>
           <w:p>
+            <w:pPr>
+              <w:bidi w:val="0"/>
+            </w:pPr>
             <w:r>
               <w:rPr>
                 <w:b/>
@@ -455,6 +517,9 @@
             <w:shd w:val="clear" w:color="auto" w:fill="EAF2FD"/>
           </w:tcPr>
           <w:p>
+            <w:pPr>
+              <w:bidi w:val="0"/>
+            </w:pPr>
             <w:r>
               <w:rPr>
                 <w:b/>
@@ -470,6 +535,9 @@
             <w:shd w:val="clear" w:color="auto" w:fill="EAF2FD"/>
           </w:tcPr>
           <w:p>
+            <w:pPr>
+              <w:bidi w:val="0"/>
+            </w:pPr>
             <w:r>
               <w:rPr>
                 <w:b/>
@@ -489,6 +557,9 @@
             <w:tcW w:w="1994" w:type="dxa"/>
           </w:tcPr>
           <w:p>
+            <w:pPr>
+              <w:bidi w:val="0"/>
+            </w:pPr>
             <w:r>
               <w:rPr>
                 <w:sz w:val="20"/>
@@ -502,6 +573,9 @@
             <w:tcW w:w="1994" w:type="dxa"/>
           </w:tcPr>
           <w:p>
+            <w:pPr>
+              <w:bidi w:val="0"/>
+            </w:pPr>
             <w:r>
               <w:rPr>
                 <w:sz w:val="20"/>
@@ -515,6 +589,9 @@
             <w:tcW w:w="1994" w:type="dxa"/>
           </w:tcPr>
           <w:p>
+            <w:pPr>
+              <w:bidi w:val="0"/>
+            </w:pPr>
             <w:r>
               <w:rPr>
                 <w:sz w:val="20"/>
@@ -528,6 +605,9 @@
             <w:tcW w:w="1994" w:type="dxa"/>
           </w:tcPr>
           <w:p>
+            <w:pPr>
+              <w:bidi w:val="0"/>
+            </w:pPr>
             <w:r>
               <w:rPr>
                 <w:sz w:val="20"/>
@@ -541,6 +621,9 @@
             <w:tcW w:w="1994" w:type="dxa"/>
           </w:tcPr>
           <w:p>
+            <w:pPr>
+              <w:bidi w:val="0"/>
+            </w:pPr>
             <w:r>
               <w:rPr>
                 <w:sz w:val="20"/>
@@ -559,6 +642,9 @@
             <w:tcW w:w="1994" w:type="dxa"/>
           </w:tcPr>
           <w:p>
+            <w:pPr>
+              <w:bidi w:val="0"/>
+            </w:pPr>
             <w:r>
               <w:rPr>
                 <w:sz w:val="20"/>
@@ -572,6 +658,9 @@
             <w:tcW w:w="1994" w:type="dxa"/>
           </w:tcPr>
           <w:p>
+            <w:pPr>
+              <w:bidi w:val="0"/>
+            </w:pPr>
             <w:r>
               <w:rPr>
                 <w:sz w:val="20"/>
@@ -585,6 +674,9 @@
             <w:tcW w:w="1994" w:type="dxa"/>
           </w:tcPr>
           <w:p>
+            <w:pPr>
+              <w:bidi w:val="0"/>
+            </w:pPr>
             <w:r>
               <w:rPr>
                 <w:sz w:val="20"/>
@@ -598,6 +690,9 @@
             <w:tcW w:w="1994" w:type="dxa"/>
           </w:tcPr>
           <w:p>
+            <w:pPr>
+              <w:bidi w:val="0"/>
+            </w:pPr>
             <w:r>
               <w:rPr>
                 <w:sz w:val="20"/>
@@ -611,6 +706,9 @@
             <w:tcW w:w="1994" w:type="dxa"/>
           </w:tcPr>
           <w:p>
+            <w:pPr>
+              <w:bidi w:val="0"/>
+            </w:pPr>
             <w:r>
               <w:rPr>
                 <w:sz w:val="20"/>
@@ -629,6 +727,9 @@
             <w:tcW w:w="1994" w:type="dxa"/>
           </w:tcPr>
           <w:p>
+            <w:pPr>
+              <w:bidi w:val="0"/>
+            </w:pPr>
             <w:r>
               <w:rPr>
                 <w:sz w:val="20"/>
@@ -642,6 +743,9 @@
             <w:tcW w:w="1994" w:type="dxa"/>
           </w:tcPr>
           <w:p>
+            <w:pPr>
+              <w:bidi w:val="0"/>
+            </w:pPr>
             <w:r>
               <w:rPr>
                 <w:sz w:val="20"/>
@@ -655,6 +759,9 @@
             <w:tcW w:w="1994" w:type="dxa"/>
           </w:tcPr>
           <w:p>
+            <w:pPr>
+              <w:bidi w:val="0"/>
+            </w:pPr>
             <w:r>
               <w:rPr>
                 <w:sz w:val="20"/>
@@ -668,6 +775,9 @@
             <w:tcW w:w="1994" w:type="dxa"/>
           </w:tcPr>
           <w:p>
+            <w:pPr>
+              <w:bidi w:val="0"/>
+            </w:pPr>
             <w:r>
               <w:rPr>
                 <w:sz w:val="20"/>
@@ -681,6 +791,9 @@
             <w:tcW w:w="1994" w:type="dxa"/>
           </w:tcPr>
           <w:p>
+            <w:pPr>
+              <w:bidi w:val="0"/>
+            </w:pPr>
             <w:r>
               <w:rPr>
                 <w:sz w:val="20"/>
@@ -699,6 +812,9 @@
             <w:tcW w:w="1994" w:type="dxa"/>
           </w:tcPr>
           <w:p>
+            <w:pPr>
+              <w:bidi w:val="0"/>
+            </w:pPr>
             <w:r>
               <w:rPr>
                 <w:sz w:val="20"/>
@@ -712,6 +828,9 @@
             <w:tcW w:w="1994" w:type="dxa"/>
           </w:tcPr>
           <w:p>
+            <w:pPr>
+              <w:bidi w:val="0"/>
+            </w:pPr>
             <w:r>
               <w:rPr>
                 <w:sz w:val="20"/>
@@ -725,6 +844,9 @@
             <w:tcW w:w="1994" w:type="dxa"/>
           </w:tcPr>
           <w:p>
+            <w:pPr>
+              <w:bidi w:val="0"/>
+            </w:pPr>
             <w:r>
               <w:rPr>
                 <w:sz w:val="20"/>
@@ -738,6 +860,9 @@
             <w:tcW w:w="1994" w:type="dxa"/>
           </w:tcPr>
           <w:p>
+            <w:pPr>
+              <w:bidi w:val="0"/>
+            </w:pPr>
             <w:r>
               <w:rPr>
                 <w:sz w:val="20"/>
@@ -751,6 +876,9 @@
             <w:tcW w:w="1994" w:type="dxa"/>
           </w:tcPr>
           <w:p>
+            <w:pPr>
+              <w:bidi w:val="0"/>
+            </w:pPr>
             <w:r>
               <w:rPr>
                 <w:sz w:val="20"/>
@@ -769,6 +897,9 @@
             <w:tcW w:w="1994" w:type="dxa"/>
           </w:tcPr>
           <w:p>
+            <w:pPr>
+              <w:bidi w:val="0"/>
+            </w:pPr>
             <w:r>
               <w:rPr>
                 <w:sz w:val="20"/>
@@ -782,6 +913,9 @@
             <w:tcW w:w="1994" w:type="dxa"/>
           </w:tcPr>
           <w:p>
+            <w:pPr>
+              <w:bidi w:val="0"/>
+            </w:pPr>
             <w:r>
               <w:rPr>
                 <w:sz w:val="20"/>
@@ -795,6 +929,9 @@
             <w:tcW w:w="1994" w:type="dxa"/>
           </w:tcPr>
           <w:p>
+            <w:pPr>
+              <w:bidi w:val="0"/>
+            </w:pPr>
             <w:r>
               <w:rPr>
                 <w:sz w:val="20"/>
@@ -808,6 +945,9 @@
             <w:tcW w:w="1994" w:type="dxa"/>
           </w:tcPr>
           <w:p>
+            <w:pPr>
+              <w:bidi w:val="0"/>
+            </w:pPr>
             <w:r>
               <w:rPr>
                 <w:sz w:val="20"/>
@@ -821,6 +961,9 @@
             <w:tcW w:w="1994" w:type="dxa"/>
           </w:tcPr>
           <w:p>
+            <w:pPr>
+              <w:bidi w:val="0"/>
+            </w:pPr>
             <w:r>
               <w:rPr>
                 <w:sz w:val="20"/>
@@ -839,6 +982,9 @@
             <w:tcW w:w="1994" w:type="dxa"/>
           </w:tcPr>
           <w:p>
+            <w:pPr>
+              <w:bidi w:val="0"/>
+            </w:pPr>
             <w:r>
               <w:rPr>
                 <w:sz w:val="20"/>
@@ -852,6 +998,9 @@
             <w:tcW w:w="1994" w:type="dxa"/>
           </w:tcPr>
           <w:p>
+            <w:pPr>
+              <w:bidi w:val="0"/>
+            </w:pPr>
             <w:r>
               <w:rPr>
                 <w:sz w:val="20"/>
@@ -865,6 +1014,9 @@
             <w:tcW w:w="1994" w:type="dxa"/>
           </w:tcPr>
           <w:p>
+            <w:pPr>
+              <w:bidi w:val="0"/>
+            </w:pPr>
             <w:r>
               <w:rPr>
                 <w:sz w:val="20"/>
@@ -878,6 +1030,9 @@
             <w:tcW w:w="1994" w:type="dxa"/>
           </w:tcPr>
           <w:p>
+            <w:pPr>
+              <w:bidi w:val="0"/>
+            </w:pPr>
             <w:r>
               <w:rPr>
                 <w:sz w:val="20"/>
@@ -891,6 +1046,9 @@
             <w:tcW w:w="1994" w:type="dxa"/>
           </w:tcPr>
           <w:p>
+            <w:pPr>
+              <w:bidi w:val="0"/>
+            </w:pPr>
             <w:r>
               <w:rPr>
                 <w:sz w:val="20"/>
@@ -909,6 +1067,9 @@
             <w:tcW w:w="1994" w:type="dxa"/>
           </w:tcPr>
           <w:p>
+            <w:pPr>
+              <w:bidi w:val="0"/>
+            </w:pPr>
             <w:r>
               <w:rPr>
                 <w:sz w:val="20"/>
@@ -922,6 +1083,9 @@
             <w:tcW w:w="1994" w:type="dxa"/>
           </w:tcPr>
           <w:p>
+            <w:pPr>
+              <w:bidi w:val="0"/>
+            </w:pPr>
             <w:r>
               <w:rPr>
                 <w:sz w:val="20"/>
@@ -935,6 +1099,9 @@
             <w:tcW w:w="1994" w:type="dxa"/>
           </w:tcPr>
           <w:p>
+            <w:pPr>
+              <w:bidi w:val="0"/>
+            </w:pPr>
             <w:r>
               <w:rPr>
                 <w:sz w:val="20"/>
@@ -948,6 +1115,9 @@
             <w:tcW w:w="1994" w:type="dxa"/>
           </w:tcPr>
           <w:p>
+            <w:pPr>
+              <w:bidi w:val="0"/>
+            </w:pPr>
             <w:r>
               <w:rPr>
                 <w:sz w:val="20"/>
@@ -961,6 +1131,9 @@
             <w:tcW w:w="1994" w:type="dxa"/>
           </w:tcPr>
           <w:p>
+            <w:pPr>
+              <w:bidi w:val="0"/>
+            </w:pPr>
             <w:r>
               <w:rPr>
                 <w:sz w:val="20"/>
@@ -979,6 +1152,9 @@
             <w:tcW w:w="1994" w:type="dxa"/>
           </w:tcPr>
           <w:p>
+            <w:pPr>
+              <w:bidi w:val="0"/>
+            </w:pPr>
             <w:r>
               <w:rPr>
                 <w:sz w:val="20"/>
@@ -992,6 +1168,9 @@
             <w:tcW w:w="1994" w:type="dxa"/>
           </w:tcPr>
           <w:p>
+            <w:pPr>
+              <w:bidi w:val="0"/>
+            </w:pPr>
             <w:r>
               <w:rPr>
                 <w:sz w:val="20"/>
@@ -1005,6 +1184,9 @@
             <w:tcW w:w="1994" w:type="dxa"/>
           </w:tcPr>
           <w:p>
+            <w:pPr>
+              <w:bidi w:val="0"/>
+            </w:pPr>
             <w:r>
               <w:rPr>
                 <w:sz w:val="20"/>
@@ -1018,6 +1200,9 @@
             <w:tcW w:w="1994" w:type="dxa"/>
           </w:tcPr>
           <w:p>
+            <w:pPr>
+              <w:bidi w:val="0"/>
+            </w:pPr>
             <w:r>
               <w:rPr>
                 <w:sz w:val="20"/>
@@ -1031,6 +1216,9 @@
             <w:tcW w:w="1994" w:type="dxa"/>
           </w:tcPr>
           <w:p>
+            <w:pPr>
+              <w:bidi w:val="0"/>
+            </w:pPr>
             <w:r>
               <w:rPr>
                 <w:sz w:val="20"/>
@@ -1056,6 +1244,9 @@
             <w:tcW w:w="1994" w:type="dxa"/>
           </w:tcPr>
           <w:p>
+            <w:pPr>
+              <w:bidi w:val="0"/>
+            </w:pPr>
             <w:r>
               <w:rPr>
                 <w:sz w:val="20"/>
@@ -1070,6 +1261,9 @@
             <w:tcW w:w="1994" w:type="dxa"/>
           </w:tcPr>
           <w:p>
+            <w:pPr>
+              <w:bidi w:val="0"/>
+            </w:pPr>
             <w:r>
               <w:rPr>
                 <w:sz w:val="20"/>
@@ -1083,6 +1277,9 @@
             <w:tcW w:w="1994" w:type="dxa"/>
           </w:tcPr>
           <w:p>
+            <w:pPr>
+              <w:bidi w:val="0"/>
+            </w:pPr>
             <w:r>
               <w:rPr>
                 <w:sz w:val="20"/>
@@ -1096,6 +1293,9 @@
             <w:tcW w:w="1994" w:type="dxa"/>
           </w:tcPr>
           <w:p>
+            <w:pPr>
+              <w:bidi w:val="0"/>
+            </w:pPr>
             <w:r>
               <w:rPr>
                 <w:sz w:val="20"/>
@@ -1109,6 +1309,9 @@
             <w:tcW w:w="1994" w:type="dxa"/>
           </w:tcPr>
           <w:p>
+            <w:pPr>
+              <w:bidi w:val="0"/>
+            </w:pPr>
             <w:r>
               <w:rPr>
                 <w:sz w:val="20"/>
@@ -1128,6 +1331,7 @@
           <w:right w:val="single" w:sz="18" w:space="4" w:color="F5A623"/>
         </w:pBdr>
         <w:shd w:val="clear" w:color="auto" w:fill="FFF8E1"/>
+        <w:bidi w:val="0"/>
         <w:spacing w:before="80" w:after="80" w:line="240" w:lineRule="auto"/>
         <w:ind w:left="170" w:right="170"/>
       </w:pPr>
@@ -1141,6 +1345,7 @@
     </w:p>
     <w:p>
       <w:pPr>
+        <w:bidi w:val="0"/>
         <w:spacing w:before="40" w:after="80" w:line="240" w:lineRule="auto"/>
       </w:pPr>
       <w:r>
@@ -1153,6 +1358,9 @@
       </w:r>
     </w:p>
     <w:p>
+      <w:pPr>
+        <w:bidi w:val="0"/>
+      </w:pPr>
       <w:r>
         <w:br w:type="page"/>
       </w:r>
@@ -1167,6 +1375,7 @@
         <w:rPr>
           <w:rFonts w:ascii="Arial" w:hAnsi="Arial"/>
         </w:rPr>
+        <w:lastRenderedPageBreak/>
         <w:t>חלק א' — מראה התיק (15%)</w:t>
       </w:r>
     </w:p>
@@ -1195,6 +1404,9 @@
             <w:shd w:val="clear" w:color="auto" w:fill="EAF2FD"/>
           </w:tcPr>
           <w:p>
+            <w:pPr>
+              <w:bidi w:val="0"/>
+            </w:pPr>
             <w:r>
               <w:rPr>
                 <w:b/>
@@ -1210,6 +1422,9 @@
             <w:shd w:val="clear" w:color="auto" w:fill="EAF2FD"/>
           </w:tcPr>
           <w:p>
+            <w:pPr>
+              <w:bidi w:val="0"/>
+            </w:pPr>
             <w:r>
               <w:rPr>
                 <w:b/>
@@ -1225,6 +1440,9 @@
             <w:shd w:val="clear" w:color="auto" w:fill="EAF2FD"/>
           </w:tcPr>
           <w:p>
+            <w:pPr>
+              <w:bidi w:val="0"/>
+            </w:pPr>
             <w:r>
               <w:rPr>
                 <w:b/>
@@ -1240,6 +1458,9 @@
             <w:shd w:val="clear" w:color="auto" w:fill="EAF2FD"/>
           </w:tcPr>
           <w:p>
+            <w:pPr>
+              <w:bidi w:val="0"/>
+            </w:pPr>
             <w:r>
               <w:rPr>
                 <w:b/>
@@ -1255,6 +1476,9 @@
             <w:shd w:val="clear" w:color="auto" w:fill="EAF2FD"/>
           </w:tcPr>
           <w:p>
+            <w:pPr>
+              <w:bidi w:val="0"/>
+            </w:pPr>
             <w:r>
               <w:rPr>
                 <w:b/>
@@ -1270,6 +1494,9 @@
             <w:shd w:val="clear" w:color="auto" w:fill="EAF2FD"/>
           </w:tcPr>
           <w:p>
+            <w:pPr>
+              <w:bidi w:val="0"/>
+            </w:pPr>
             <w:r>
               <w:rPr>
                 <w:b/>
@@ -1289,6 +1516,9 @@
             <w:tcW w:w="1662" w:type="dxa"/>
           </w:tcPr>
           <w:p>
+            <w:pPr>
+              <w:bidi w:val="0"/>
+            </w:pPr>
             <w:r>
               <w:rPr>
                 <w:sz w:val="20"/>
@@ -1302,6 +1532,9 @@
             <w:tcW w:w="1662" w:type="dxa"/>
           </w:tcPr>
           <w:p>
+            <w:pPr>
+              <w:bidi w:val="0"/>
+            </w:pPr>
             <w:r>
               <w:rPr>
                 <w:sz w:val="20"/>
@@ -1315,6 +1548,9 @@
             <w:tcW w:w="1662" w:type="dxa"/>
           </w:tcPr>
           <w:p>
+            <w:pPr>
+              <w:bidi w:val="0"/>
+            </w:pPr>
             <w:r>
               <w:rPr>
                 <w:sz w:val="20"/>
@@ -1328,6 +1564,9 @@
             <w:tcW w:w="1662" w:type="dxa"/>
           </w:tcPr>
           <w:p>
+            <w:pPr>
+              <w:bidi w:val="0"/>
+            </w:pPr>
             <w:r>
               <w:rPr>
                 <w:sz w:val="20"/>
@@ -1341,6 +1580,9 @@
             <w:tcW w:w="1662" w:type="dxa"/>
           </w:tcPr>
           <w:p>
+            <w:pPr>
+              <w:bidi w:val="0"/>
+            </w:pPr>
             <w:r>
               <w:rPr>
                 <w:sz w:val="20"/>
@@ -1354,6 +1596,9 @@
             <w:tcW w:w="1662" w:type="dxa"/>
           </w:tcPr>
           <w:p>
+            <w:pPr>
+              <w:bidi w:val="0"/>
+            </w:pPr>
             <w:r>
               <w:rPr>
                 <w:sz w:val="20"/>
@@ -1372,6 +1617,9 @@
             <w:tcW w:w="1662" w:type="dxa"/>
           </w:tcPr>
           <w:p>
+            <w:pPr>
+              <w:bidi w:val="0"/>
+            </w:pPr>
             <w:r>
               <w:rPr>
                 <w:sz w:val="20"/>
@@ -1385,6 +1633,9 @@
             <w:tcW w:w="1662" w:type="dxa"/>
           </w:tcPr>
           <w:p>
+            <w:pPr>
+              <w:bidi w:val="0"/>
+            </w:pPr>
             <w:r>
               <w:rPr>
                 <w:sz w:val="20"/>
@@ -1398,6 +1649,9 @@
             <w:tcW w:w="1662" w:type="dxa"/>
           </w:tcPr>
           <w:p>
+            <w:pPr>
+              <w:bidi w:val="0"/>
+            </w:pPr>
             <w:r>
               <w:rPr>
                 <w:sz w:val="20"/>
@@ -1411,6 +1665,9 @@
             <w:tcW w:w="1662" w:type="dxa"/>
           </w:tcPr>
           <w:p>
+            <w:pPr>
+              <w:bidi w:val="0"/>
+            </w:pPr>
             <w:r>
               <w:rPr>
                 <w:sz w:val="20"/>
@@ -1424,6 +1681,9 @@
             <w:tcW w:w="1662" w:type="dxa"/>
           </w:tcPr>
           <w:p>
+            <w:pPr>
+              <w:bidi w:val="0"/>
+            </w:pPr>
             <w:r>
               <w:rPr>
                 <w:sz w:val="20"/>
@@ -1437,6 +1697,9 @@
             <w:tcW w:w="1662" w:type="dxa"/>
           </w:tcPr>
           <w:p>
+            <w:pPr>
+              <w:bidi w:val="0"/>
+            </w:pPr>
             <w:r>
               <w:rPr>
                 <w:sz w:val="20"/>
@@ -1455,6 +1718,9 @@
             <w:tcW w:w="1662" w:type="dxa"/>
           </w:tcPr>
           <w:p>
+            <w:pPr>
+              <w:bidi w:val="0"/>
+            </w:pPr>
             <w:r>
               <w:rPr>
                 <w:sz w:val="20"/>
@@ -1468,6 +1734,9 @@
             <w:tcW w:w="1662" w:type="dxa"/>
           </w:tcPr>
           <w:p>
+            <w:pPr>
+              <w:bidi w:val="0"/>
+            </w:pPr>
             <w:r>
               <w:rPr>
                 <w:sz w:val="20"/>
@@ -1481,6 +1750,9 @@
             <w:tcW w:w="1662" w:type="dxa"/>
           </w:tcPr>
           <w:p>
+            <w:pPr>
+              <w:bidi w:val="0"/>
+            </w:pPr>
             <w:r>
               <w:rPr>
                 <w:sz w:val="20"/>
@@ -1494,6 +1766,9 @@
             <w:tcW w:w="1662" w:type="dxa"/>
           </w:tcPr>
           <w:p>
+            <w:pPr>
+              <w:bidi w:val="0"/>
+            </w:pPr>
             <w:r>
               <w:rPr>
                 <w:sz w:val="20"/>
@@ -1507,6 +1782,9 @@
             <w:tcW w:w="1662" w:type="dxa"/>
           </w:tcPr>
           <w:p>
+            <w:pPr>
+              <w:bidi w:val="0"/>
+            </w:pPr>
             <w:r>
               <w:rPr>
                 <w:sz w:val="20"/>
@@ -1520,6 +1798,9 @@
             <w:tcW w:w="1662" w:type="dxa"/>
           </w:tcPr>
           <w:p>
+            <w:pPr>
+              <w:bidi w:val="0"/>
+            </w:pPr>
             <w:r>
               <w:rPr>
                 <w:sz w:val="20"/>
@@ -1538,6 +1819,9 @@
             <w:tcW w:w="1662" w:type="dxa"/>
           </w:tcPr>
           <w:p>
+            <w:pPr>
+              <w:bidi w:val="0"/>
+            </w:pPr>
             <w:r>
               <w:rPr>
                 <w:sz w:val="20"/>
@@ -1551,6 +1835,9 @@
             <w:tcW w:w="1662" w:type="dxa"/>
           </w:tcPr>
           <w:p>
+            <w:pPr>
+              <w:bidi w:val="0"/>
+            </w:pPr>
             <w:r>
               <w:rPr>
                 <w:sz w:val="20"/>
@@ -1564,6 +1851,9 @@
             <w:tcW w:w="1662" w:type="dxa"/>
           </w:tcPr>
           <w:p>
+            <w:pPr>
+              <w:bidi w:val="0"/>
+            </w:pPr>
             <w:r>
               <w:rPr>
                 <w:sz w:val="20"/>
@@ -1577,6 +1867,9 @@
             <w:tcW w:w="1662" w:type="dxa"/>
           </w:tcPr>
           <w:p>
+            <w:pPr>
+              <w:bidi w:val="0"/>
+            </w:pPr>
             <w:r>
               <w:rPr>
                 <w:sz w:val="20"/>
@@ -1590,6 +1883,9 @@
             <w:tcW w:w="1662" w:type="dxa"/>
           </w:tcPr>
           <w:p>
+            <w:pPr>
+              <w:bidi w:val="0"/>
+            </w:pPr>
             <w:r>
               <w:rPr>
                 <w:sz w:val="20"/>
@@ -1603,6 +1899,9 @@
             <w:tcW w:w="1662" w:type="dxa"/>
           </w:tcPr>
           <w:p>
+            <w:pPr>
+              <w:bidi w:val="0"/>
+            </w:pPr>
             <w:r>
               <w:rPr>
                 <w:sz w:val="20"/>
@@ -1621,6 +1920,9 @@
             <w:tcW w:w="1662" w:type="dxa"/>
           </w:tcPr>
           <w:p>
+            <w:pPr>
+              <w:bidi w:val="0"/>
+            </w:pPr>
             <w:r>
               <w:rPr>
                 <w:sz w:val="20"/>
@@ -1634,6 +1936,9 @@
             <w:tcW w:w="1662" w:type="dxa"/>
           </w:tcPr>
           <w:p>
+            <w:pPr>
+              <w:bidi w:val="0"/>
+            </w:pPr>
             <w:r>
               <w:rPr>
                 <w:sz w:val="20"/>
@@ -1647,6 +1952,9 @@
             <w:tcW w:w="1662" w:type="dxa"/>
           </w:tcPr>
           <w:p>
+            <w:pPr>
+              <w:bidi w:val="0"/>
+            </w:pPr>
             <w:r>
               <w:rPr>
                 <w:sz w:val="20"/>
@@ -1660,6 +1968,9 @@
             <w:tcW w:w="1662" w:type="dxa"/>
           </w:tcPr>
           <w:p>
+            <w:pPr>
+              <w:bidi w:val="0"/>
+            </w:pPr>
             <w:r>
               <w:rPr>
                 <w:sz w:val="20"/>
@@ -1673,6 +1984,9 @@
             <w:tcW w:w="1662" w:type="dxa"/>
           </w:tcPr>
           <w:p>
+            <w:pPr>
+              <w:bidi w:val="0"/>
+            </w:pPr>
             <w:r>
               <w:rPr>
                 <w:sz w:val="20"/>
@@ -1686,6 +2000,9 @@
             <w:tcW w:w="1662" w:type="dxa"/>
           </w:tcPr>
           <w:p>
+            <w:pPr>
+              <w:bidi w:val="0"/>
+            </w:pPr>
             <w:r>
               <w:rPr>
                 <w:sz w:val="20"/>
@@ -1704,6 +2021,9 @@
             <w:tcW w:w="1662" w:type="dxa"/>
           </w:tcPr>
           <w:p>
+            <w:pPr>
+              <w:bidi w:val="0"/>
+            </w:pPr>
             <w:r>
               <w:rPr>
                 <w:sz w:val="20"/>
@@ -1717,6 +2037,9 @@
             <w:tcW w:w="1662" w:type="dxa"/>
           </w:tcPr>
           <w:p>
+            <w:pPr>
+              <w:bidi w:val="0"/>
+            </w:pPr>
             <w:r>
               <w:rPr>
                 <w:sz w:val="20"/>
@@ -1730,6 +2053,9 @@
             <w:tcW w:w="1662" w:type="dxa"/>
           </w:tcPr>
           <w:p>
+            <w:pPr>
+              <w:bidi w:val="0"/>
+            </w:pPr>
             <w:r>
               <w:rPr>
                 <w:sz w:val="20"/>
@@ -1743,6 +2069,9 @@
             <w:tcW w:w="1662" w:type="dxa"/>
           </w:tcPr>
           <w:p>
+            <w:pPr>
+              <w:bidi w:val="0"/>
+            </w:pPr>
             <w:r>
               <w:rPr>
                 <w:sz w:val="20"/>
@@ -1756,6 +2085,9 @@
             <w:tcW w:w="1662" w:type="dxa"/>
           </w:tcPr>
           <w:p>
+            <w:pPr>
+              <w:bidi w:val="0"/>
+            </w:pPr>
             <w:r>
               <w:rPr>
                 <w:sz w:val="20"/>
@@ -1769,6 +2101,9 @@
             <w:tcW w:w="1662" w:type="dxa"/>
           </w:tcPr>
           <w:p>
+            <w:pPr>
+              <w:bidi w:val="0"/>
+            </w:pPr>
             <w:r>
               <w:rPr>
                 <w:sz w:val="20"/>
@@ -1781,6 +2116,7 @@
     </w:tbl>
     <w:p>
       <w:pPr>
+        <w:bidi w:val="0"/>
         <w:spacing w:before="40" w:after="80" w:line="240" w:lineRule="auto"/>
       </w:pPr>
       <w:r>
@@ -1792,6 +2128,9 @@
       </w:r>
     </w:p>
     <w:p>
+      <w:pPr>
+        <w:bidi w:val="0"/>
+      </w:pPr>
       <w:r>
         <w:br w:type="page"/>
       </w:r>
@@ -1806,6 +2145,7 @@
         <w:rPr>
           <w:rFonts w:ascii="Arial" w:hAnsi="Arial"/>
         </w:rPr>
+        <w:lastRenderedPageBreak/>
         <w:t>חלק ב' — תוכן התיק (85%)</w:t>
       </w:r>
     </w:p>
@@ -1844,6 +2184,9 @@
             <w:shd w:val="clear" w:color="auto" w:fill="EAF2FD"/>
           </w:tcPr>
           <w:p>
+            <w:pPr>
+              <w:bidi w:val="0"/>
+            </w:pPr>
             <w:r>
               <w:rPr>
                 <w:b/>
@@ -1859,6 +2202,9 @@
             <w:shd w:val="clear" w:color="auto" w:fill="EAF2FD"/>
           </w:tcPr>
           <w:p>
+            <w:pPr>
+              <w:bidi w:val="0"/>
+            </w:pPr>
             <w:r>
               <w:rPr>
                 <w:b/>
@@ -1874,6 +2220,9 @@
             <w:shd w:val="clear" w:color="auto" w:fill="EAF2FD"/>
           </w:tcPr>
           <w:p>
+            <w:pPr>
+              <w:bidi w:val="0"/>
+            </w:pPr>
             <w:r>
               <w:rPr>
                 <w:b/>
@@ -1893,6 +2242,9 @@
             <w:tcW w:w="3324" w:type="dxa"/>
           </w:tcPr>
           <w:p>
+            <w:pPr>
+              <w:bidi w:val="0"/>
+            </w:pPr>
             <w:r>
               <w:rPr>
                 <w:sz w:val="20"/>
@@ -1906,6 +2258,9 @@
             <w:tcW w:w="3324" w:type="dxa"/>
           </w:tcPr>
           <w:p>
+            <w:pPr>
+              <w:bidi w:val="0"/>
+            </w:pPr>
             <w:r>
               <w:rPr>
                 <w:sz w:val="20"/>
@@ -1919,6 +2274,9 @@
             <w:tcW w:w="3324" w:type="dxa"/>
           </w:tcPr>
           <w:p>
+            <w:pPr>
+              <w:bidi w:val="0"/>
+            </w:pPr>
             <w:r>
               <w:rPr>
                 <w:sz w:val="20"/>
@@ -1937,6 +2295,9 @@
             <w:tcW w:w="3324" w:type="dxa"/>
           </w:tcPr>
           <w:p>
+            <w:pPr>
+              <w:bidi w:val="0"/>
+            </w:pPr>
             <w:r>
               <w:rPr>
                 <w:sz w:val="20"/>
@@ -1950,6 +2311,9 @@
             <w:tcW w:w="3324" w:type="dxa"/>
           </w:tcPr>
           <w:p>
+            <w:pPr>
+              <w:bidi w:val="0"/>
+            </w:pPr>
             <w:r>
               <w:rPr>
                 <w:sz w:val="20"/>
@@ -1963,6 +2327,9 @@
             <w:tcW w:w="3324" w:type="dxa"/>
           </w:tcPr>
           <w:p>
+            <w:pPr>
+              <w:bidi w:val="0"/>
+            </w:pPr>
             <w:r>
               <w:rPr>
                 <w:sz w:val="20"/>
@@ -1981,6 +2348,9 @@
             <w:tcW w:w="3324" w:type="dxa"/>
           </w:tcPr>
           <w:p>
+            <w:pPr>
+              <w:bidi w:val="0"/>
+            </w:pPr>
             <w:r>
               <w:rPr>
                 <w:sz w:val="20"/>
@@ -1994,6 +2364,9 @@
             <w:tcW w:w="3324" w:type="dxa"/>
           </w:tcPr>
           <w:p>
+            <w:pPr>
+              <w:bidi w:val="0"/>
+            </w:pPr>
             <w:r>
               <w:rPr>
                 <w:sz w:val="20"/>
@@ -2007,6 +2380,9 @@
             <w:tcW w:w="3324" w:type="dxa"/>
           </w:tcPr>
           <w:p>
+            <w:pPr>
+              <w:bidi w:val="0"/>
+            </w:pPr>
             <w:r>
               <w:rPr>
                 <w:sz w:val="20"/>
@@ -2025,6 +2401,9 @@
             <w:tcW w:w="3324" w:type="dxa"/>
           </w:tcPr>
           <w:p>
+            <w:pPr>
+              <w:bidi w:val="0"/>
+            </w:pPr>
             <w:r>
               <w:rPr>
                 <w:sz w:val="20"/>
@@ -2038,6 +2417,9 @@
             <w:tcW w:w="3324" w:type="dxa"/>
           </w:tcPr>
           <w:p>
+            <w:pPr>
+              <w:bidi w:val="0"/>
+            </w:pPr>
             <w:r>
               <w:rPr>
                 <w:sz w:val="20"/>
@@ -2051,6 +2433,9 @@
             <w:tcW w:w="3324" w:type="dxa"/>
           </w:tcPr>
           <w:p>
+            <w:pPr>
+              <w:bidi w:val="0"/>
+            </w:pPr>
             <w:r>
               <w:rPr>
                 <w:sz w:val="20"/>
@@ -2069,6 +2454,9 @@
             <w:tcW w:w="3324" w:type="dxa"/>
           </w:tcPr>
           <w:p>
+            <w:pPr>
+              <w:bidi w:val="0"/>
+            </w:pPr>
             <w:r>
               <w:rPr>
                 <w:sz w:val="20"/>
@@ -2082,6 +2470,9 @@
             <w:tcW w:w="3324" w:type="dxa"/>
           </w:tcPr>
           <w:p>
+            <w:pPr>
+              <w:bidi w:val="0"/>
+            </w:pPr>
             <w:r>
               <w:rPr>
                 <w:sz w:val="20"/>
@@ -2095,6 +2486,9 @@
             <w:tcW w:w="3324" w:type="dxa"/>
           </w:tcPr>
           <w:p>
+            <w:pPr>
+              <w:bidi w:val="0"/>
+            </w:pPr>
             <w:r>
               <w:rPr>
                 <w:sz w:val="20"/>
@@ -2113,6 +2507,9 @@
             <w:tcW w:w="3324" w:type="dxa"/>
           </w:tcPr>
           <w:p>
+            <w:pPr>
+              <w:bidi w:val="0"/>
+            </w:pPr>
             <w:r>
               <w:rPr>
                 <w:sz w:val="20"/>
@@ -2126,6 +2523,9 @@
             <w:tcW w:w="3324" w:type="dxa"/>
           </w:tcPr>
           <w:p>
+            <w:pPr>
+              <w:bidi w:val="0"/>
+            </w:pPr>
             <w:r>
               <w:rPr>
                 <w:sz w:val="20"/>
@@ -2139,6 +2539,9 @@
             <w:tcW w:w="3324" w:type="dxa"/>
           </w:tcPr>
           <w:p>
+            <w:pPr>
+              <w:bidi w:val="0"/>
+            </w:pPr>
             <w:r>
               <w:rPr>
                 <w:sz w:val="20"/>
@@ -2151,6 +2554,7 @@
     </w:tbl>
     <w:p>
       <w:pPr>
+        <w:bidi w:val="0"/>
         <w:spacing w:before="40" w:after="80" w:line="240" w:lineRule="auto"/>
       </w:pPr>
       <w:r>
@@ -2196,6 +2600,9 @@
             <w:shd w:val="clear" w:color="auto" w:fill="EAF2FD"/>
           </w:tcPr>
           <w:p>
+            <w:pPr>
+              <w:bidi w:val="0"/>
+            </w:pPr>
             <w:r>
               <w:rPr>
                 <w:b/>
@@ -2211,6 +2618,9 @@
             <w:shd w:val="clear" w:color="auto" w:fill="EAF2FD"/>
           </w:tcPr>
           <w:p>
+            <w:pPr>
+              <w:bidi w:val="0"/>
+            </w:pPr>
             <w:r>
               <w:rPr>
                 <w:b/>
@@ -2226,6 +2636,9 @@
             <w:shd w:val="clear" w:color="auto" w:fill="EAF2FD"/>
           </w:tcPr>
           <w:p>
+            <w:pPr>
+              <w:bidi w:val="0"/>
+            </w:pPr>
             <w:r>
               <w:rPr>
                 <w:b/>
@@ -2245,6 +2658,9 @@
             <w:tcW w:w="3324" w:type="dxa"/>
           </w:tcPr>
           <w:p>
+            <w:pPr>
+              <w:bidi w:val="0"/>
+            </w:pPr>
             <w:r>
               <w:rPr>
                 <w:sz w:val="20"/>
@@ -2258,6 +2674,9 @@
             <w:tcW w:w="3324" w:type="dxa"/>
           </w:tcPr>
           <w:p>
+            <w:pPr>
+              <w:bidi w:val="0"/>
+            </w:pPr>
             <w:r>
               <w:rPr>
                 <w:sz w:val="20"/>
@@ -2271,6 +2690,9 @@
             <w:tcW w:w="3324" w:type="dxa"/>
           </w:tcPr>
           <w:p>
+            <w:pPr>
+              <w:bidi w:val="0"/>
+            </w:pPr>
             <w:r>
               <w:rPr>
                 <w:sz w:val="20"/>
@@ -2289,6 +2711,9 @@
             <w:tcW w:w="3324" w:type="dxa"/>
           </w:tcPr>
           <w:p>
+            <w:pPr>
+              <w:bidi w:val="0"/>
+            </w:pPr>
             <w:r>
               <w:rPr>
                 <w:sz w:val="20"/>
@@ -2302,6 +2727,9 @@
             <w:tcW w:w="3324" w:type="dxa"/>
           </w:tcPr>
           <w:p>
+            <w:pPr>
+              <w:bidi w:val="0"/>
+            </w:pPr>
             <w:r>
               <w:rPr>
                 <w:sz w:val="20"/>
@@ -2315,6 +2743,9 @@
             <w:tcW w:w="3324" w:type="dxa"/>
           </w:tcPr>
           <w:p>
+            <w:pPr>
+              <w:bidi w:val="0"/>
+            </w:pPr>
             <w:r>
               <w:rPr>
                 <w:sz w:val="20"/>
@@ -2333,6 +2764,9 @@
             <w:tcW w:w="3324" w:type="dxa"/>
           </w:tcPr>
           <w:p>
+            <w:pPr>
+              <w:bidi w:val="0"/>
+            </w:pPr>
             <w:r>
               <w:rPr>
                 <w:sz w:val="20"/>
@@ -2346,6 +2780,9 @@
             <w:tcW w:w="3324" w:type="dxa"/>
           </w:tcPr>
           <w:p>
+            <w:pPr>
+              <w:bidi w:val="0"/>
+            </w:pPr>
             <w:r>
               <w:rPr>
                 <w:sz w:val="20"/>
@@ -2359,6 +2796,9 @@
             <w:tcW w:w="3324" w:type="dxa"/>
           </w:tcPr>
           <w:p>
+            <w:pPr>
+              <w:bidi w:val="0"/>
+            </w:pPr>
             <w:r>
               <w:rPr>
                 <w:sz w:val="20"/>
@@ -2377,6 +2817,9 @@
             <w:tcW w:w="3324" w:type="dxa"/>
           </w:tcPr>
           <w:p>
+            <w:pPr>
+              <w:bidi w:val="0"/>
+            </w:pPr>
             <w:r>
               <w:rPr>
                 <w:sz w:val="20"/>
@@ -2390,6 +2833,9 @@
             <w:tcW w:w="3324" w:type="dxa"/>
           </w:tcPr>
           <w:p>
+            <w:pPr>
+              <w:bidi w:val="0"/>
+            </w:pPr>
             <w:r>
               <w:rPr>
                 <w:sz w:val="20"/>
@@ -2403,6 +2849,9 @@
             <w:tcW w:w="3324" w:type="dxa"/>
           </w:tcPr>
           <w:p>
+            <w:pPr>
+              <w:bidi w:val="0"/>
+            </w:pPr>
             <w:r>
               <w:rPr>
                 <w:sz w:val="20"/>
@@ -2421,6 +2870,9 @@
             <w:tcW w:w="3324" w:type="dxa"/>
           </w:tcPr>
           <w:p>
+            <w:pPr>
+              <w:bidi w:val="0"/>
+            </w:pPr>
             <w:r>
               <w:rPr>
                 <w:sz w:val="20"/>
@@ -2434,6 +2886,9 @@
             <w:tcW w:w="3324" w:type="dxa"/>
           </w:tcPr>
           <w:p>
+            <w:pPr>
+              <w:bidi w:val="0"/>
+            </w:pPr>
             <w:r>
               <w:rPr>
                 <w:sz w:val="20"/>
@@ -2447,6 +2902,9 @@
             <w:tcW w:w="3324" w:type="dxa"/>
           </w:tcPr>
           <w:p>
+            <w:pPr>
+              <w:bidi w:val="0"/>
+            </w:pPr>
             <w:r>
               <w:rPr>
                 <w:sz w:val="20"/>
@@ -2465,6 +2923,9 @@
             <w:tcW w:w="3324" w:type="dxa"/>
           </w:tcPr>
           <w:p>
+            <w:pPr>
+              <w:bidi w:val="0"/>
+            </w:pPr>
             <w:r>
               <w:rPr>
                 <w:sz w:val="20"/>
@@ -2478,6 +2939,9 @@
             <w:tcW w:w="3324" w:type="dxa"/>
           </w:tcPr>
           <w:p>
+            <w:pPr>
+              <w:bidi w:val="0"/>
+            </w:pPr>
             <w:r>
               <w:rPr>
                 <w:sz w:val="20"/>
@@ -2491,6 +2955,9 @@
             <w:tcW w:w="3324" w:type="dxa"/>
           </w:tcPr>
           <w:p>
+            <w:pPr>
+              <w:bidi w:val="0"/>
+            </w:pPr>
             <w:r>
               <w:rPr>
                 <w:sz w:val="20"/>
@@ -2503,6 +2970,7 @@
     </w:tbl>
     <w:p>
       <w:pPr>
+        <w:bidi w:val="0"/>
         <w:spacing w:before="40" w:after="80" w:line="240" w:lineRule="auto"/>
       </w:pPr>
       <w:r>
@@ -2548,6 +3016,9 @@
             <w:shd w:val="clear" w:color="auto" w:fill="EAF2FD"/>
           </w:tcPr>
           <w:p>
+            <w:pPr>
+              <w:bidi w:val="0"/>
+            </w:pPr>
             <w:r>
               <w:rPr>
                 <w:b/>
@@ -2563,6 +3034,9 @@
             <w:shd w:val="clear" w:color="auto" w:fill="EAF2FD"/>
           </w:tcPr>
           <w:p>
+            <w:pPr>
+              <w:bidi w:val="0"/>
+            </w:pPr>
             <w:r>
               <w:rPr>
                 <w:b/>
@@ -2578,6 +3052,9 @@
             <w:shd w:val="clear" w:color="auto" w:fill="EAF2FD"/>
           </w:tcPr>
           <w:p>
+            <w:pPr>
+              <w:bidi w:val="0"/>
+            </w:pPr>
             <w:r>
               <w:rPr>
                 <w:b/>
@@ -2597,6 +3074,9 @@
             <w:tcW w:w="3324" w:type="dxa"/>
           </w:tcPr>
           <w:p>
+            <w:pPr>
+              <w:bidi w:val="0"/>
+            </w:pPr>
             <w:r>
               <w:rPr>
                 <w:sz w:val="20"/>
@@ -2610,6 +3090,9 @@
             <w:tcW w:w="3324" w:type="dxa"/>
           </w:tcPr>
           <w:p>
+            <w:pPr>
+              <w:bidi w:val="0"/>
+            </w:pPr>
             <w:r>
               <w:rPr>
                 <w:sz w:val="20"/>
@@ -2623,6 +3106,9 @@
             <w:tcW w:w="3324" w:type="dxa"/>
           </w:tcPr>
           <w:p>
+            <w:pPr>
+              <w:bidi w:val="0"/>
+            </w:pPr>
             <w:r>
               <w:rPr>
                 <w:sz w:val="20"/>
@@ -2641,10 +3127,14 @@
             <w:tcW w:w="3324" w:type="dxa"/>
           </w:tcPr>
           <w:p>
-            <w:r>
-              <w:rPr>
-                <w:sz w:val="20"/>
-              </w:rPr>
+            <w:pPr>
+              <w:bidi w:val="0"/>
+            </w:pPr>
+            <w:r>
+              <w:rPr>
+                <w:sz w:val="20"/>
+              </w:rPr>
+              <w:lastRenderedPageBreak/>
               <w:t>תרשימי זרימת מידע (sequence diagrams)</w:t>
             </w:r>
           </w:p>
@@ -2654,6 +3144,9 @@
             <w:tcW w:w="3324" w:type="dxa"/>
           </w:tcPr>
           <w:p>
+            <w:pPr>
+              <w:bidi w:val="0"/>
+            </w:pPr>
             <w:r>
               <w:rPr>
                 <w:sz w:val="20"/>
@@ -2667,6 +3160,9 @@
             <w:tcW w:w="3324" w:type="dxa"/>
           </w:tcPr>
           <w:p>
+            <w:pPr>
+              <w:bidi w:val="0"/>
+            </w:pPr>
             <w:r>
               <w:rPr>
                 <w:sz w:val="20"/>
@@ -2685,6 +3181,9 @@
             <w:tcW w:w="3324" w:type="dxa"/>
           </w:tcPr>
           <w:p>
+            <w:pPr>
+              <w:bidi w:val="0"/>
+            </w:pPr>
             <w:r>
               <w:rPr>
                 <w:sz w:val="20"/>
@@ -2698,6 +3197,9 @@
             <w:tcW w:w="3324" w:type="dxa"/>
           </w:tcPr>
           <w:p>
+            <w:pPr>
+              <w:bidi w:val="0"/>
+            </w:pPr>
             <w:r>
               <w:rPr>
                 <w:sz w:val="20"/>
@@ -2711,6 +3213,9 @@
             <w:tcW w:w="3324" w:type="dxa"/>
           </w:tcPr>
           <w:p>
+            <w:pPr>
+              <w:bidi w:val="0"/>
+            </w:pPr>
             <w:r>
               <w:rPr>
                 <w:sz w:val="20"/>
@@ -2729,6 +3234,9 @@
             <w:tcW w:w="3324" w:type="dxa"/>
           </w:tcPr>
           <w:p>
+            <w:pPr>
+              <w:bidi w:val="0"/>
+            </w:pPr>
             <w:r>
               <w:rPr>
                 <w:sz w:val="20"/>
@@ -2742,6 +3250,9 @@
             <w:tcW w:w="3324" w:type="dxa"/>
           </w:tcPr>
           <w:p>
+            <w:pPr>
+              <w:bidi w:val="0"/>
+            </w:pPr>
             <w:r>
               <w:rPr>
                 <w:sz w:val="20"/>
@@ -2755,6 +3266,9 @@
             <w:tcW w:w="3324" w:type="dxa"/>
           </w:tcPr>
           <w:p>
+            <w:pPr>
+              <w:bidi w:val="0"/>
+            </w:pPr>
             <w:r>
               <w:rPr>
                 <w:sz w:val="20"/>
@@ -2773,6 +3287,9 @@
             <w:tcW w:w="3324" w:type="dxa"/>
           </w:tcPr>
           <w:p>
+            <w:pPr>
+              <w:bidi w:val="0"/>
+            </w:pPr>
             <w:r>
               <w:rPr>
                 <w:sz w:val="20"/>
@@ -2786,6 +3303,9 @@
             <w:tcW w:w="3324" w:type="dxa"/>
           </w:tcPr>
           <w:p>
+            <w:pPr>
+              <w:bidi w:val="0"/>
+            </w:pPr>
             <w:r>
               <w:rPr>
                 <w:sz w:val="20"/>
@@ -2799,6 +3319,9 @@
             <w:tcW w:w="3324" w:type="dxa"/>
           </w:tcPr>
           <w:p>
+            <w:pPr>
+              <w:bidi w:val="0"/>
+            </w:pPr>
             <w:r>
               <w:rPr>
                 <w:sz w:val="20"/>
@@ -2817,6 +3340,9 @@
             <w:tcW w:w="3324" w:type="dxa"/>
           </w:tcPr>
           <w:p>
+            <w:pPr>
+              <w:bidi w:val="0"/>
+            </w:pPr>
             <w:r>
               <w:rPr>
                 <w:sz w:val="20"/>
@@ -2830,6 +3356,9 @@
             <w:tcW w:w="3324" w:type="dxa"/>
           </w:tcPr>
           <w:p>
+            <w:pPr>
+              <w:bidi w:val="0"/>
+            </w:pPr>
             <w:r>
               <w:rPr>
                 <w:sz w:val="20"/>
@@ -2843,6 +3372,9 @@
             <w:tcW w:w="3324" w:type="dxa"/>
           </w:tcPr>
           <w:p>
+            <w:pPr>
+              <w:bidi w:val="0"/>
+            </w:pPr>
             <w:r>
               <w:rPr>
                 <w:sz w:val="20"/>
@@ -2855,6 +3387,7 @@
     </w:tbl>
     <w:p>
       <w:pPr>
+        <w:bidi w:val="0"/>
         <w:spacing w:before="40" w:after="80" w:line="240" w:lineRule="auto"/>
       </w:pPr>
       <w:r>
@@ -2900,6 +3433,9 @@
             <w:shd w:val="clear" w:color="auto" w:fill="EAF2FD"/>
           </w:tcPr>
           <w:p>
+            <w:pPr>
+              <w:bidi w:val="0"/>
+            </w:pPr>
             <w:r>
               <w:rPr>
                 <w:b/>
@@ -2915,6 +3451,9 @@
             <w:shd w:val="clear" w:color="auto" w:fill="EAF2FD"/>
           </w:tcPr>
           <w:p>
+            <w:pPr>
+              <w:bidi w:val="0"/>
+            </w:pPr>
             <w:r>
               <w:rPr>
                 <w:b/>
@@ -2930,6 +3469,9 @@
             <w:shd w:val="clear" w:color="auto" w:fill="EAF2FD"/>
           </w:tcPr>
           <w:p>
+            <w:pPr>
+              <w:bidi w:val="0"/>
+            </w:pPr>
             <w:r>
               <w:rPr>
                 <w:b/>
@@ -2949,6 +3491,9 @@
             <w:tcW w:w="3324" w:type="dxa"/>
           </w:tcPr>
           <w:p>
+            <w:pPr>
+              <w:bidi w:val="0"/>
+            </w:pPr>
             <w:r>
               <w:rPr>
                 <w:sz w:val="20"/>
@@ -2962,6 +3507,9 @@
             <w:tcW w:w="3324" w:type="dxa"/>
           </w:tcPr>
           <w:p>
+            <w:pPr>
+              <w:bidi w:val="0"/>
+            </w:pPr>
             <w:r>
               <w:rPr>
                 <w:sz w:val="20"/>
@@ -2975,6 +3523,9 @@
             <w:tcW w:w="3324" w:type="dxa"/>
           </w:tcPr>
           <w:p>
+            <w:pPr>
+              <w:bidi w:val="0"/>
+            </w:pPr>
             <w:r>
               <w:rPr>
                 <w:sz w:val="20"/>
@@ -2993,6 +3544,9 @@
             <w:tcW w:w="3324" w:type="dxa"/>
           </w:tcPr>
           <w:p>
+            <w:pPr>
+              <w:bidi w:val="0"/>
+            </w:pPr>
             <w:r>
               <w:rPr>
                 <w:sz w:val="20"/>
@@ -3006,6 +3560,9 @@
             <w:tcW w:w="3324" w:type="dxa"/>
           </w:tcPr>
           <w:p>
+            <w:pPr>
+              <w:bidi w:val="0"/>
+            </w:pPr>
             <w:r>
               <w:rPr>
                 <w:sz w:val="20"/>
@@ -3019,6 +3576,9 @@
             <w:tcW w:w="3324" w:type="dxa"/>
           </w:tcPr>
           <w:p>
+            <w:pPr>
+              <w:bidi w:val="0"/>
+            </w:pPr>
             <w:r>
               <w:rPr>
                 <w:sz w:val="20"/>
@@ -3037,6 +3597,9 @@
             <w:tcW w:w="3324" w:type="dxa"/>
           </w:tcPr>
           <w:p>
+            <w:pPr>
+              <w:bidi w:val="0"/>
+            </w:pPr>
             <w:r>
               <w:rPr>
                 <w:sz w:val="20"/>
@@ -3050,6 +3613,9 @@
             <w:tcW w:w="3324" w:type="dxa"/>
           </w:tcPr>
           <w:p>
+            <w:pPr>
+              <w:bidi w:val="0"/>
+            </w:pPr>
             <w:r>
               <w:rPr>
                 <w:sz w:val="20"/>
@@ -3063,6 +3629,9 @@
             <w:tcW w:w="3324" w:type="dxa"/>
           </w:tcPr>
           <w:p>
+            <w:pPr>
+              <w:bidi w:val="0"/>
+            </w:pPr>
             <w:r>
               <w:rPr>
                 <w:sz w:val="20"/>
@@ -3081,6 +3650,9 @@
             <w:tcW w:w="3324" w:type="dxa"/>
           </w:tcPr>
           <w:p>
+            <w:pPr>
+              <w:bidi w:val="0"/>
+            </w:pPr>
             <w:r>
               <w:rPr>
                 <w:sz w:val="20"/>
@@ -3094,6 +3666,9 @@
             <w:tcW w:w="3324" w:type="dxa"/>
           </w:tcPr>
           <w:p>
+            <w:pPr>
+              <w:bidi w:val="0"/>
+            </w:pPr>
             <w:r>
               <w:rPr>
                 <w:sz w:val="20"/>
@@ -3107,6 +3682,9 @@
             <w:tcW w:w="3324" w:type="dxa"/>
           </w:tcPr>
           <w:p>
+            <w:pPr>
+              <w:bidi w:val="0"/>
+            </w:pPr>
             <w:r>
               <w:rPr>
                 <w:sz w:val="20"/>
@@ -3125,6 +3703,9 @@
             <w:tcW w:w="3324" w:type="dxa"/>
           </w:tcPr>
           <w:p>
+            <w:pPr>
+              <w:bidi w:val="0"/>
+            </w:pPr>
             <w:r>
               <w:rPr>
                 <w:sz w:val="20"/>
@@ -3138,6 +3719,9 @@
             <w:tcW w:w="3324" w:type="dxa"/>
           </w:tcPr>
           <w:p>
+            <w:pPr>
+              <w:bidi w:val="0"/>
+            </w:pPr>
             <w:r>
               <w:rPr>
                 <w:sz w:val="20"/>
@@ -3151,6 +3735,9 @@
             <w:tcW w:w="3324" w:type="dxa"/>
           </w:tcPr>
           <w:p>
+            <w:pPr>
+              <w:bidi w:val="0"/>
+            </w:pPr>
             <w:r>
               <w:rPr>
                 <w:sz w:val="20"/>
@@ -3169,6 +3756,9 @@
             <w:tcW w:w="3324" w:type="dxa"/>
           </w:tcPr>
           <w:p>
+            <w:pPr>
+              <w:bidi w:val="0"/>
+            </w:pPr>
             <w:r>
               <w:rPr>
                 <w:sz w:val="20"/>
@@ -3182,6 +3772,9 @@
             <w:tcW w:w="3324" w:type="dxa"/>
           </w:tcPr>
           <w:p>
+            <w:pPr>
+              <w:bidi w:val="0"/>
+            </w:pPr>
             <w:r>
               <w:rPr>
                 <w:sz w:val="20"/>
@@ -3195,6 +3788,9 @@
             <w:tcW w:w="3324" w:type="dxa"/>
           </w:tcPr>
           <w:p>
+            <w:pPr>
+              <w:bidi w:val="0"/>
+            </w:pPr>
             <w:r>
               <w:rPr>
                 <w:sz w:val="20"/>
@@ -3213,6 +3809,9 @@
             <w:tcW w:w="3324" w:type="dxa"/>
           </w:tcPr>
           <w:p>
+            <w:pPr>
+              <w:bidi w:val="0"/>
+            </w:pPr>
             <w:r>
               <w:rPr>
                 <w:sz w:val="20"/>
@@ -3226,6 +3825,9 @@
             <w:tcW w:w="3324" w:type="dxa"/>
           </w:tcPr>
           <w:p>
+            <w:pPr>
+              <w:bidi w:val="0"/>
+            </w:pPr>
             <w:r>
               <w:rPr>
                 <w:sz w:val="20"/>
@@ -3239,6 +3841,9 @@
             <w:tcW w:w="3324" w:type="dxa"/>
           </w:tcPr>
           <w:p>
+            <w:pPr>
+              <w:bidi w:val="0"/>
+            </w:pPr>
             <w:r>
               <w:rPr>
                 <w:sz w:val="20"/>
@@ -3251,6 +3856,7 @@
     </w:tbl>
     <w:p>
       <w:pPr>
+        <w:bidi w:val="0"/>
         <w:spacing w:before="40" w:after="80" w:line="240" w:lineRule="auto"/>
       </w:pPr>
       <w:r>
@@ -3296,6 +3902,9 @@
             <w:shd w:val="clear" w:color="auto" w:fill="EAF2FD"/>
           </w:tcPr>
           <w:p>
+            <w:pPr>
+              <w:bidi w:val="0"/>
+            </w:pPr>
             <w:r>
               <w:rPr>
                 <w:b/>
@@ -3311,6 +3920,9 @@
             <w:shd w:val="clear" w:color="auto" w:fill="EAF2FD"/>
           </w:tcPr>
           <w:p>
+            <w:pPr>
+              <w:bidi w:val="0"/>
+            </w:pPr>
             <w:r>
               <w:rPr>
                 <w:b/>
@@ -3326,6 +3938,9 @@
             <w:shd w:val="clear" w:color="auto" w:fill="EAF2FD"/>
           </w:tcPr>
           <w:p>
+            <w:pPr>
+              <w:bidi w:val="0"/>
+            </w:pPr>
             <w:r>
               <w:rPr>
                 <w:b/>
@@ -3345,6 +3960,9 @@
             <w:tcW w:w="3324" w:type="dxa"/>
           </w:tcPr>
           <w:p>
+            <w:pPr>
+              <w:bidi w:val="0"/>
+            </w:pPr>
             <w:r>
               <w:rPr>
                 <w:sz w:val="20"/>
@@ -3358,6 +3976,9 @@
             <w:tcW w:w="3324" w:type="dxa"/>
           </w:tcPr>
           <w:p>
+            <w:pPr>
+              <w:bidi w:val="0"/>
+            </w:pPr>
             <w:r>
               <w:rPr>
                 <w:sz w:val="20"/>
@@ -3371,6 +3992,9 @@
             <w:tcW w:w="3324" w:type="dxa"/>
           </w:tcPr>
           <w:p>
+            <w:pPr>
+              <w:bidi w:val="0"/>
+            </w:pPr>
             <w:r>
               <w:rPr>
                 <w:sz w:val="20"/>
@@ -3389,10 +4013,14 @@
             <w:tcW w:w="3324" w:type="dxa"/>
           </w:tcPr>
           <w:p>
-            <w:r>
-              <w:rPr>
-                <w:sz w:val="20"/>
-              </w:rPr>
+            <w:pPr>
+              <w:bidi w:val="0"/>
+            </w:pPr>
+            <w:r>
+              <w:rPr>
+                <w:sz w:val="20"/>
+              </w:rPr>
+              <w:lastRenderedPageBreak/>
               <w:t>צילומי מסך של הזרימה המלאה</w:t>
             </w:r>
           </w:p>
@@ -3402,6 +4030,9 @@
             <w:tcW w:w="3324" w:type="dxa"/>
           </w:tcPr>
           <w:p>
+            <w:pPr>
+              <w:bidi w:val="0"/>
+            </w:pPr>
             <w:r>
               <w:rPr>
                 <w:sz w:val="20"/>
@@ -3415,6 +4046,9 @@
             <w:tcW w:w="3324" w:type="dxa"/>
           </w:tcPr>
           <w:p>
+            <w:pPr>
+              <w:bidi w:val="0"/>
+            </w:pPr>
             <w:r>
               <w:rPr>
                 <w:sz w:val="20"/>
@@ -3433,6 +4067,9 @@
             <w:tcW w:w="3324" w:type="dxa"/>
           </w:tcPr>
           <w:p>
+            <w:pPr>
+              <w:bidi w:val="0"/>
+            </w:pPr>
             <w:r>
               <w:rPr>
                 <w:sz w:val="20"/>
@@ -3446,6 +4083,9 @@
             <w:tcW w:w="3324" w:type="dxa"/>
           </w:tcPr>
           <w:p>
+            <w:pPr>
+              <w:bidi w:val="0"/>
+            </w:pPr>
             <w:r>
               <w:rPr>
                 <w:sz w:val="20"/>
@@ -3459,6 +4099,9 @@
             <w:tcW w:w="3324" w:type="dxa"/>
           </w:tcPr>
           <w:p>
+            <w:pPr>
+              <w:bidi w:val="0"/>
+            </w:pPr>
             <w:r>
               <w:rPr>
                 <w:sz w:val="20"/>
@@ -3477,6 +4120,9 @@
             <w:tcW w:w="3324" w:type="dxa"/>
           </w:tcPr>
           <w:p>
+            <w:pPr>
+              <w:bidi w:val="0"/>
+            </w:pPr>
             <w:r>
               <w:rPr>
                 <w:sz w:val="20"/>
@@ -3490,6 +4136,9 @@
             <w:tcW w:w="3324" w:type="dxa"/>
           </w:tcPr>
           <w:p>
+            <w:pPr>
+              <w:bidi w:val="0"/>
+            </w:pPr>
             <w:r>
               <w:rPr>
                 <w:sz w:val="20"/>
@@ -3503,6 +4152,9 @@
             <w:tcW w:w="3324" w:type="dxa"/>
           </w:tcPr>
           <w:p>
+            <w:pPr>
+              <w:bidi w:val="0"/>
+            </w:pPr>
             <w:r>
               <w:rPr>
                 <w:sz w:val="20"/>
@@ -3515,6 +4167,7 @@
     </w:tbl>
     <w:p>
       <w:pPr>
+        <w:bidi w:val="0"/>
         <w:spacing w:before="40" w:after="80" w:line="240" w:lineRule="auto"/>
       </w:pPr>
       <w:r>
@@ -3547,6 +4200,7 @@
           <w:right w:val="single" w:sz="18" w:space="4" w:color="F5A623"/>
         </w:pBdr>
         <w:shd w:val="clear" w:color="auto" w:fill="FFF8E1"/>
+        <w:bidi w:val="0"/>
         <w:spacing w:before="80" w:after="80" w:line="240" w:lineRule="auto"/>
         <w:ind w:left="170" w:right="170"/>
       </w:pPr>
@@ -3580,6 +4234,9 @@
             <w:shd w:val="clear" w:color="auto" w:fill="EAF2FD"/>
           </w:tcPr>
           <w:p>
+            <w:pPr>
+              <w:bidi w:val="0"/>
+            </w:pPr>
             <w:r>
               <w:rPr>
                 <w:b/>
@@ -3595,6 +4252,9 @@
             <w:shd w:val="clear" w:color="auto" w:fill="EAF2FD"/>
           </w:tcPr>
           <w:p>
+            <w:pPr>
+              <w:bidi w:val="0"/>
+            </w:pPr>
             <w:r>
               <w:rPr>
                 <w:b/>
@@ -3610,6 +4270,9 @@
             <w:shd w:val="clear" w:color="auto" w:fill="EAF2FD"/>
           </w:tcPr>
           <w:p>
+            <w:pPr>
+              <w:bidi w:val="0"/>
+            </w:pPr>
             <w:r>
               <w:rPr>
                 <w:b/>
@@ -3629,6 +4292,9 @@
             <w:tcW w:w="3324" w:type="dxa"/>
           </w:tcPr>
           <w:p>
+            <w:pPr>
+              <w:bidi w:val="0"/>
+            </w:pPr>
             <w:r>
               <w:rPr>
                 <w:sz w:val="20"/>
@@ -3642,6 +4308,9 @@
             <w:tcW w:w="3324" w:type="dxa"/>
           </w:tcPr>
           <w:p>
+            <w:pPr>
+              <w:bidi w:val="0"/>
+            </w:pPr>
             <w:r>
               <w:rPr>
                 <w:sz w:val="20"/>
@@ -3655,6 +4324,9 @@
             <w:tcW w:w="3324" w:type="dxa"/>
           </w:tcPr>
           <w:p>
+            <w:pPr>
+              <w:bidi w:val="0"/>
+            </w:pPr>
             <w:r>
               <w:rPr>
                 <w:sz w:val="20"/>
@@ -3673,6 +4345,9 @@
             <w:tcW w:w="3324" w:type="dxa"/>
           </w:tcPr>
           <w:p>
+            <w:pPr>
+              <w:bidi w:val="0"/>
+            </w:pPr>
             <w:r>
               <w:rPr>
                 <w:sz w:val="20"/>
@@ -3686,6 +4361,9 @@
             <w:tcW w:w="3324" w:type="dxa"/>
           </w:tcPr>
           <w:p>
+            <w:pPr>
+              <w:bidi w:val="0"/>
+            </w:pPr>
             <w:r>
               <w:rPr>
                 <w:sz w:val="20"/>
@@ -3699,6 +4377,9 @@
             <w:tcW w:w="3324" w:type="dxa"/>
           </w:tcPr>
           <w:p>
+            <w:pPr>
+              <w:bidi w:val="0"/>
+            </w:pPr>
             <w:r>
               <w:rPr>
                 <w:sz w:val="20"/>
@@ -3717,6 +4398,9 @@
             <w:tcW w:w="3324" w:type="dxa"/>
           </w:tcPr>
           <w:p>
+            <w:pPr>
+              <w:bidi w:val="0"/>
+            </w:pPr>
             <w:r>
               <w:rPr>
                 <w:sz w:val="20"/>
@@ -3730,6 +4414,9 @@
             <w:tcW w:w="3324" w:type="dxa"/>
           </w:tcPr>
           <w:p>
+            <w:pPr>
+              <w:bidi w:val="0"/>
+            </w:pPr>
             <w:r>
               <w:rPr>
                 <w:sz w:val="20"/>
@@ -3743,6 +4430,9 @@
             <w:tcW w:w="3324" w:type="dxa"/>
           </w:tcPr>
           <w:p>
+            <w:pPr>
+              <w:bidi w:val="0"/>
+            </w:pPr>
             <w:r>
               <w:rPr>
                 <w:sz w:val="20"/>
@@ -3755,6 +4445,7 @@
     </w:tbl>
     <w:p>
       <w:pPr>
+        <w:bidi w:val="0"/>
         <w:spacing w:before="40" w:after="80" w:line="240" w:lineRule="auto"/>
       </w:pPr>
       <w:r>
@@ -3800,6 +4491,9 @@
             <w:shd w:val="clear" w:color="auto" w:fill="EAF2FD"/>
           </w:tcPr>
           <w:p>
+            <w:pPr>
+              <w:bidi w:val="0"/>
+            </w:pPr>
             <w:r>
               <w:rPr>
                 <w:b/>
@@ -3815,6 +4509,9 @@
             <w:shd w:val="clear" w:color="auto" w:fill="EAF2FD"/>
           </w:tcPr>
           <w:p>
+            <w:pPr>
+              <w:bidi w:val="0"/>
+            </w:pPr>
             <w:r>
               <w:rPr>
                 <w:b/>
@@ -3830,6 +4527,9 @@
             <w:shd w:val="clear" w:color="auto" w:fill="EAF2FD"/>
           </w:tcPr>
           <w:p>
+            <w:pPr>
+              <w:bidi w:val="0"/>
+            </w:pPr>
             <w:r>
               <w:rPr>
                 <w:b/>
@@ -3849,6 +4549,9 @@
             <w:tcW w:w="3324" w:type="dxa"/>
           </w:tcPr>
           <w:p>
+            <w:pPr>
+              <w:bidi w:val="0"/>
+            </w:pPr>
             <w:r>
               <w:rPr>
                 <w:sz w:val="20"/>
@@ -3862,6 +4565,9 @@
             <w:tcW w:w="3324" w:type="dxa"/>
           </w:tcPr>
           <w:p>
+            <w:pPr>
+              <w:bidi w:val="0"/>
+            </w:pPr>
             <w:r>
               <w:rPr>
                 <w:sz w:val="20"/>
@@ -3875,6 +4581,9 @@
             <w:tcW w:w="3324" w:type="dxa"/>
           </w:tcPr>
           <w:p>
+            <w:pPr>
+              <w:bidi w:val="0"/>
+            </w:pPr>
             <w:r>
               <w:rPr>
                 <w:sz w:val="20"/>
@@ -3887,6 +4596,7 @@
     </w:tbl>
     <w:p>
       <w:pPr>
+        <w:bidi w:val="0"/>
         <w:spacing w:before="40" w:after="80" w:line="240" w:lineRule="auto"/>
       </w:pPr>
       <w:r>
@@ -3932,6 +4642,9 @@
             <w:shd w:val="clear" w:color="auto" w:fill="EAF2FD"/>
           </w:tcPr>
           <w:p>
+            <w:pPr>
+              <w:bidi w:val="0"/>
+            </w:pPr>
             <w:r>
               <w:rPr>
                 <w:b/>
@@ -3947,6 +4660,9 @@
             <w:shd w:val="clear" w:color="auto" w:fill="EAF2FD"/>
           </w:tcPr>
           <w:p>
+            <w:pPr>
+              <w:bidi w:val="0"/>
+            </w:pPr>
             <w:r>
               <w:rPr>
                 <w:b/>
@@ -3962,6 +4678,9 @@
             <w:shd w:val="clear" w:color="auto" w:fill="EAF2FD"/>
           </w:tcPr>
           <w:p>
+            <w:pPr>
+              <w:bidi w:val="0"/>
+            </w:pPr>
             <w:r>
               <w:rPr>
                 <w:b/>
@@ -3981,6 +4700,9 @@
             <w:tcW w:w="3324" w:type="dxa"/>
           </w:tcPr>
           <w:p>
+            <w:pPr>
+              <w:bidi w:val="0"/>
+            </w:pPr>
             <w:r>
               <w:rPr>
                 <w:sz w:val="20"/>
@@ -3994,6 +4716,9 @@
             <w:tcW w:w="3324" w:type="dxa"/>
           </w:tcPr>
           <w:p>
+            <w:pPr>
+              <w:bidi w:val="0"/>
+            </w:pPr>
             <w:r>
               <w:rPr>
                 <w:sz w:val="20"/>
@@ -4007,6 +4732,9 @@
             <w:tcW w:w="3324" w:type="dxa"/>
           </w:tcPr>
           <w:p>
+            <w:pPr>
+              <w:bidi w:val="0"/>
+            </w:pPr>
             <w:r>
               <w:rPr>
                 <w:sz w:val="20"/>
@@ -4025,6 +4753,9 @@
             <w:tcW w:w="3324" w:type="dxa"/>
           </w:tcPr>
           <w:p>
+            <w:pPr>
+              <w:bidi w:val="0"/>
+            </w:pPr>
             <w:r>
               <w:rPr>
                 <w:sz w:val="20"/>
@@ -4038,6 +4769,9 @@
             <w:tcW w:w="3324" w:type="dxa"/>
           </w:tcPr>
           <w:p>
+            <w:pPr>
+              <w:bidi w:val="0"/>
+            </w:pPr>
             <w:r>
               <w:rPr>
                 <w:sz w:val="20"/>
@@ -4051,6 +4785,9 @@
             <w:tcW w:w="3324" w:type="dxa"/>
           </w:tcPr>
           <w:p>
+            <w:pPr>
+              <w:bidi w:val="0"/>
+            </w:pPr>
             <w:r>
               <w:rPr>
                 <w:sz w:val="20"/>
@@ -4069,6 +4806,9 @@
             <w:tcW w:w="3324" w:type="dxa"/>
           </w:tcPr>
           <w:p>
+            <w:pPr>
+              <w:bidi w:val="0"/>
+            </w:pPr>
             <w:r>
               <w:rPr>
                 <w:sz w:val="20"/>
@@ -4082,6 +4822,9 @@
             <w:tcW w:w="3324" w:type="dxa"/>
           </w:tcPr>
           <w:p>
+            <w:pPr>
+              <w:bidi w:val="0"/>
+            </w:pPr>
             <w:r>
               <w:rPr>
                 <w:sz w:val="20"/>
@@ -4095,6 +4838,9 @@
             <w:tcW w:w="3324" w:type="dxa"/>
           </w:tcPr>
           <w:p>
+            <w:pPr>
+              <w:bidi w:val="0"/>
+            </w:pPr>
             <w:r>
               <w:rPr>
                 <w:sz w:val="20"/>
@@ -4115,6 +4861,7 @@
         <w:rPr>
           <w:rFonts w:ascii="Arial" w:hAnsi="Arial"/>
         </w:rPr>
+        <w:lastRenderedPageBreak/>
         <w:t>בונוס — עד 10%</w:t>
       </w:r>
     </w:p>
@@ -4140,6 +4887,9 @@
             <w:shd w:val="clear" w:color="auto" w:fill="EAF2FD"/>
           </w:tcPr>
           <w:p>
+            <w:pPr>
+              <w:bidi w:val="0"/>
+            </w:pPr>
             <w:r>
               <w:rPr>
                 <w:b/>
@@ -4155,6 +4905,9 @@
             <w:shd w:val="clear" w:color="auto" w:fill="EAF2FD"/>
           </w:tcPr>
           <w:p>
+            <w:pPr>
+              <w:bidi w:val="0"/>
+            </w:pPr>
             <w:r>
               <w:rPr>
                 <w:b/>
@@ -4170,6 +4923,9 @@
             <w:shd w:val="clear" w:color="auto" w:fill="EAF2FD"/>
           </w:tcPr>
           <w:p>
+            <w:pPr>
+              <w:bidi w:val="0"/>
+            </w:pPr>
             <w:r>
               <w:rPr>
                 <w:b/>
@@ -4189,6 +4945,9 @@
             <w:tcW w:w="3324" w:type="dxa"/>
           </w:tcPr>
           <w:p>
+            <w:pPr>
+              <w:bidi w:val="0"/>
+            </w:pPr>
             <w:r>
               <w:rPr>
                 <w:sz w:val="20"/>
@@ -4202,6 +4961,9 @@
             <w:tcW w:w="3324" w:type="dxa"/>
           </w:tcPr>
           <w:p>
+            <w:pPr>
+              <w:bidi w:val="0"/>
+            </w:pPr>
             <w:r>
               <w:rPr>
                 <w:sz w:val="20"/>
@@ -4215,6 +4977,9 @@
             <w:tcW w:w="3324" w:type="dxa"/>
           </w:tcPr>
           <w:p>
+            <w:pPr>
+              <w:bidi w:val="0"/>
+            </w:pPr>
             <w:r>
               <w:rPr>
                 <w:sz w:val="20"/>
@@ -4233,6 +4998,9 @@
             <w:tcW w:w="3324" w:type="dxa"/>
           </w:tcPr>
           <w:p>
+            <w:pPr>
+              <w:bidi w:val="0"/>
+            </w:pPr>
             <w:r>
               <w:rPr>
                 <w:sz w:val="20"/>
@@ -4246,6 +5014,9 @@
             <w:tcW w:w="3324" w:type="dxa"/>
           </w:tcPr>
           <w:p>
+            <w:pPr>
+              <w:bidi w:val="0"/>
+            </w:pPr>
             <w:r>
               <w:rPr>
                 <w:sz w:val="20"/>
@@ -4259,6 +5030,9 @@
             <w:tcW w:w="3324" w:type="dxa"/>
           </w:tcPr>
           <w:p>
+            <w:pPr>
+              <w:bidi w:val="0"/>
+            </w:pPr>
             <w:r>
               <w:rPr>
                 <w:sz w:val="20"/>
@@ -4277,6 +5051,9 @@
             <w:tcW w:w="3324" w:type="dxa"/>
           </w:tcPr>
           <w:p>
+            <w:pPr>
+              <w:bidi w:val="0"/>
+            </w:pPr>
             <w:r>
               <w:rPr>
                 <w:sz w:val="20"/>
@@ -4290,6 +5067,9 @@
             <w:tcW w:w="3324" w:type="dxa"/>
           </w:tcPr>
           <w:p>
+            <w:pPr>
+              <w:bidi w:val="0"/>
+            </w:pPr>
             <w:r>
               <w:rPr>
                 <w:sz w:val="20"/>
@@ -4303,6 +5083,9 @@
             <w:tcW w:w="3324" w:type="dxa"/>
           </w:tcPr>
           <w:p>
+            <w:pPr>
+              <w:bidi w:val="0"/>
+            </w:pPr>
             <w:r>
               <w:rPr>
                 <w:sz w:val="20"/>
@@ -4315,6 +5098,7 @@
     </w:tbl>
     <w:p>
       <w:pPr>
+        <w:bidi w:val="0"/>
         <w:spacing w:before="40" w:after="80" w:line="240" w:lineRule="auto"/>
       </w:pPr>
       <w:r>
@@ -4326,6 +5110,9 @@
       </w:r>
     </w:p>
     <w:p>
+      <w:pPr>
+        <w:bidi w:val="0"/>
+      </w:pPr>
       <w:r>
         <w:br w:type="page"/>
       </w:r>
@@ -4340,6 +5127,7 @@
         <w:rPr>
           <w:rFonts w:ascii="Arial" w:hAnsi="Arial"/>
         </w:rPr>
+        <w:lastRenderedPageBreak/>
         <w:t>חישוב ציון סופי</w:t>
       </w:r>
     </w:p>
@@ -4365,6 +5153,9 @@
             <w:shd w:val="clear" w:color="auto" w:fill="EAF2FD"/>
           </w:tcPr>
           <w:p>
+            <w:pPr>
+              <w:bidi w:val="0"/>
+            </w:pPr>
             <w:r>
               <w:rPr>
                 <w:b/>
@@ -4380,6 +5171,9 @@
             <w:shd w:val="clear" w:color="auto" w:fill="EAF2FD"/>
           </w:tcPr>
           <w:p>
+            <w:pPr>
+              <w:bidi w:val="0"/>
+            </w:pPr>
             <w:r>
               <w:rPr>
                 <w:b/>
@@ -4395,6 +5189,9 @@
             <w:shd w:val="clear" w:color="auto" w:fill="EAF2FD"/>
           </w:tcPr>
           <w:p>
+            <w:pPr>
+              <w:bidi w:val="0"/>
+            </w:pPr>
             <w:r>
               <w:rPr>
                 <w:b/>
@@ -4414,6 +5211,9 @@
             <w:tcW w:w="3324" w:type="dxa"/>
           </w:tcPr>
           <w:p>
+            <w:pPr>
+              <w:bidi w:val="0"/>
+            </w:pPr>
             <w:r>
               <w:rPr>
                 <w:sz w:val="20"/>
@@ -4427,6 +5227,9 @@
             <w:tcW w:w="3324" w:type="dxa"/>
           </w:tcPr>
           <w:p>
+            <w:pPr>
+              <w:bidi w:val="0"/>
+            </w:pPr>
             <w:r>
               <w:rPr>
                 <w:sz w:val="20"/>
@@ -4440,6 +5243,9 @@
             <w:tcW w:w="3324" w:type="dxa"/>
           </w:tcPr>
           <w:p>
+            <w:pPr>
+              <w:bidi w:val="0"/>
+            </w:pPr>
             <w:r>
               <w:rPr>
                 <w:sz w:val="20"/>
@@ -4458,6 +5264,9 @@
             <w:tcW w:w="3324" w:type="dxa"/>
           </w:tcPr>
           <w:p>
+            <w:pPr>
+              <w:bidi w:val="0"/>
+            </w:pPr>
             <w:r>
               <w:rPr>
                 <w:sz w:val="20"/>
@@ -4471,6 +5280,9 @@
             <w:tcW w:w="3324" w:type="dxa"/>
           </w:tcPr>
           <w:p>
+            <w:pPr>
+              <w:bidi w:val="0"/>
+            </w:pPr>
             <w:r>
               <w:rPr>
                 <w:sz w:val="20"/>
@@ -4484,6 +5296,9 @@
             <w:tcW w:w="3324" w:type="dxa"/>
           </w:tcPr>
           <w:p>
+            <w:pPr>
+              <w:bidi w:val="0"/>
+            </w:pPr>
             <w:r>
               <w:rPr>
                 <w:sz w:val="20"/>
@@ -4502,6 +5317,9 @@
             <w:tcW w:w="3324" w:type="dxa"/>
           </w:tcPr>
           <w:p>
+            <w:pPr>
+              <w:bidi w:val="0"/>
+            </w:pPr>
             <w:r>
               <w:rPr>
                 <w:sz w:val="20"/>
@@ -4515,6 +5333,9 @@
             <w:tcW w:w="3324" w:type="dxa"/>
           </w:tcPr>
           <w:p>
+            <w:pPr>
+              <w:bidi w:val="0"/>
+            </w:pPr>
             <w:r>
               <w:rPr>
                 <w:sz w:val="20"/>
@@ -4528,6 +5349,9 @@
             <w:tcW w:w="3324" w:type="dxa"/>
           </w:tcPr>
           <w:p>
+            <w:pPr>
+              <w:bidi w:val="0"/>
+            </w:pPr>
             <w:r>
               <w:rPr>
                 <w:sz w:val="20"/>
@@ -4546,6 +5370,9 @@
             <w:tcW w:w="3324" w:type="dxa"/>
           </w:tcPr>
           <w:p>
+            <w:pPr>
+              <w:bidi w:val="0"/>
+            </w:pPr>
             <w:r>
               <w:rPr>
                 <w:sz w:val="20"/>
@@ -4559,6 +5386,9 @@
             <w:tcW w:w="3324" w:type="dxa"/>
           </w:tcPr>
           <w:p>
+            <w:pPr>
+              <w:bidi w:val="0"/>
+            </w:pPr>
             <w:r>
               <w:rPr>
                 <w:sz w:val="20"/>
@@ -4572,6 +5402,9 @@
             <w:tcW w:w="3324" w:type="dxa"/>
           </w:tcPr>
           <w:p>
+            <w:pPr>
+              <w:bidi w:val="0"/>
+            </w:pPr>
             <w:r>
               <w:rPr>
                 <w:sz w:val="20"/>
@@ -4590,6 +5423,9 @@
             <w:tcW w:w="3324" w:type="dxa"/>
           </w:tcPr>
           <w:p>
+            <w:pPr>
+              <w:bidi w:val="0"/>
+            </w:pPr>
             <w:r>
               <w:rPr>
                 <w:sz w:val="20"/>
@@ -4603,6 +5439,9 @@
             <w:tcW w:w="3324" w:type="dxa"/>
           </w:tcPr>
           <w:p>
+            <w:pPr>
+              <w:bidi w:val="0"/>
+            </w:pPr>
             <w:r>
               <w:rPr>
                 <w:sz w:val="20"/>
@@ -4616,6 +5455,9 @@
             <w:tcW w:w="3324" w:type="dxa"/>
           </w:tcPr>
           <w:p>
+            <w:pPr>
+              <w:bidi w:val="0"/>
+            </w:pPr>
             <w:r>
               <w:rPr>
                 <w:sz w:val="20"/>
@@ -4634,6 +5476,9 @@
             <w:tcW w:w="3324" w:type="dxa"/>
           </w:tcPr>
           <w:p>
+            <w:pPr>
+              <w:bidi w:val="0"/>
+            </w:pPr>
             <w:r>
               <w:rPr>
                 <w:sz w:val="20"/>
@@ -4647,6 +5492,9 @@
             <w:tcW w:w="3324" w:type="dxa"/>
           </w:tcPr>
           <w:p>
+            <w:pPr>
+              <w:bidi w:val="0"/>
+            </w:pPr>
             <w:r>
               <w:rPr>
                 <w:sz w:val="20"/>
@@ -4660,6 +5508,9 @@
             <w:tcW w:w="3324" w:type="dxa"/>
           </w:tcPr>
           <w:p>
+            <w:pPr>
+              <w:bidi w:val="0"/>
+            </w:pPr>
             <w:r>
               <w:rPr>
                 <w:sz w:val="20"/>
@@ -4678,6 +5529,9 @@
             <w:tcW w:w="3324" w:type="dxa"/>
           </w:tcPr>
           <w:p>
+            <w:pPr>
+              <w:bidi w:val="0"/>
+            </w:pPr>
             <w:r>
               <w:rPr>
                 <w:sz w:val="20"/>
@@ -4691,6 +5545,9 @@
             <w:tcW w:w="3324" w:type="dxa"/>
           </w:tcPr>
           <w:p>
+            <w:pPr>
+              <w:bidi w:val="0"/>
+            </w:pPr>
             <w:r>
               <w:rPr>
                 <w:sz w:val="20"/>
@@ -4704,6 +5561,9 @@
             <w:tcW w:w="3324" w:type="dxa"/>
           </w:tcPr>
           <w:p>
+            <w:pPr>
+              <w:bidi w:val="0"/>
+            </w:pPr>
             <w:r>
               <w:rPr>
                 <w:sz w:val="20"/>
@@ -4722,6 +5582,9 @@
             <w:tcW w:w="3324" w:type="dxa"/>
           </w:tcPr>
           <w:p>
+            <w:pPr>
+              <w:bidi w:val="0"/>
+            </w:pPr>
             <w:r>
               <w:rPr>
                 <w:sz w:val="20"/>
@@ -4735,6 +5598,9 @@
             <w:tcW w:w="3324" w:type="dxa"/>
           </w:tcPr>
           <w:p>
+            <w:pPr>
+              <w:bidi w:val="0"/>
+            </w:pPr>
             <w:r>
               <w:rPr>
                 <w:sz w:val="20"/>
@@ -4748,6 +5614,9 @@
             <w:tcW w:w="3324" w:type="dxa"/>
           </w:tcPr>
           <w:p>
+            <w:pPr>
+              <w:bidi w:val="0"/>
+            </w:pPr>
             <w:r>
               <w:rPr>
                 <w:sz w:val="20"/>
@@ -4766,6 +5635,9 @@
             <w:tcW w:w="3324" w:type="dxa"/>
           </w:tcPr>
           <w:p>
+            <w:pPr>
+              <w:bidi w:val="0"/>
+            </w:pPr>
             <w:r>
               <w:rPr>
                 <w:sz w:val="20"/>
@@ -4779,6 +5651,9 @@
             <w:tcW w:w="3324" w:type="dxa"/>
           </w:tcPr>
           <w:p>
+            <w:pPr>
+              <w:bidi w:val="0"/>
+            </w:pPr>
             <w:r>
               <w:rPr>
                 <w:sz w:val="20"/>
@@ -4792,6 +5667,9 @@
             <w:tcW w:w="3324" w:type="dxa"/>
           </w:tcPr>
           <w:p>
+            <w:pPr>
+              <w:bidi w:val="0"/>
+            </w:pPr>
             <w:r>
               <w:rPr>
                 <w:sz w:val="20"/>
@@ -4810,6 +5688,9 @@
             <w:tcW w:w="3324" w:type="dxa"/>
           </w:tcPr>
           <w:p>
+            <w:pPr>
+              <w:bidi w:val="0"/>
+            </w:pPr>
             <w:r>
               <w:rPr>
                 <w:sz w:val="20"/>
@@ -4823,6 +5704,9 @@
             <w:tcW w:w="3324" w:type="dxa"/>
           </w:tcPr>
           <w:p>
+            <w:pPr>
+              <w:bidi w:val="0"/>
+            </w:pPr>
             <w:r>
               <w:rPr>
                 <w:sz w:val="20"/>
@@ -4836,6 +5720,9 @@
             <w:tcW w:w="3324" w:type="dxa"/>
           </w:tcPr>
           <w:p>
+            <w:pPr>
+              <w:bidi w:val="0"/>
+            </w:pPr>
             <w:r>
               <w:rPr>
                 <w:sz w:val="20"/>
@@ -4854,6 +5741,9 @@
             <w:tcW w:w="3324" w:type="dxa"/>
           </w:tcPr>
           <w:p>
+            <w:pPr>
+              <w:bidi w:val="0"/>
+            </w:pPr>
             <w:r>
               <w:rPr>
                 <w:sz w:val="20"/>
@@ -4867,6 +5757,9 @@
             <w:tcW w:w="3324" w:type="dxa"/>
           </w:tcPr>
           <w:p>
+            <w:pPr>
+              <w:bidi w:val="0"/>
+            </w:pPr>
             <w:r>
               <w:rPr>
                 <w:sz w:val="20"/>
@@ -4880,6 +5773,9 @@
             <w:tcW w:w="3324" w:type="dxa"/>
           </w:tcPr>
           <w:p>
+            <w:pPr>
+              <w:bidi w:val="0"/>
+            </w:pPr>
             <w:r>
               <w:rPr>
                 <w:sz w:val="20"/>
@@ -4898,6 +5794,9 @@
             <w:tcW w:w="3324" w:type="dxa"/>
           </w:tcPr>
           <w:p>
+            <w:pPr>
+              <w:bidi w:val="0"/>
+            </w:pPr>
             <w:r>
               <w:rPr>
                 <w:sz w:val="20"/>
@@ -4911,6 +5810,9 @@
             <w:tcW w:w="3324" w:type="dxa"/>
           </w:tcPr>
           <w:p>
+            <w:pPr>
+              <w:bidi w:val="0"/>
+            </w:pPr>
             <w:r>
               <w:rPr>
                 <w:sz w:val="20"/>
@@ -4924,6 +5826,9 @@
             <w:tcW w:w="3324" w:type="dxa"/>
           </w:tcPr>
           <w:p>
+            <w:pPr>
+              <w:bidi w:val="0"/>
+            </w:pPr>
             <w:r>
               <w:rPr>
                 <w:sz w:val="20"/>
@@ -4935,6 +5840,9 @@
       </w:tr>
     </w:tbl>
     <w:p>
+      <w:pPr>
+        <w:bidi w:val="0"/>
+      </w:pPr>
       <w:r>
         <w:br w:type="page"/>
       </w:r>
@@ -4949,6 +5857,7 @@
         <w:rPr>
           <w:rFonts w:ascii="Arial" w:hAnsi="Arial"/>
         </w:rPr>
+        <w:lastRenderedPageBreak/>
         <w:t>חלק ב' (אחר) — מחוון לבדיקת הפרויקט בזמן הבחינה</w:t>
       </w:r>
     </w:p>
@@ -4961,6 +5870,7 @@
           <w:right w:val="single" w:sz="18" w:space="4" w:color="F5A623"/>
         </w:pBdr>
         <w:shd w:val="clear" w:color="auto" w:fill="FFF8E1"/>
+        <w:bidi w:val="0"/>
         <w:spacing w:before="80" w:after="80" w:line="240" w:lineRule="auto"/>
         <w:ind w:left="170" w:right="170"/>
       </w:pPr>
@@ -4996,6 +5906,9 @@
             <w:shd w:val="clear" w:color="auto" w:fill="EAF2FD"/>
           </w:tcPr>
           <w:p>
+            <w:pPr>
+              <w:bidi w:val="0"/>
+            </w:pPr>
             <w:r>
               <w:rPr>
                 <w:b/>
@@ -5011,6 +5924,9 @@
             <w:shd w:val="clear" w:color="auto" w:fill="EAF2FD"/>
           </w:tcPr>
           <w:p>
+            <w:pPr>
+              <w:bidi w:val="0"/>
+            </w:pPr>
             <w:r>
               <w:rPr>
                 <w:b/>
@@ -5026,6 +5942,9 @@
             <w:shd w:val="clear" w:color="auto" w:fill="EAF2FD"/>
           </w:tcPr>
           <w:p>
+            <w:pPr>
+              <w:bidi w:val="0"/>
+            </w:pPr>
             <w:r>
               <w:rPr>
                 <w:b/>
@@ -5041,6 +5960,9 @@
             <w:shd w:val="clear" w:color="auto" w:fill="EAF2FD"/>
           </w:tcPr>
           <w:p>
+            <w:pPr>
+              <w:bidi w:val="0"/>
+            </w:pPr>
             <w:r>
               <w:rPr>
                 <w:b/>
@@ -5056,6 +5978,9 @@
             <w:shd w:val="clear" w:color="auto" w:fill="EAF2FD"/>
           </w:tcPr>
           <w:p>
+            <w:pPr>
+              <w:bidi w:val="0"/>
+            </w:pPr>
             <w:r>
               <w:rPr>
                 <w:b/>
@@ -5075,6 +6000,9 @@
             <w:tcW w:w="1994" w:type="dxa"/>
           </w:tcPr>
           <w:p>
+            <w:pPr>
+              <w:bidi w:val="0"/>
+            </w:pPr>
             <w:r>
               <w:rPr>
                 <w:sz w:val="20"/>
@@ -5088,6 +6016,9 @@
             <w:tcW w:w="1994" w:type="dxa"/>
           </w:tcPr>
           <w:p>
+            <w:pPr>
+              <w:bidi w:val="0"/>
+            </w:pPr>
             <w:r>
               <w:rPr>
                 <w:sz w:val="20"/>
@@ -5101,6 +6032,9 @@
             <w:tcW w:w="1994" w:type="dxa"/>
           </w:tcPr>
           <w:p>
+            <w:pPr>
+              <w:bidi w:val="0"/>
+            </w:pPr>
             <w:r>
               <w:rPr>
                 <w:sz w:val="20"/>
@@ -5114,6 +6048,9 @@
             <w:tcW w:w="1994" w:type="dxa"/>
           </w:tcPr>
           <w:p>
+            <w:pPr>
+              <w:bidi w:val="0"/>
+            </w:pPr>
             <w:r>
               <w:rPr>
                 <w:sz w:val="20"/>
@@ -5127,6 +6064,9 @@
             <w:tcW w:w="1994" w:type="dxa"/>
           </w:tcPr>
           <w:p>
+            <w:pPr>
+              <w:bidi w:val="0"/>
+            </w:pPr>
             <w:r>
               <w:rPr>
                 <w:sz w:val="20"/>
@@ -5145,6 +6085,9 @@
             <w:tcW w:w="1994" w:type="dxa"/>
           </w:tcPr>
           <w:p>
+            <w:pPr>
+              <w:bidi w:val="0"/>
+            </w:pPr>
             <w:r>
               <w:rPr>
                 <w:sz w:val="20"/>
@@ -5158,6 +6101,9 @@
             <w:tcW w:w="1994" w:type="dxa"/>
           </w:tcPr>
           <w:p>
+            <w:pPr>
+              <w:bidi w:val="0"/>
+            </w:pPr>
             <w:r>
               <w:rPr>
                 <w:sz w:val="20"/>
@@ -5171,6 +6117,9 @@
             <w:tcW w:w="1994" w:type="dxa"/>
           </w:tcPr>
           <w:p>
+            <w:pPr>
+              <w:bidi w:val="0"/>
+            </w:pPr>
             <w:r>
               <w:rPr>
                 <w:sz w:val="20"/>
@@ -5184,6 +6133,9 @@
             <w:tcW w:w="1994" w:type="dxa"/>
           </w:tcPr>
           <w:p>
+            <w:pPr>
+              <w:bidi w:val="0"/>
+            </w:pPr>
             <w:r>
               <w:rPr>
                 <w:sz w:val="20"/>
@@ -5197,6 +6149,9 @@
             <w:tcW w:w="1994" w:type="dxa"/>
           </w:tcPr>
           <w:p>
+            <w:pPr>
+              <w:bidi w:val="0"/>
+            </w:pPr>
             <w:r>
               <w:rPr>
                 <w:sz w:val="20"/>
@@ -5215,6 +6170,9 @@
             <w:tcW w:w="1994" w:type="dxa"/>
           </w:tcPr>
           <w:p>
+            <w:pPr>
+              <w:bidi w:val="0"/>
+            </w:pPr>
             <w:r>
               <w:rPr>
                 <w:sz w:val="20"/>
@@ -5228,6 +6186,9 @@
             <w:tcW w:w="1994" w:type="dxa"/>
           </w:tcPr>
           <w:p>
+            <w:pPr>
+              <w:bidi w:val="0"/>
+            </w:pPr>
             <w:r>
               <w:rPr>
                 <w:sz w:val="20"/>
@@ -5241,6 +6202,9 @@
             <w:tcW w:w="1994" w:type="dxa"/>
           </w:tcPr>
           <w:p>
+            <w:pPr>
+              <w:bidi w:val="0"/>
+            </w:pPr>
             <w:r>
               <w:rPr>
                 <w:sz w:val="20"/>
@@ -5254,6 +6218,9 @@
             <w:tcW w:w="1994" w:type="dxa"/>
           </w:tcPr>
           <w:p>
+            <w:pPr>
+              <w:bidi w:val="0"/>
+            </w:pPr>
             <w:r>
               <w:rPr>
                 <w:sz w:val="20"/>
@@ -5267,6 +6234,9 @@
             <w:tcW w:w="1994" w:type="dxa"/>
           </w:tcPr>
           <w:p>
+            <w:pPr>
+              <w:bidi w:val="0"/>
+            </w:pPr>
             <w:r>
               <w:rPr>
                 <w:sz w:val="20"/>
@@ -5285,6 +6255,9 @@
             <w:tcW w:w="1994" w:type="dxa"/>
           </w:tcPr>
           <w:p>
+            <w:pPr>
+              <w:bidi w:val="0"/>
+            </w:pPr>
             <w:r>
               <w:rPr>
                 <w:sz w:val="20"/>
@@ -5298,6 +6271,9 @@
             <w:tcW w:w="1994" w:type="dxa"/>
           </w:tcPr>
           <w:p>
+            <w:pPr>
+              <w:bidi w:val="0"/>
+            </w:pPr>
             <w:r>
               <w:rPr>
                 <w:sz w:val="20"/>
@@ -5311,6 +6287,9 @@
             <w:tcW w:w="1994" w:type="dxa"/>
           </w:tcPr>
           <w:p>
+            <w:pPr>
+              <w:bidi w:val="0"/>
+            </w:pPr>
             <w:r>
               <w:rPr>
                 <w:sz w:val="20"/>
@@ -5324,6 +6303,9 @@
             <w:tcW w:w="1994" w:type="dxa"/>
           </w:tcPr>
           <w:p>
+            <w:pPr>
+              <w:bidi w:val="0"/>
+            </w:pPr>
             <w:r>
               <w:rPr>
                 <w:sz w:val="20"/>
@@ -5337,6 +6319,9 @@
             <w:tcW w:w="1994" w:type="dxa"/>
           </w:tcPr>
           <w:p>
+            <w:pPr>
+              <w:bidi w:val="0"/>
+            </w:pPr>
             <w:r>
               <w:rPr>
                 <w:sz w:val="20"/>
@@ -5355,6 +6340,9 @@
             <w:tcW w:w="1994" w:type="dxa"/>
           </w:tcPr>
           <w:p>
+            <w:pPr>
+              <w:bidi w:val="0"/>
+            </w:pPr>
             <w:r>
               <w:rPr>
                 <w:sz w:val="20"/>
@@ -5368,6 +6356,9 @@
             <w:tcW w:w="1994" w:type="dxa"/>
           </w:tcPr>
           <w:p>
+            <w:pPr>
+              <w:bidi w:val="0"/>
+            </w:pPr>
             <w:r>
               <w:rPr>
                 <w:sz w:val="20"/>
@@ -5381,6 +6372,9 @@
             <w:tcW w:w="1994" w:type="dxa"/>
           </w:tcPr>
           <w:p>
+            <w:pPr>
+              <w:bidi w:val="0"/>
+            </w:pPr>
             <w:r>
               <w:rPr>
                 <w:sz w:val="20"/>
@@ -5394,6 +6388,9 @@
             <w:tcW w:w="1994" w:type="dxa"/>
           </w:tcPr>
           <w:p>
+            <w:pPr>
+              <w:bidi w:val="0"/>
+            </w:pPr>
             <w:r>
               <w:rPr>
                 <w:sz w:val="20"/>
@@ -5407,6 +6404,9 @@
             <w:tcW w:w="1994" w:type="dxa"/>
           </w:tcPr>
           <w:p>
+            <w:pPr>
+              <w:bidi w:val="0"/>
+            </w:pPr>
             <w:r>
               <w:rPr>
                 <w:sz w:val="20"/>
@@ -5419,6 +6419,7 @@
     </w:tbl>
     <w:p>
       <w:pPr>
+        <w:bidi w:val="0"/>
         <w:spacing w:before="40" w:after="80" w:line="240" w:lineRule="auto"/>
       </w:pPr>
       <w:r>
@@ -5430,6 +6431,9 @@
       </w:r>
     </w:p>
     <w:p>
+      <w:pPr>
+        <w:bidi w:val="0"/>
+      </w:pPr>
       <w:r>
         <w:br w:type="page"/>
       </w:r>
@@ -5444,11 +6448,13 @@
         <w:rPr>
           <w:rFonts w:ascii="Arial" w:hAnsi="Arial"/>
         </w:rPr>
+        <w:lastRenderedPageBreak/>
         <w:t>הערות לבוחן — איך להריץ את הפרויקט</w:t>
       </w:r>
     </w:p>
     <w:p>
       <w:pPr>
+        <w:bidi w:val="0"/>
         <w:spacing w:before="20" w:after="20" w:line="240" w:lineRule="auto"/>
       </w:pPr>
       <w:r>
@@ -5457,6 +6463,7 @@
     </w:p>
     <w:p>
       <w:pPr>
+        <w:bidi w:val="0"/>
         <w:spacing w:before="20" w:after="20" w:line="240" w:lineRule="auto"/>
       </w:pPr>
       <w:r>
@@ -5465,6 +6472,7 @@
     </w:p>
     <w:p>
       <w:pPr>
+        <w:bidi w:val="0"/>
         <w:spacing w:before="20" w:after="20" w:line="240" w:lineRule="auto"/>
       </w:pPr>
       <w:r>
@@ -5473,6 +6481,7 @@
     </w:p>
     <w:p>
       <w:pPr>
+        <w:bidi w:val="0"/>
         <w:spacing w:before="20" w:after="20" w:line="240" w:lineRule="auto"/>
       </w:pPr>
       <w:r>
@@ -5481,6 +6490,7 @@
     </w:p>
     <w:p>
       <w:pPr>
+        <w:bidi w:val="0"/>
         <w:spacing w:before="20" w:after="20" w:line="240" w:lineRule="auto"/>
       </w:pPr>
       <w:r>
@@ -5502,6 +6512,7 @@
     </w:p>
     <w:p>
       <w:pPr>
+        <w:bidi w:val="0"/>
         <w:spacing w:before="40" w:after="80" w:line="240" w:lineRule="auto"/>
       </w:pPr>
       <w:r>
@@ -5523,6 +6534,7 @@
     </w:p>
     <w:p>
       <w:pPr>
+        <w:bidi w:val="0"/>
         <w:spacing w:before="20" w:after="20" w:line="240" w:lineRule="auto"/>
       </w:pPr>
       <w:r>
@@ -5531,6 +6543,7 @@
     </w:p>
     <w:p>
       <w:pPr>
+        <w:bidi w:val="0"/>
         <w:spacing w:before="20" w:after="20" w:line="240" w:lineRule="auto"/>
       </w:pPr>
       <w:r>
@@ -5539,6 +6552,7 @@
     </w:p>
     <w:p>
       <w:pPr>
+        <w:bidi w:val="0"/>
         <w:spacing w:before="20" w:after="20" w:line="240" w:lineRule="auto"/>
       </w:pPr>
       <w:r>
@@ -5547,6 +6561,7 @@
     </w:p>
     <w:p>
       <w:pPr>
+        <w:bidi w:val="0"/>
         <w:spacing w:before="20" w:after="20" w:line="240" w:lineRule="auto"/>
       </w:pPr>
       <w:r>
@@ -5555,6 +6570,7 @@
     </w:p>
     <w:p>
       <w:pPr>
+        <w:bidi w:val="0"/>
         <w:spacing w:before="20" w:after="20" w:line="240" w:lineRule="auto"/>
       </w:pPr>
       <w:r>
@@ -5563,6 +6579,7 @@
     </w:p>
     <w:p>
       <w:pPr>
+        <w:bidi w:val="0"/>
         <w:spacing w:before="20" w:after="20" w:line="240" w:lineRule="auto"/>
       </w:pPr>
       <w:r>
@@ -5571,6 +6588,7 @@
     </w:p>
     <w:p>
       <w:pPr>
+        <w:bidi w:val="0"/>
         <w:spacing w:before="20" w:after="20" w:line="240" w:lineRule="auto"/>
       </w:pPr>
       <w:r>
@@ -5579,6 +6597,7 @@
     </w:p>
     <w:p>
       <w:pPr>
+        <w:bidi w:val="0"/>
         <w:spacing w:before="20" w:after="20" w:line="240" w:lineRule="auto"/>
       </w:pPr>
       <w:r>
@@ -5587,6 +6606,7 @@
     </w:p>
     <w:p>
       <w:pPr>
+        <w:bidi w:val="0"/>
         <w:spacing w:before="20" w:after="20" w:line="240" w:lineRule="auto"/>
       </w:pPr>
       <w:r>
@@ -5595,6 +6615,7 @@
     </w:p>
     <w:p>
       <w:pPr>
+        <w:bidi w:val="0"/>
         <w:spacing w:before="20" w:after="20" w:line="240" w:lineRule="auto"/>
       </w:pPr>
       <w:r>
@@ -5603,6 +6624,7 @@
     </w:p>
     <w:p>
       <w:pPr>
+        <w:bidi w:val="0"/>
         <w:spacing w:before="20" w:after="20" w:line="240" w:lineRule="auto"/>
       </w:pPr>
       <w:r>
@@ -5611,6 +6633,7 @@
     </w:p>
     <w:p>
       <w:pPr>
+        <w:bidi w:val="0"/>
         <w:spacing w:before="20" w:after="20" w:line="240" w:lineRule="auto"/>
       </w:pPr>
       <w:r>
@@ -5639,6 +6662,7 @@
           <w:right w:val="single" w:sz="18" w:space="4" w:color="F5A623"/>
         </w:pBdr>
         <w:shd w:val="clear" w:color="auto" w:fill="FFF8E1"/>
+        <w:bidi w:val="0"/>
         <w:spacing w:before="80" w:after="80" w:line="240" w:lineRule="auto"/>
         <w:ind w:left="170" w:right="170"/>
       </w:pPr>
@@ -5659,6 +6683,7 @@
           <w:right w:val="single" w:sz="18" w:space="4" w:color="F5A623"/>
         </w:pBdr>
         <w:shd w:val="clear" w:color="auto" w:fill="FFF8E1"/>
+        <w:bidi w:val="0"/>
         <w:spacing w:before="80" w:after="80" w:line="240" w:lineRule="auto"/>
         <w:ind w:left="170" w:right="170"/>
       </w:pPr>
@@ -5679,6 +6704,7 @@
           <w:right w:val="single" w:sz="18" w:space="4" w:color="F5A623"/>
         </w:pBdr>
         <w:shd w:val="clear" w:color="auto" w:fill="FFF8E1"/>
+        <w:bidi w:val="0"/>
         <w:spacing w:before="80" w:after="80" w:line="240" w:lineRule="auto"/>
         <w:ind w:left="170" w:right="170"/>
       </w:pPr>
@@ -5875,31 +6901,31 @@
       </w:rPr>
     </w:lvl>
   </w:abstractNum>
-  <w:num w:numId="1" w16cid:durableId="231551685">
+  <w:num w:numId="1" w16cid:durableId="542517301">
     <w:abstractNumId w:val="8"/>
   </w:num>
-  <w:num w:numId="2" w16cid:durableId="1233464714">
+  <w:num w:numId="2" w16cid:durableId="375282200">
     <w:abstractNumId w:val="6"/>
   </w:num>
-  <w:num w:numId="3" w16cid:durableId="1973291874">
+  <w:num w:numId="3" w16cid:durableId="1189635630">
     <w:abstractNumId w:val="5"/>
   </w:num>
-  <w:num w:numId="4" w16cid:durableId="1045253640">
+  <w:num w:numId="4" w16cid:durableId="1695766855">
     <w:abstractNumId w:val="4"/>
   </w:num>
-  <w:num w:numId="5" w16cid:durableId="995230898">
+  <w:num w:numId="5" w16cid:durableId="1068646383">
     <w:abstractNumId w:val="7"/>
   </w:num>
-  <w:num w:numId="6" w16cid:durableId="2012827846">
+  <w:num w:numId="6" w16cid:durableId="1150368772">
     <w:abstractNumId w:val="3"/>
   </w:num>
-  <w:num w:numId="7" w16cid:durableId="975182171">
+  <w:num w:numId="7" w16cid:durableId="685713702">
     <w:abstractNumId w:val="2"/>
   </w:num>
-  <w:num w:numId="8" w16cid:durableId="298927465">
+  <w:num w:numId="8" w16cid:durableId="15347387">
     <w:abstractNumId w:val="1"/>
   </w:num>
-  <w:num w:numId="9" w16cid:durableId="1822387273">
+  <w:num w:numId="9" w16cid:durableId="902910645">
     <w:abstractNumId w:val="0"/>
   </w:num>
 </w:numbering>

</xml_diff>